<commit_message>
currently finished task 4 and 5 onto 6 now
</commit_message>
<xml_diff>
--- a/VulkanLabs/VulkanLab1/Lab_Startup/Startup_Lab/Vulkan(1_3)_Lab_01/Vulkan-Lab1.docx
+++ b/VulkanLabs/VulkanLab1/Lab_Startup/Startup_Lab/Vulkan(1_3)_Lab_01/Vulkan-Lab1.docx
@@ -25,13 +25,7 @@
         <w:t xml:space="preserve"> </w:t>
       </w:r>
       <w:r>
-        <w:t>Simple Shapes and Mesh</w:t>
-      </w:r>
-      <w:r>
-        <w:t xml:space="preserve"> </w:t>
-      </w:r>
-      <w:r>
-        <w:t>Fundamentals (Vulkan 1.3)</w:t>
+        <w:t>Simple Shapes and Mesh Fundamentals (Vulkan 1.3)</w:t>
       </w:r>
       <w:r>
         <w:rPr>
@@ -112,7 +106,7 @@
           </mc:Choice>
           <mc:Fallback>
             <w:pict>
-              <v:shape w14:anchorId="0DCE94E3" id="Graphic 4" o:spid="_x0000_s1026" style="position:absolute;margin-left:43pt;margin-top:4.5pt;width:510pt;height:.75pt;z-index:-251666432;visibility:visible;mso-wrap-style:square;mso-wrap-distance-left:0;mso-wrap-distance-top:0;mso-wrap-distance-right:0;mso-wrap-distance-bottom:0;mso-position-horizontal:absolute;mso-position-horizontal-relative:page;mso-position-vertical:absolute;mso-position-vertical-relative:text;v-text-anchor:top" coordsize="6477000,9525" o:gfxdata="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" path="m6476999,9524l,9524,,,6476999,r,9524xe" fillcolor="black" stroked="f">
+              <v:shape w14:anchorId="46932A07" id="Graphic 4" o:spid="_x0000_s1026" style="position:absolute;margin-left:43pt;margin-top:4.5pt;width:510pt;height:.75pt;z-index:-251666432;visibility:visible;mso-wrap-style:square;mso-wrap-distance-left:0;mso-wrap-distance-top:0;mso-wrap-distance-right:0;mso-wrap-distance-bottom:0;mso-position-horizontal:absolute;mso-position-horizontal-relative:page;mso-position-vertical:absolute;mso-position-vertical-relative:text;v-text-anchor:top" coordsize="6477000,9525" o:gfxdata="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" path="m6476999,9524l,9524,,,6476999,r,9524xe" fillcolor="black" stroked="f">
                 <v:path arrowok="t"/>
                 <w10:wrap type="topAndBottom" anchorx="page"/>
               </v:shape>
@@ -149,28 +143,7 @@
             <w:rFonts w:ascii="Segoe UI" w:hAnsi="Segoe UI"/>
             <w:color w:val="0000ED"/>
           </w:rPr>
-          <w:t xml:space="preserve">Next: </w:t>
-        </w:r>
-        <w:r>
-          <w:rPr>
-            <w:rFonts w:ascii="Segoe UI" w:hAnsi="Segoe UI"/>
-            <w:color w:val="0000ED"/>
-          </w:rPr>
-          <w:t>Vulkan</w:t>
-        </w:r>
-        <w:r>
-          <w:rPr>
-            <w:rFonts w:ascii="Segoe UI" w:hAnsi="Segoe UI"/>
-            <w:color w:val="0000ED"/>
-          </w:rPr>
-          <w:t xml:space="preserve"> lab </w:t>
-        </w:r>
-        <w:r>
-          <w:rPr>
-            <w:rFonts w:ascii="Segoe UI" w:hAnsi="Segoe UI"/>
-            <w:color w:val="0000ED"/>
-          </w:rPr>
-          <w:t>2</w:t>
+          <w:t>Next: Vulkan lab 2</w:t>
         </w:r>
         <w:r>
           <w:rPr>
@@ -386,6 +359,9 @@
         <w:pStyle w:val="Heading2"/>
       </w:pPr>
       <w:r>
+        <w:rPr>
+          <w:noProof/>
+        </w:rPr>
         <w:drawing>
           <wp:inline distT="0" distB="0" distL="0" distR="0" wp14:anchorId="184B25D8" wp14:editId="15F78D70">
             <wp:extent cx="5105662" cy="4102311"/>
@@ -693,25 +669,26 @@
           <w:sz w:val="16"/>
           <w:lang w:val="en-GB"/>
         </w:rPr>
-        <w:t xml:space="preserve"> {{-0.5f, -0.5f, 0.5f}, {1.0f, 1.0f, 0.5f</w:t>
-      </w:r>
-      <w:proofErr w:type="gramStart"/>
-      <w:r>
+        <w:t xml:space="preserve"> {{-0.5f, -0.5f, 0.5f}, {1.0f, 1.0f, 0.5f} }, //4</w:t>
+      </w:r>
+    </w:p>
+    <w:p>
+      <w:pPr>
+        <w:pStyle w:val="BodyText"/>
+        <w:spacing w:before="10"/>
         <w:rPr>
           <w:rFonts w:ascii="Segoe UI"/>
           <w:sz w:val="16"/>
           <w:lang w:val="en-GB"/>
         </w:rPr>
-        <w:t>} }</w:t>
-      </w:r>
-      <w:proofErr w:type="gramEnd"/>
+      </w:pPr>
       <w:r>
         <w:rPr>
           <w:rFonts w:ascii="Segoe UI"/>
           <w:sz w:val="16"/>
           <w:lang w:val="en-GB"/>
         </w:rPr>
-        <w:t>, //4</w:t>
+        <w:t xml:space="preserve"> {{0.5f, -0.5f, 0.5f}, {0.0f,1.0f,0.5f}}, //5</w:t>
       </w:r>
     </w:p>
     <w:p>
@@ -730,7 +707,7 @@
           <w:sz w:val="16"/>
           <w:lang w:val="en-GB"/>
         </w:rPr>
-        <w:t xml:space="preserve"> {{0.5f, -0.5f, 0.5f}, {0.0f,1.0f,0.5f}}, //5</w:t>
+        <w:t xml:space="preserve"> {{0.5f, 0.5f, 0.5f}, {0.0f,0.0f,1.0f}}, //6</w:t>
       </w:r>
     </w:p>
     <w:p>
@@ -749,7 +726,7 @@
           <w:sz w:val="16"/>
           <w:lang w:val="en-GB"/>
         </w:rPr>
-        <w:t xml:space="preserve"> {{0.5f, 0.5f, 0.5f}, {0.0f,0.0f,1.0f}}, //6</w:t>
+        <w:t xml:space="preserve"> {{-0.5f, 0.5f, 0.5f}, {1.0f,1.0f,1.0f}}, //7</w:t>
       </w:r>
     </w:p>
     <w:p>
@@ -762,71 +739,34 @@
           <w:lang w:val="en-GB"/>
         </w:rPr>
       </w:pPr>
-      <w:r>
+    </w:p>
+    <w:p>
+      <w:pPr>
+        <w:pStyle w:val="BodyText"/>
+        <w:spacing w:before="10"/>
         <w:rPr>
           <w:rFonts w:ascii="Segoe UI"/>
           <w:sz w:val="16"/>
           <w:lang w:val="en-GB"/>
         </w:rPr>
-        <w:t xml:space="preserve"> {{-0.5f, 0.5f, 0.5f}, {1.0f,1.0f,1.0f}}, //7</w:t>
-      </w:r>
-    </w:p>
-    <w:p>
-      <w:pPr>
-        <w:pStyle w:val="BodyText"/>
-        <w:spacing w:before="10"/>
+      </w:pPr>
+      <w:proofErr w:type="spellStart"/>
+      <w:r>
         <w:rPr>
           <w:rFonts w:ascii="Segoe UI"/>
           <w:sz w:val="16"/>
           <w:lang w:val="en-GB"/>
         </w:rPr>
-      </w:pPr>
-    </w:p>
-    <w:p>
-      <w:pPr>
-        <w:pStyle w:val="BodyText"/>
-        <w:spacing w:before="10"/>
+        <w:t>const</w:t>
+      </w:r>
+      <w:proofErr w:type="spellEnd"/>
+      <w:r>
         <w:rPr>
           <w:rFonts w:ascii="Segoe UI"/>
           <w:sz w:val="16"/>
           <w:lang w:val="en-GB"/>
         </w:rPr>
-      </w:pPr>
-      <w:proofErr w:type="spellStart"/>
-      <w:r>
-        <w:rPr>
-          <w:rFonts w:ascii="Segoe UI"/>
-          <w:sz w:val="16"/>
-          <w:lang w:val="en-GB"/>
-        </w:rPr>
-        <w:t>const</w:t>
-      </w:r>
-      <w:proofErr w:type="spellEnd"/>
-      <w:r>
-        <w:rPr>
-          <w:rFonts w:ascii="Segoe UI"/>
-          <w:sz w:val="16"/>
-          <w:lang w:val="en-GB"/>
-        </w:rPr>
-        <w:t xml:space="preserve"> </w:t>
-      </w:r>
-      <w:proofErr w:type="gramStart"/>
-      <w:r>
-        <w:rPr>
-          <w:rFonts w:ascii="Segoe UI"/>
-          <w:sz w:val="16"/>
-          <w:lang w:val="en-GB"/>
-        </w:rPr>
-        <w:t>std::</w:t>
-      </w:r>
-      <w:proofErr w:type="gramEnd"/>
-      <w:r>
-        <w:rPr>
-          <w:rFonts w:ascii="Segoe UI"/>
-          <w:sz w:val="16"/>
-          <w:lang w:val="en-GB"/>
-        </w:rPr>
-        <w:t xml:space="preserve">vector&lt;uint16_t&gt; </w:t>
+        <w:t xml:space="preserve"> std::vector&lt;uint16_t&gt; </w:t>
       </w:r>
       <w:proofErr w:type="spellStart"/>
       <w:r>
@@ -952,7 +892,6 @@
         <w:t xml:space="preserve">    </w:t>
       </w:r>
       <w:proofErr w:type="spellStart"/>
-      <w:proofErr w:type="gramStart"/>
       <w:r>
         <w:rPr>
           <w:rFonts w:ascii="Segoe UI"/>
@@ -971,7 +910,6 @@
         <w:t>(</w:t>
       </w:r>
       <w:proofErr w:type="spellStart"/>
-      <w:proofErr w:type="gramEnd"/>
       <w:r>
         <w:rPr>
           <w:rFonts w:ascii="Segoe UI"/>
@@ -987,25 +925,7 @@
           <w:sz w:val="16"/>
           <w:lang w:val="en-GB"/>
         </w:rPr>
-        <w:t xml:space="preserve">, 6, 1, 1, </w:t>
-      </w:r>
-      <w:proofErr w:type="gramStart"/>
-      <w:r>
-        <w:rPr>
-          <w:rFonts w:ascii="Segoe UI"/>
-          <w:sz w:val="16"/>
-          <w:lang w:val="en-GB"/>
-        </w:rPr>
-        <w:t>1 )</w:t>
-      </w:r>
-      <w:proofErr w:type="gramEnd"/>
-      <w:r>
-        <w:rPr>
-          <w:rFonts w:ascii="Segoe UI"/>
-          <w:sz w:val="16"/>
-          <w:lang w:val="en-GB"/>
-        </w:rPr>
-        <w:t>; //should now be able to draw two triangles aka 6 vertices</w:t>
+        <w:t>, 6, 1, 1, 1 ); //should now be able to draw two triangles aka 6 vertices</w:t>
       </w:r>
     </w:p>
     <w:p>
@@ -1070,17 +990,12 @@
         <w:t xml:space="preserve">In this exercise I had to draw two individual triangles by using </w:t>
       </w:r>
       <w:proofErr w:type="spellStart"/>
-      <w:proofErr w:type="gramStart"/>
       <w:r>
         <w:t>vkCmdDraw</w:t>
       </w:r>
       <w:proofErr w:type="spellEnd"/>
       <w:r>
-        <w:t>(</w:t>
-      </w:r>
-      <w:proofErr w:type="gramEnd"/>
-      <w:r>
-        <w:t>).</w:t>
+        <w:t>().</w:t>
       </w:r>
     </w:p>
     <w:p>
@@ -1093,36 +1008,15 @@
       </w:r>
       <w:proofErr w:type="spellEnd"/>
       <w:r>
-        <w:t xml:space="preserve"> coords. It feels a bit </w:t>
-      </w:r>
-      <w:proofErr w:type="gramStart"/>
-      <w:r>
-        <w:t>similar to</w:t>
-      </w:r>
-      <w:proofErr w:type="gramEnd"/>
-      <w:r>
-        <w:t xml:space="preserve"> OpenGL the main difference is that I need to use the </w:t>
+        <w:t xml:space="preserve"> coords. It feels a bit similar to OpenGL the main difference is that I need to use the </w:t>
       </w:r>
       <w:proofErr w:type="spellStart"/>
-      <w:proofErr w:type="gramStart"/>
       <w:r>
         <w:t>vkCmdDraw</w:t>
       </w:r>
       <w:proofErr w:type="spellEnd"/>
       <w:r>
-        <w:t>(</w:t>
-      </w:r>
-      <w:proofErr w:type="gramEnd"/>
-      <w:r>
-        <w:t xml:space="preserve">) </w:t>
-      </w:r>
-      <w:proofErr w:type="gramStart"/>
-      <w:r>
-        <w:t>in order to</w:t>
-      </w:r>
-      <w:proofErr w:type="gramEnd"/>
-      <w:r>
-        <w:t xml:space="preserve"> draw 6 vertices that the triangle needs. </w:t>
+        <w:t xml:space="preserve">() in order to draw 6 vertices that the triangle needs. </w:t>
       </w:r>
     </w:p>
     <w:p>
@@ -1146,11 +1040,6 @@
       <w:r>
         <w:t>e</w:t>
       </w:r>
-    </w:p>
-    <w:p>
-      <w:pPr>
-        <w:pStyle w:val="Heading2"/>
-      </w:pPr>
     </w:p>
     <w:p>
       <w:pPr>
@@ -1162,6 +1051,9 @@
         </w:sectPr>
       </w:pPr>
       <w:r>
+        <w:rPr>
+          <w:noProof/>
+        </w:rPr>
         <w:drawing>
           <wp:inline distT="0" distB="0" distL="0" distR="0" wp14:anchorId="697391FC" wp14:editId="47E37214">
             <wp:extent cx="6567170" cy="5285105"/>
@@ -1258,23 +1150,7 @@
           <w:rFonts w:ascii="Segoe UI"/>
           <w:lang w:val="en-GB"/>
         </w:rPr>
-        <w:t xml:space="preserve"> </w:t>
-      </w:r>
-      <w:proofErr w:type="gramStart"/>
-      <w:r>
-        <w:rPr>
-          <w:rFonts w:ascii="Segoe UI"/>
-          <w:lang w:val="en-GB"/>
-        </w:rPr>
-        <w:t>std::</w:t>
-      </w:r>
-      <w:proofErr w:type="gramEnd"/>
-      <w:r>
-        <w:rPr>
-          <w:rFonts w:ascii="Segoe UI"/>
-          <w:lang w:val="en-GB"/>
-        </w:rPr>
-        <w:t xml:space="preserve">vector&lt;Vertex&gt; </w:t>
+        <w:t xml:space="preserve"> std::vector&lt;Vertex&gt; </w:t>
       </w:r>
       <w:proofErr w:type="spellStart"/>
       <w:r>
@@ -1491,23 +1367,7 @@
           <w:rFonts w:ascii="Segoe UI"/>
           <w:lang w:val="en-GB"/>
         </w:rPr>
-        <w:t xml:space="preserve">    {{-0.5f, -0.5f, 0.5f}, {1.0f, 1.0f, 0.5f</w:t>
-      </w:r>
-      <w:proofErr w:type="gramStart"/>
-      <w:r>
-        <w:rPr>
-          <w:rFonts w:ascii="Segoe UI"/>
-          <w:lang w:val="en-GB"/>
-        </w:rPr>
-        <w:t>} }</w:t>
-      </w:r>
-      <w:proofErr w:type="gramEnd"/>
-      <w:r>
-        <w:rPr>
-          <w:rFonts w:ascii="Segoe UI"/>
-          <w:lang w:val="en-GB"/>
-        </w:rPr>
-        <w:t>, //4</w:t>
+        <w:t xml:space="preserve">    {{-0.5f, -0.5f, 0.5f}, {1.0f, 1.0f, 0.5f} }, //4</w:t>
       </w:r>
     </w:p>
     <w:p>
@@ -1668,23 +1528,7 @@
           <w:rFonts w:ascii="Segoe UI"/>
           <w:lang w:val="en-GB"/>
         </w:rPr>
-        <w:t xml:space="preserve"> </w:t>
-      </w:r>
-      <w:proofErr w:type="gramStart"/>
-      <w:r>
-        <w:rPr>
-          <w:rFonts w:ascii="Segoe UI"/>
-          <w:lang w:val="en-GB"/>
-        </w:rPr>
-        <w:t>std::</w:t>
-      </w:r>
-      <w:proofErr w:type="gramEnd"/>
-      <w:r>
-        <w:rPr>
-          <w:rFonts w:ascii="Segoe UI"/>
-          <w:lang w:val="en-GB"/>
-        </w:rPr>
-        <w:t xml:space="preserve">vector&lt;uint16_t&gt; </w:t>
+        <w:t xml:space="preserve"> std::vector&lt;uint16_t&gt; </w:t>
       </w:r>
       <w:proofErr w:type="spellStart"/>
       <w:r>
@@ -1816,7 +1660,6 @@
         <w:t xml:space="preserve">    </w:t>
       </w:r>
       <w:proofErr w:type="spellStart"/>
-      <w:proofErr w:type="gramStart"/>
       <w:r>
         <w:rPr>
           <w:rFonts w:ascii="Segoe UI"/>
@@ -1833,7 +1676,6 @@
         <w:t>(</w:t>
       </w:r>
       <w:proofErr w:type="spellStart"/>
-      <w:proofErr w:type="gramEnd"/>
       <w:r>
         <w:rPr>
           <w:rFonts w:ascii="Segoe UI"/>
@@ -1866,7 +1708,6 @@
         <w:t>&lt;uint16_t&gt;(</w:t>
       </w:r>
       <w:proofErr w:type="spellStart"/>
-      <w:proofErr w:type="gramStart"/>
       <w:r>
         <w:rPr>
           <w:rFonts w:ascii="Segoe UI"/>
@@ -1875,7 +1716,6 @@
         <w:t>indices.size</w:t>
       </w:r>
       <w:proofErr w:type="spellEnd"/>
-      <w:proofErr w:type="gramEnd"/>
       <w:r>
         <w:rPr>
           <w:rFonts w:ascii="Segoe UI"/>
@@ -1937,17 +1777,14 @@
         <w:t xml:space="preserve">. It’s interesting seeing the difference between </w:t>
       </w:r>
       <w:proofErr w:type="spellStart"/>
-      <w:proofErr w:type="gramStart"/>
       <w:r>
         <w:t>vkCmdDrawIndex</w:t>
       </w:r>
       <w:proofErr w:type="spellEnd"/>
-      <w:proofErr w:type="gramEnd"/>
       <w:r>
         <w:t xml:space="preserve"> vs </w:t>
       </w:r>
       <w:proofErr w:type="spellStart"/>
-      <w:proofErr w:type="gramStart"/>
       <w:r>
         <w:t>vkCmdDraw</w:t>
       </w:r>
@@ -1955,7 +1792,6 @@
       <w:r>
         <w:t xml:space="preserve"> .</w:t>
       </w:r>
-      <w:proofErr w:type="gramEnd"/>
     </w:p>
     <w:p>
       <w:pPr>
@@ -2025,6 +1861,7 @@
       <w:r>
         <w:rPr>
           <w:rFonts w:ascii="Segoe UI"/>
+          <w:noProof/>
         </w:rPr>
         <w:drawing>
           <wp:inline distT="0" distB="0" distL="0" distR="0" wp14:anchorId="44121BE4" wp14:editId="500BACBD">
@@ -2139,23 +1976,7 @@
           <w:rFonts w:ascii="Segoe UI"/>
           <w:lang w:val="en-GB"/>
         </w:rPr>
-        <w:t xml:space="preserve"> </w:t>
-      </w:r>
-      <w:proofErr w:type="gramStart"/>
-      <w:r>
-        <w:rPr>
-          <w:rFonts w:ascii="Segoe UI"/>
-          <w:lang w:val="en-GB"/>
-        </w:rPr>
-        <w:t>std::</w:t>
-      </w:r>
-      <w:proofErr w:type="gramEnd"/>
-      <w:r>
-        <w:rPr>
-          <w:rFonts w:ascii="Segoe UI"/>
-          <w:lang w:val="en-GB"/>
-        </w:rPr>
-        <w:t xml:space="preserve">vector&lt;Vertex&gt; </w:t>
+        <w:t xml:space="preserve"> std::vector&lt;Vertex&gt; </w:t>
       </w:r>
       <w:proofErr w:type="spellStart"/>
       <w:r>
@@ -2386,23 +2207,7 @@
           <w:rFonts w:ascii="Segoe UI"/>
           <w:lang w:val="en-GB"/>
         </w:rPr>
-        <w:t xml:space="preserve">    {{-0.5f, -0.5f, 0.5f}, {1.0f, 1.0f, 0.5f</w:t>
-      </w:r>
-      <w:proofErr w:type="gramStart"/>
-      <w:r>
-        <w:rPr>
-          <w:rFonts w:ascii="Segoe UI"/>
-          <w:lang w:val="en-GB"/>
-        </w:rPr>
-        <w:t>} }</w:t>
-      </w:r>
-      <w:proofErr w:type="gramEnd"/>
-      <w:r>
-        <w:rPr>
-          <w:rFonts w:ascii="Segoe UI"/>
-          <w:lang w:val="en-GB"/>
-        </w:rPr>
-        <w:t>, //4</w:t>
+        <w:t xml:space="preserve">    {{-0.5f, -0.5f, 0.5f}, {1.0f, 1.0f, 0.5f} }, //4</w:t>
       </w:r>
     </w:p>
     <w:p>
@@ -2615,23 +2420,7 @@
           <w:rFonts w:ascii="Segoe UI"/>
           <w:lang w:val="en-GB"/>
         </w:rPr>
-        <w:t xml:space="preserve"> </w:t>
-      </w:r>
-      <w:proofErr w:type="gramStart"/>
-      <w:r>
-        <w:rPr>
-          <w:rFonts w:ascii="Segoe UI"/>
-          <w:lang w:val="en-GB"/>
-        </w:rPr>
-        <w:t>std::</w:t>
-      </w:r>
-      <w:proofErr w:type="gramEnd"/>
-      <w:r>
-        <w:rPr>
-          <w:rFonts w:ascii="Segoe UI"/>
-          <w:lang w:val="en-GB"/>
-        </w:rPr>
-        <w:t xml:space="preserve">vector&lt;uint16_t&gt; </w:t>
+        <w:t xml:space="preserve"> std::vector&lt;uint16_t&gt; </w:t>
       </w:r>
       <w:proofErr w:type="spellStart"/>
       <w:r>
@@ -2848,21 +2637,7 @@
         <w:rPr>
           <w:rFonts w:ascii="Segoe UI"/>
         </w:rPr>
-        <w:t xml:space="preserve">Enabling to draw </w:t>
-      </w:r>
-      <w:proofErr w:type="gramStart"/>
-      <w:r>
-        <w:rPr>
-          <w:rFonts w:ascii="Segoe UI"/>
-        </w:rPr>
-        <w:t>cube</w:t>
-      </w:r>
-      <w:proofErr w:type="gramEnd"/>
-      <w:r>
-        <w:rPr>
-          <w:rFonts w:ascii="Segoe UI"/>
-        </w:rPr>
-        <w:t xml:space="preserve"> </w:t>
+        <w:t xml:space="preserve">Enabling to draw cube </w:t>
       </w:r>
     </w:p>
     <w:p>
@@ -2883,7 +2658,6 @@
         <w:t xml:space="preserve">    </w:t>
       </w:r>
       <w:proofErr w:type="spellStart"/>
-      <w:proofErr w:type="gramStart"/>
       <w:r>
         <w:rPr>
           <w:rFonts w:ascii="Segoe UI"/>
@@ -2900,7 +2674,6 @@
         <w:t>(</w:t>
       </w:r>
       <w:proofErr w:type="spellStart"/>
-      <w:proofErr w:type="gramEnd"/>
       <w:r>
         <w:rPr>
           <w:rFonts w:ascii="Segoe UI"/>
@@ -2933,7 +2706,6 @@
         <w:t>&lt;uint32_t&gt;(</w:t>
       </w:r>
       <w:proofErr w:type="spellStart"/>
-      <w:proofErr w:type="gramStart"/>
       <w:r>
         <w:rPr>
           <w:rFonts w:ascii="Segoe UI"/>
@@ -2942,7 +2714,6 @@
         <w:t>indices.size</w:t>
       </w:r>
       <w:proofErr w:type="spellEnd"/>
-      <w:proofErr w:type="gramEnd"/>
       <w:r>
         <w:rPr>
           <w:rFonts w:ascii="Segoe UI"/>
@@ -3010,14 +2781,12 @@
         </w:rPr>
         <w:t xml:space="preserve">Overall, it was quite </w:t>
       </w:r>
-      <w:proofErr w:type="gramStart"/>
-      <w:r>
-        <w:rPr>
-          <w:rFonts w:ascii="Segoe UI"/>
-        </w:rPr>
-        <w:t>an interesting</w:t>
-      </w:r>
-      <w:proofErr w:type="gramEnd"/>
+      <w:r>
+        <w:rPr>
+          <w:rFonts w:ascii="Segoe UI"/>
+        </w:rPr>
+        <w:t>interesting</w:t>
+      </w:r>
       <w:r>
         <w:rPr>
           <w:rFonts w:ascii="Segoe UI"/>
@@ -3031,6 +2800,542 @@
       </w:pPr>
       <w:r>
         <w:t>Exercise 4: Wireframe Rendering</w:t>
+      </w:r>
+    </w:p>
+    <w:p>
+      <w:pPr>
+        <w:pStyle w:val="Heading2"/>
+      </w:pPr>
+      <w:r>
+        <w:t>Output</w:t>
+      </w:r>
+    </w:p>
+    <w:p>
+      <w:r>
+        <w:lastRenderedPageBreak/>
+        <w:drawing>
+          <wp:inline distT="0" distB="0" distL="0" distR="0" wp14:anchorId="592056C0" wp14:editId="59021425">
+            <wp:extent cx="6567170" cy="5285105"/>
+            <wp:effectExtent l="0" t="0" r="5080" b="0"/>
+            <wp:docPr id="936154634" name="Picture 1"/>
+            <wp:cNvGraphicFramePr>
+              <a:graphicFrameLocks xmlns:a="http://schemas.openxmlformats.org/drawingml/2006/main" noChangeAspect="1"/>
+            </wp:cNvGraphicFramePr>
+            <a:graphic xmlns:a="http://schemas.openxmlformats.org/drawingml/2006/main">
+              <a:graphicData uri="http://schemas.openxmlformats.org/drawingml/2006/picture">
+                <pic:pic xmlns:pic="http://schemas.openxmlformats.org/drawingml/2006/picture">
+                  <pic:nvPicPr>
+                    <pic:cNvPr id="936154634" name=""/>
+                    <pic:cNvPicPr/>
+                  </pic:nvPicPr>
+                  <pic:blipFill>
+                    <a:blip r:embed="rId13"/>
+                    <a:stretch>
+                      <a:fillRect/>
+                    </a:stretch>
+                  </pic:blipFill>
+                  <pic:spPr>
+                    <a:xfrm>
+                      <a:off x="0" y="0"/>
+                      <a:ext cx="6567170" cy="5285105"/>
+                    </a:xfrm>
+                    <a:prstGeom prst="rect">
+                      <a:avLst/>
+                    </a:prstGeom>
+                  </pic:spPr>
+                </pic:pic>
+              </a:graphicData>
+            </a:graphic>
+          </wp:inline>
+        </w:drawing>
+      </w:r>
+    </w:p>
+    <w:p>
+      <w:pPr>
+        <w:pStyle w:val="Heading2"/>
+      </w:pPr>
+      <w:r>
+        <w:t>Code</w:t>
+      </w:r>
+    </w:p>
+    <w:p>
+      <w:pPr>
+        <w:rPr>
+          <w:lang w:val="en-GB"/>
+        </w:rPr>
+      </w:pPr>
+      <w:proofErr w:type="spellStart"/>
+      <w:r>
+        <w:rPr>
+          <w:lang w:val="en-GB"/>
+        </w:rPr>
+        <w:t>rasterizer.polygonMode</w:t>
+      </w:r>
+      <w:proofErr w:type="spellEnd"/>
+      <w:r>
+        <w:rPr>
+          <w:lang w:val="en-GB"/>
+        </w:rPr>
+        <w:t xml:space="preserve"> = VK_POLYGON_MODE_LINE;</w:t>
+      </w:r>
+    </w:p>
+    <w:p/>
+    <w:p>
+      <w:pPr>
+        <w:pStyle w:val="Heading2"/>
+      </w:pPr>
+      <w:r>
+        <w:t>Reflection</w:t>
+      </w:r>
+    </w:p>
+    <w:p>
+      <w:pPr>
+        <w:rPr>
+          <w:rFonts w:ascii="Segoe UI" w:eastAsia="Segoe UI" w:hAnsi="Segoe UI" w:cs="Segoe UI"/>
+          <w:b/>
+          <w:bCs/>
+          <w:sz w:val="21"/>
+          <w:szCs w:val="21"/>
+          <w:lang w:val="en-GB"/>
+        </w:rPr>
+      </w:pPr>
+      <w:r>
+        <w:t xml:space="preserve">In this task I had to change </w:t>
+      </w:r>
+      <w:r>
+        <w:rPr>
+          <w:rFonts w:ascii="Segoe UI" w:eastAsia="Segoe UI" w:hAnsi="Segoe UI" w:cs="Segoe UI"/>
+          <w:b/>
+          <w:bCs/>
+          <w:sz w:val="21"/>
+          <w:szCs w:val="21"/>
+          <w:lang w:val="en-GB"/>
+        </w:rPr>
+        <w:t>VK</w:t>
+      </w:r>
+      <w:r>
+        <w:rPr>
+          <w:rFonts w:ascii="Segoe UI" w:eastAsia="Segoe UI" w:hAnsi="Segoe UI" w:cs="Segoe UI"/>
+          <w:b/>
+          <w:bCs/>
+          <w:sz w:val="21"/>
+          <w:szCs w:val="21"/>
+          <w:lang w:val="en-GB"/>
+        </w:rPr>
+        <w:t>_POLYGON_MODE_</w:t>
+      </w:r>
+      <w:r>
+        <w:rPr>
+          <w:rFonts w:ascii="Segoe UI" w:eastAsia="Segoe UI" w:hAnsi="Segoe UI" w:cs="Segoe UI"/>
+          <w:b/>
+          <w:bCs/>
+          <w:sz w:val="21"/>
+          <w:szCs w:val="21"/>
+          <w:lang w:val="en-GB"/>
+        </w:rPr>
+        <w:t>FILL</w:t>
+      </w:r>
+      <w:r>
+        <w:rPr>
+          <w:rFonts w:ascii="Segoe UI" w:eastAsia="Segoe UI" w:hAnsi="Segoe UI" w:cs="Segoe UI"/>
+          <w:b/>
+          <w:bCs/>
+          <w:sz w:val="21"/>
+          <w:szCs w:val="21"/>
+          <w:lang w:val="en-GB"/>
+        </w:rPr>
+        <w:t xml:space="preserve"> </w:t>
+      </w:r>
+      <w:r>
+        <w:rPr>
+          <w:rFonts w:ascii="Segoe UI" w:eastAsia="Segoe UI" w:hAnsi="Segoe UI" w:cs="Segoe UI"/>
+          <w:sz w:val="21"/>
+          <w:szCs w:val="21"/>
+          <w:lang w:val="en-GB"/>
+        </w:rPr>
+        <w:t>to</w:t>
+      </w:r>
+      <w:r>
+        <w:rPr>
+          <w:rFonts w:ascii="Segoe UI" w:eastAsia="Segoe UI" w:hAnsi="Segoe UI" w:cs="Segoe UI"/>
+          <w:b/>
+          <w:bCs/>
+          <w:sz w:val="21"/>
+          <w:szCs w:val="21"/>
+          <w:lang w:val="en-GB"/>
+        </w:rPr>
+        <w:t xml:space="preserve"> </w:t>
+      </w:r>
+      <w:r>
+        <w:rPr>
+          <w:rFonts w:ascii="Segoe UI" w:eastAsia="Segoe UI" w:hAnsi="Segoe UI" w:cs="Segoe UI"/>
+          <w:b/>
+          <w:bCs/>
+          <w:sz w:val="21"/>
+          <w:szCs w:val="21"/>
+          <w:lang w:val="en-GB"/>
+        </w:rPr>
+        <w:t>VK_POLYGON_MODE_</w:t>
+      </w:r>
+      <w:r>
+        <w:rPr>
+          <w:rFonts w:ascii="Segoe UI" w:eastAsia="Segoe UI" w:hAnsi="Segoe UI" w:cs="Segoe UI"/>
+          <w:b/>
+          <w:bCs/>
+          <w:sz w:val="21"/>
+          <w:szCs w:val="21"/>
+          <w:lang w:val="en-GB"/>
+        </w:rPr>
+        <w:t>LINE.</w:t>
+      </w:r>
+    </w:p>
+    <w:p>
+      <w:pPr>
+        <w:rPr>
+          <w:rFonts w:ascii="Segoe UI" w:eastAsia="Segoe UI" w:hAnsi="Segoe UI" w:cs="Segoe UI"/>
+          <w:sz w:val="21"/>
+          <w:szCs w:val="21"/>
+        </w:rPr>
+      </w:pPr>
+      <w:r>
+        <w:rPr>
+          <w:rFonts w:ascii="Segoe UI" w:eastAsia="Segoe UI" w:hAnsi="Segoe UI" w:cs="Segoe UI"/>
+          <w:sz w:val="21"/>
+          <w:szCs w:val="21"/>
+          <w:lang w:val="en-GB"/>
+        </w:rPr>
+        <w:t>This results in the cube being rendered in wireframe</w:t>
+      </w:r>
+      <w:r>
+        <w:rPr>
+          <w:rFonts w:ascii="Segoe UI" w:eastAsia="Segoe UI" w:hAnsi="Segoe UI" w:cs="Segoe UI"/>
+          <w:sz w:val="21"/>
+          <w:szCs w:val="21"/>
+          <w:lang w:val="en-GB"/>
+        </w:rPr>
+        <w:t xml:space="preserve"> (</w:t>
+      </w:r>
+      <w:r>
+        <w:rPr>
+          <w:rFonts w:ascii="Segoe UI" w:eastAsia="Segoe UI" w:hAnsi="Segoe UI" w:cs="Segoe UI"/>
+          <w:sz w:val="21"/>
+          <w:szCs w:val="21"/>
+          <w:lang w:val="en-GB"/>
+        </w:rPr>
+        <w:t>vertices</w:t>
+      </w:r>
+      <w:r>
+        <w:rPr>
+          <w:rFonts w:ascii="Segoe UI" w:eastAsia="Segoe UI" w:hAnsi="Segoe UI" w:cs="Segoe UI"/>
+          <w:sz w:val="21"/>
+          <w:szCs w:val="21"/>
+          <w:lang w:val="en-GB"/>
+        </w:rPr>
+        <w:t xml:space="preserve"> and lines)</w:t>
+      </w:r>
+      <w:r>
+        <w:rPr>
+          <w:rFonts w:ascii="Segoe UI" w:eastAsia="Segoe UI" w:hAnsi="Segoe UI" w:cs="Segoe UI"/>
+          <w:sz w:val="21"/>
+          <w:szCs w:val="21"/>
+          <w:lang w:val="en-GB"/>
+        </w:rPr>
+        <w:t xml:space="preserve"> instead of </w:t>
+      </w:r>
+      <w:r>
+        <w:rPr>
+          <w:rFonts w:ascii="Segoe UI" w:eastAsia="Segoe UI" w:hAnsi="Segoe UI" w:cs="Segoe UI"/>
+          <w:sz w:val="21"/>
+          <w:szCs w:val="21"/>
+          <w:lang w:val="en-GB"/>
+        </w:rPr>
+        <w:t xml:space="preserve">solid colours (faces, </w:t>
+      </w:r>
+      <w:r>
+        <w:rPr>
+          <w:rFonts w:ascii="Segoe UI" w:eastAsia="Segoe UI" w:hAnsi="Segoe UI" w:cs="Segoe UI"/>
+          <w:sz w:val="21"/>
+          <w:szCs w:val="21"/>
+          <w:lang w:val="en-GB"/>
+        </w:rPr>
+        <w:t>vertices</w:t>
+      </w:r>
+      <w:r>
+        <w:rPr>
+          <w:rFonts w:ascii="Segoe UI" w:eastAsia="Segoe UI" w:hAnsi="Segoe UI" w:cs="Segoe UI"/>
+          <w:sz w:val="21"/>
+          <w:szCs w:val="21"/>
+          <w:lang w:val="en-GB"/>
+        </w:rPr>
+        <w:t xml:space="preserve"> and lines)</w:t>
+      </w:r>
+      <w:r>
+        <w:rPr>
+          <w:rFonts w:ascii="Segoe UI" w:eastAsia="Segoe UI" w:hAnsi="Segoe UI" w:cs="Segoe UI"/>
+          <w:sz w:val="21"/>
+          <w:szCs w:val="21"/>
+          <w:lang w:val="en-GB"/>
+        </w:rPr>
+        <w:t xml:space="preserve">. It is quite similar to how it works in OpenGL as well with this </w:t>
+      </w:r>
+      <w:r>
+        <w:rPr>
+          <w:rFonts w:ascii="Segoe UI" w:eastAsia="Segoe UI" w:hAnsi="Segoe UI" w:cs="Segoe UI"/>
+          <w:sz w:val="21"/>
+          <w:szCs w:val="21"/>
+          <w:lang w:val="en-GB"/>
+        </w:rPr>
+        <w:t xml:space="preserve">line </w:t>
+      </w:r>
+      <w:r>
+        <w:rPr>
+          <w:rFonts w:ascii="Segoe UI" w:eastAsia="Segoe UI" w:hAnsi="Segoe UI" w:cs="Segoe UI"/>
+          <w:sz w:val="21"/>
+          <w:szCs w:val="21"/>
+        </w:rPr>
+        <w:t xml:space="preserve">GL_FRONT_AND_BACK, GL_LINE </w:t>
+      </w:r>
+      <w:r>
+        <w:rPr>
+          <w:rFonts w:ascii="Segoe UI" w:eastAsia="Segoe UI" w:hAnsi="Segoe UI" w:cs="Segoe UI"/>
+          <w:sz w:val="21"/>
+          <w:szCs w:val="21"/>
+        </w:rPr>
+        <w:t xml:space="preserve">to render wireframe and </w:t>
+      </w:r>
+      <w:r>
+        <w:rPr>
+          <w:rFonts w:ascii="Segoe UI" w:eastAsia="Segoe UI" w:hAnsi="Segoe UI" w:cs="Segoe UI"/>
+          <w:sz w:val="21"/>
+          <w:szCs w:val="21"/>
+        </w:rPr>
+        <w:t>GL_FRONT_AND_BACK, GL_</w:t>
+      </w:r>
+      <w:r>
+        <w:rPr>
+          <w:rFonts w:ascii="Segoe UI" w:eastAsia="Segoe UI" w:hAnsi="Segoe UI" w:cs="Segoe UI"/>
+          <w:sz w:val="21"/>
+          <w:szCs w:val="21"/>
+        </w:rPr>
+        <w:t xml:space="preserve">FILL to render solid </w:t>
+      </w:r>
+      <w:r>
+        <w:rPr>
+          <w:rFonts w:ascii="Segoe UI" w:eastAsia="Segoe UI" w:hAnsi="Segoe UI" w:cs="Segoe UI"/>
+          <w:sz w:val="21"/>
+          <w:szCs w:val="21"/>
+        </w:rPr>
+        <w:t xml:space="preserve">shapes, meaning that there are some similarities between OpenGL and Vulkan at least in how to render a wireframe object. </w:t>
+      </w:r>
+    </w:p>
+    <w:p>
+      <w:pPr>
+        <w:rPr>
+          <w:rFonts w:ascii="Segoe UI" w:eastAsia="Segoe UI" w:hAnsi="Segoe UI" w:cs="Segoe UI"/>
+          <w:sz w:val="21"/>
+          <w:szCs w:val="21"/>
+        </w:rPr>
+      </w:pPr>
+    </w:p>
+    <w:p>
+      <w:pPr>
+        <w:rPr>
+          <w:rFonts w:ascii="Segoe UI" w:eastAsia="Segoe UI" w:hAnsi="Segoe UI" w:cs="Segoe UI"/>
+          <w:sz w:val="21"/>
+          <w:szCs w:val="21"/>
+          <w:lang w:val="en-GB"/>
+        </w:rPr>
+      </w:pPr>
+      <w:r>
+        <w:rPr>
+          <w:rFonts w:ascii="Segoe UI" w:eastAsia="Segoe UI" w:hAnsi="Segoe UI" w:cs="Segoe UI"/>
+          <w:sz w:val="21"/>
+          <w:szCs w:val="21"/>
+        </w:rPr>
+        <w:t xml:space="preserve">However, there are some differences in that </w:t>
+      </w:r>
+      <w:r>
+        <w:rPr>
+          <w:rFonts w:ascii="Segoe UI" w:eastAsia="Segoe UI" w:hAnsi="Segoe UI" w:cs="Segoe UI"/>
+          <w:sz w:val="21"/>
+          <w:szCs w:val="21"/>
+        </w:rPr>
+        <w:t xml:space="preserve">Vulkan </w:t>
+      </w:r>
+      <w:r>
+        <w:rPr>
+          <w:rFonts w:ascii="Segoe UI" w:eastAsia="Segoe UI" w:hAnsi="Segoe UI" w:cs="Segoe UI"/>
+          <w:sz w:val="21"/>
+          <w:szCs w:val="21"/>
+        </w:rPr>
+        <w:t xml:space="preserve">also renders the triangles that </w:t>
+      </w:r>
+      <w:r>
+        <w:rPr>
+          <w:rFonts w:ascii="Segoe UI" w:eastAsia="Segoe UI" w:hAnsi="Segoe UI" w:cs="Segoe UI"/>
+          <w:sz w:val="21"/>
+          <w:szCs w:val="21"/>
+        </w:rPr>
+        <w:t>make</w:t>
+      </w:r>
+      <w:r>
+        <w:rPr>
+          <w:rFonts w:ascii="Segoe UI" w:eastAsia="Segoe UI" w:hAnsi="Segoe UI" w:cs="Segoe UI"/>
+          <w:sz w:val="21"/>
+          <w:szCs w:val="21"/>
+        </w:rPr>
+        <w:t xml:space="preserve"> up the cube instead of just the lines of the cube</w:t>
+      </w:r>
+      <w:r>
+        <w:rPr>
+          <w:rFonts w:ascii="Segoe UI" w:eastAsia="Segoe UI" w:hAnsi="Segoe UI" w:cs="Segoe UI"/>
+          <w:sz w:val="21"/>
+          <w:szCs w:val="21"/>
+        </w:rPr>
+        <w:t xml:space="preserve"> like in OpenGL.</w:t>
+      </w:r>
+    </w:p>
+    <w:p>
+      <w:pPr>
+        <w:pStyle w:val="Heading2"/>
+      </w:pPr>
+    </w:p>
+    <w:p>
+      <w:pPr>
+        <w:pStyle w:val="Heading1"/>
+      </w:pPr>
+      <w:r>
+        <w:t>Exercise 5: Render the cube vertices as points</w:t>
+      </w:r>
+    </w:p>
+    <w:p>
+      <w:pPr>
+        <w:pStyle w:val="Heading2"/>
+      </w:pPr>
+      <w:r>
+        <w:t>Output</w:t>
+      </w:r>
+    </w:p>
+    <w:p>
+      <w:r>
+        <w:rPr>
+          <w:noProof/>
+        </w:rPr>
+        <w:lastRenderedPageBreak/>
+        <w:drawing>
+          <wp:inline distT="0" distB="0" distL="0" distR="0" wp14:anchorId="2AC46E05" wp14:editId="3C5448D8">
+            <wp:extent cx="6565900" cy="5283200"/>
+            <wp:effectExtent l="0" t="0" r="6350" b="0"/>
+            <wp:docPr id="97543579" name="Picture 5"/>
+            <wp:cNvGraphicFramePr>
+              <a:graphicFrameLocks xmlns:a="http://schemas.openxmlformats.org/drawingml/2006/main" noChangeAspect="1"/>
+            </wp:cNvGraphicFramePr>
+            <a:graphic xmlns:a="http://schemas.openxmlformats.org/drawingml/2006/main">
+              <a:graphicData uri="http://schemas.openxmlformats.org/drawingml/2006/picture">
+                <pic:pic xmlns:pic="http://schemas.openxmlformats.org/drawingml/2006/picture">
+                  <pic:nvPicPr>
+                    <pic:cNvPr id="0" name="Picture 2"/>
+                    <pic:cNvPicPr>
+                      <a:picLocks noChangeAspect="1" noChangeArrowheads="1"/>
+                    </pic:cNvPicPr>
+                  </pic:nvPicPr>
+                  <pic:blipFill>
+                    <a:blip r:embed="rId14">
+                      <a:extLst>
+                        <a:ext uri="{28A0092B-C50C-407E-A947-70E740481C1C}">
+                          <a14:useLocalDpi xmlns:a14="http://schemas.microsoft.com/office/drawing/2010/main" val="0"/>
+                        </a:ext>
+                      </a:extLst>
+                    </a:blip>
+                    <a:srcRect/>
+                    <a:stretch>
+                      <a:fillRect/>
+                    </a:stretch>
+                  </pic:blipFill>
+                  <pic:spPr bwMode="auto">
+                    <a:xfrm>
+                      <a:off x="0" y="0"/>
+                      <a:ext cx="6565900" cy="5283200"/>
+                    </a:xfrm>
+                    <a:prstGeom prst="rect">
+                      <a:avLst/>
+                    </a:prstGeom>
+                    <a:noFill/>
+                    <a:ln>
+                      <a:noFill/>
+                    </a:ln>
+                  </pic:spPr>
+                </pic:pic>
+              </a:graphicData>
+            </a:graphic>
+          </wp:inline>
+        </w:drawing>
+      </w:r>
+    </w:p>
+    <w:p>
+      <w:pPr>
+        <w:pStyle w:val="Heading2"/>
+      </w:pPr>
+      <w:r>
+        <w:t>Code</w:t>
+      </w:r>
+    </w:p>
+    <w:p/>
+    <w:p>
+      <w:pPr>
+        <w:rPr>
+          <w:lang w:val="en-GB"/>
+        </w:rPr>
+      </w:pPr>
+      <w:proofErr w:type="spellStart"/>
+      <w:r>
+        <w:rPr>
+          <w:lang w:val="en-GB"/>
+        </w:rPr>
+        <w:t>inputAssembly.topology</w:t>
+      </w:r>
+      <w:proofErr w:type="spellEnd"/>
+      <w:r>
+        <w:rPr>
+          <w:lang w:val="en-GB"/>
+        </w:rPr>
+        <w:t xml:space="preserve"> = VK_PRIMITIVE_TOPOLOGY_POINT_LIST; // render tris = triangle list, render points = point list</w:t>
+      </w:r>
+    </w:p>
+    <w:p>
+      <w:r>
+        <w:t xml:space="preserve">    </w:t>
+      </w:r>
+    </w:p>
+    <w:p>
+      <w:proofErr w:type="spellStart"/>
+      <w:r>
+        <w:t>vkCmdDraw</w:t>
+      </w:r>
+      <w:proofErr w:type="spellEnd"/>
+      <w:r>
+        <w:t>(</w:t>
+      </w:r>
+      <w:proofErr w:type="spellStart"/>
+      <w:r>
+        <w:t>commandBuffer</w:t>
+      </w:r>
+      <w:proofErr w:type="spellEnd"/>
+      <w:r>
+        <w:t xml:space="preserve">, 8, 1, 0, 0 ); //should now be able to draw two triangles aka 6 vertices,  to render cube draw 8 </w:t>
+      </w:r>
+      <w:proofErr w:type="spellStart"/>
+      <w:r>
+        <w:t>verticies</w:t>
+      </w:r>
+      <w:proofErr w:type="spellEnd"/>
+    </w:p>
+    <w:p>
+      <w:pPr>
+        <w:pStyle w:val="Heading2"/>
+      </w:pPr>
+      <w:r>
+        <w:t>Reflection</w:t>
       </w:r>
     </w:p>
     <w:p>
@@ -3056,7 +3361,107 @@
         <w:rPr>
           <w:rFonts w:ascii="Segoe UI"/>
         </w:rPr>
+        <w:t xml:space="preserve">In this task </w:t>
+      </w:r>
+      <w:r>
+        <w:rPr>
+          <w:rFonts w:ascii="Segoe UI"/>
+        </w:rPr>
+        <w:t xml:space="preserve">I have learned how to change the topology from </w:t>
+      </w:r>
+      <w:r>
+        <w:rPr>
+          <w:lang w:val="en-GB"/>
+        </w:rPr>
+        <w:t>VK_PRIMITIVE_TOPOLOGY_</w:t>
+      </w:r>
+      <w:r>
+        <w:rPr>
+          <w:lang w:val="en-GB"/>
+        </w:rPr>
+        <w:t>TRIANGLE</w:t>
+      </w:r>
+      <w:r>
+        <w:rPr>
+          <w:lang w:val="en-GB"/>
+        </w:rPr>
+        <w:t>_LIST</w:t>
+      </w:r>
+      <w:r>
+        <w:rPr>
+          <w:lang w:val="en-GB"/>
+        </w:rPr>
+        <w:t xml:space="preserve"> to </w:t>
+      </w:r>
+      <w:r>
+        <w:rPr>
+          <w:lang w:val="en-GB"/>
+        </w:rPr>
+        <w:t>VK_PRIMITIVE_TOPOLOGY_POINT_LIST</w:t>
+      </w:r>
+      <w:r>
+        <w:rPr>
+          <w:lang w:val="en-GB"/>
+        </w:rPr>
+        <w:t xml:space="preserve"> and by changing the draw method to be </w:t>
+      </w:r>
+      <w:proofErr w:type="spellStart"/>
+      <w:r>
+        <w:t>vkCmdDraw</w:t>
+      </w:r>
+      <w:proofErr w:type="spellEnd"/>
+      <w:r>
+        <w:t>(</w:t>
+      </w:r>
+      <w:proofErr w:type="spellStart"/>
+      <w:r>
+        <w:t>commandBuffer</w:t>
+      </w:r>
+      <w:proofErr w:type="spellEnd"/>
+      <w:r>
+        <w:t>, 8, 1, 0, 0</w:t>
+      </w:r>
+      <w:r>
+        <w:t xml:space="preserve">) it enables to draw each separate point of the cube instead of the entire object </w:t>
+      </w:r>
+      <w:r>
+        <w:t xml:space="preserve">like before. </w:t>
+      </w:r>
+      <w:r>
+        <w:t xml:space="preserve">I don’t believe this could be done in OpenGL but I need to check again. </w:t>
+      </w:r>
+    </w:p>
+    <w:p>
+      <w:pPr>
+        <w:pStyle w:val="Heading1"/>
+      </w:pPr>
+      <w:r>
+        <w:t>Exercise 6: Render the cube edges as lines</w:t>
+      </w:r>
+    </w:p>
+    <w:p>
+      <w:pPr>
+        <w:pStyle w:val="Heading2"/>
+      </w:pPr>
+      <w:r>
         <w:t>Output</w:t>
+      </w:r>
+    </w:p>
+    <w:p/>
+    <w:p>
+      <w:pPr>
+        <w:pStyle w:val="Heading2"/>
+      </w:pPr>
+      <w:r>
+        <w:t>Code</w:t>
+      </w:r>
+    </w:p>
+    <w:p>
+      <w:pPr>
+        <w:pStyle w:val="Heading2"/>
+      </w:pPr>
+      <w:r>
+        <w:t>Reflection</w:t>
       </w:r>
     </w:p>
     <w:p>
@@ -3071,6 +3476,40 @@
     </w:p>
     <w:p>
       <w:pPr>
+        <w:pStyle w:val="Heading1"/>
+      </w:pPr>
+      <w:r>
+        <w:lastRenderedPageBreak/>
+        <w:t>Exercise 7: Triangle strips</w:t>
+      </w:r>
+    </w:p>
+    <w:p>
+      <w:pPr>
+        <w:pStyle w:val="Heading2"/>
+      </w:pPr>
+      <w:r>
+        <w:t>Output</w:t>
+      </w:r>
+    </w:p>
+    <w:p/>
+    <w:p>
+      <w:pPr>
+        <w:pStyle w:val="Heading2"/>
+      </w:pPr>
+      <w:r>
+        <w:t>Code</w:t>
+      </w:r>
+    </w:p>
+    <w:p>
+      <w:pPr>
+        <w:pStyle w:val="Heading2"/>
+      </w:pPr>
+      <w:r>
+        <w:t>Reflection</w:t>
+      </w:r>
+    </w:p>
+    <w:p>
+      <w:pPr>
         <w:pStyle w:val="BodyText"/>
         <w:spacing w:before="1" w:line="283" w:lineRule="auto"/>
         <w:ind w:left="9" w:right="247"/>
@@ -3078,11 +3517,38 @@
           <w:rFonts w:ascii="Segoe UI"/>
         </w:rPr>
       </w:pPr>
-      <w:r>
-        <w:rPr>
-          <w:rFonts w:ascii="Segoe UI"/>
-        </w:rPr>
+    </w:p>
+    <w:p>
+      <w:pPr>
+        <w:pStyle w:val="Heading1"/>
+      </w:pPr>
+      <w:r>
+        <w:t>Exercise 8: Drawing multiple cubes using instanced drawing</w:t>
+      </w:r>
+    </w:p>
+    <w:p>
+      <w:pPr>
+        <w:pStyle w:val="Heading2"/>
+      </w:pPr>
+      <w:r>
+        <w:t>Output</w:t>
+      </w:r>
+    </w:p>
+    <w:p/>
+    <w:p>
+      <w:pPr>
+        <w:pStyle w:val="Heading2"/>
+      </w:pPr>
+      <w:r>
         <w:t>Code</w:t>
+      </w:r>
+    </w:p>
+    <w:p>
+      <w:pPr>
+        <w:pStyle w:val="Heading2"/>
+      </w:pPr>
+      <w:r>
+        <w:t>Reflection</w:t>
       </w:r>
     </w:p>
     <w:p>
@@ -3094,420 +3560,37 @@
           <w:rFonts w:ascii="Segoe UI"/>
         </w:rPr>
       </w:pPr>
-      <w:r>
-        <w:rPr>
-          <w:rFonts w:ascii="Segoe UI"/>
-        </w:rPr>
-        <w:t>Reflection</w:t>
-      </w:r>
-    </w:p>
-    <w:p>
-      <w:pPr>
-        <w:pStyle w:val="BodyText"/>
-        <w:spacing w:before="1" w:line="283" w:lineRule="auto"/>
-        <w:ind w:left="9" w:right="247"/>
-        <w:rPr>
-          <w:rFonts w:ascii="Segoe UI"/>
-        </w:rPr>
-      </w:pPr>
-      <w:r>
-        <w:rPr>
-          <w:rFonts w:ascii="Segoe UI"/>
-        </w:rPr>
-        <w:t>Exercise 5: Render the cube vertices as points</w:t>
-      </w:r>
-    </w:p>
-    <w:p>
-      <w:pPr>
-        <w:pStyle w:val="BodyText"/>
-        <w:spacing w:before="1" w:line="283" w:lineRule="auto"/>
-        <w:ind w:left="9" w:right="247"/>
-        <w:rPr>
-          <w:rFonts w:ascii="Segoe UI"/>
-        </w:rPr>
-      </w:pPr>
-      <w:r>
-        <w:rPr>
-          <w:rFonts w:ascii="Segoe UI"/>
-        </w:rPr>
+    </w:p>
+    <w:p>
+      <w:pPr>
+        <w:pStyle w:val="Heading1"/>
+      </w:pPr>
+      <w:r>
+        <w:t>Exercise 9: Drawing two cubes using push constants</w:t>
+      </w:r>
+    </w:p>
+    <w:p>
+      <w:pPr>
+        <w:pStyle w:val="Heading2"/>
+      </w:pPr>
+      <w:r>
         <w:t>Output</w:t>
       </w:r>
     </w:p>
-    <w:p>
-      <w:pPr>
-        <w:pStyle w:val="BodyText"/>
-        <w:spacing w:before="1" w:line="283" w:lineRule="auto"/>
-        <w:ind w:left="9" w:right="247"/>
-        <w:rPr>
-          <w:rFonts w:ascii="Segoe UI"/>
-        </w:rPr>
-      </w:pPr>
-    </w:p>
-    <w:p>
-      <w:pPr>
-        <w:pStyle w:val="BodyText"/>
-        <w:spacing w:before="1" w:line="283" w:lineRule="auto"/>
-        <w:ind w:left="9" w:right="247"/>
-        <w:rPr>
-          <w:rFonts w:ascii="Segoe UI"/>
-        </w:rPr>
-      </w:pPr>
-      <w:r>
-        <w:rPr>
-          <w:rFonts w:ascii="Segoe UI"/>
-        </w:rPr>
+    <w:p/>
+    <w:p>
+      <w:pPr>
+        <w:pStyle w:val="Heading2"/>
+      </w:pPr>
+      <w:r>
         <w:t>Code</w:t>
       </w:r>
     </w:p>
     <w:p>
       <w:pPr>
-        <w:pStyle w:val="BodyText"/>
-        <w:spacing w:before="1" w:line="283" w:lineRule="auto"/>
-        <w:ind w:left="9" w:right="247"/>
-        <w:rPr>
-          <w:rFonts w:ascii="Segoe UI"/>
-        </w:rPr>
-      </w:pPr>
-      <w:r>
-        <w:rPr>
-          <w:rFonts w:ascii="Segoe UI"/>
-        </w:rPr>
-        <w:t>Reflection</w:t>
-      </w:r>
-    </w:p>
-    <w:p>
-      <w:pPr>
-        <w:pStyle w:val="BodyText"/>
-        <w:spacing w:before="1" w:line="283" w:lineRule="auto"/>
-        <w:ind w:left="9" w:right="247"/>
-        <w:rPr>
-          <w:rFonts w:ascii="Segoe UI"/>
-        </w:rPr>
-      </w:pPr>
-    </w:p>
-    <w:p>
-      <w:pPr>
-        <w:pStyle w:val="BodyText"/>
-        <w:spacing w:before="1" w:line="283" w:lineRule="auto"/>
-        <w:ind w:left="9" w:right="247"/>
-        <w:rPr>
-          <w:rFonts w:ascii="Segoe UI"/>
-        </w:rPr>
-      </w:pPr>
-      <w:r>
-        <w:rPr>
-          <w:rFonts w:ascii="Segoe UI"/>
-        </w:rPr>
-        <w:t>Exercise 6: Render the cube edges as lines</w:t>
-      </w:r>
-    </w:p>
-    <w:p>
-      <w:pPr>
-        <w:pStyle w:val="BodyText"/>
-        <w:spacing w:before="1" w:line="283" w:lineRule="auto"/>
-        <w:ind w:left="9" w:right="247"/>
-        <w:rPr>
-          <w:rFonts w:ascii="Segoe UI"/>
-        </w:rPr>
-      </w:pPr>
-      <w:r>
-        <w:rPr>
-          <w:rFonts w:ascii="Segoe UI"/>
-        </w:rPr>
-        <w:t>Output</w:t>
-      </w:r>
-    </w:p>
-    <w:p>
-      <w:pPr>
-        <w:pStyle w:val="BodyText"/>
-        <w:spacing w:before="1" w:line="283" w:lineRule="auto"/>
-        <w:ind w:left="9" w:right="247"/>
-        <w:rPr>
-          <w:rFonts w:ascii="Segoe UI"/>
-        </w:rPr>
-      </w:pPr>
-    </w:p>
-    <w:p>
-      <w:pPr>
-        <w:pStyle w:val="BodyText"/>
-        <w:spacing w:before="1" w:line="283" w:lineRule="auto"/>
-        <w:ind w:left="9" w:right="247"/>
-        <w:rPr>
-          <w:rFonts w:ascii="Segoe UI"/>
-        </w:rPr>
-      </w:pPr>
-      <w:r>
-        <w:rPr>
-          <w:rFonts w:ascii="Segoe UI"/>
-        </w:rPr>
-        <w:t>Code</w:t>
-      </w:r>
-    </w:p>
-    <w:p>
-      <w:pPr>
-        <w:pStyle w:val="BodyText"/>
-        <w:spacing w:before="1" w:line="283" w:lineRule="auto"/>
-        <w:ind w:left="9" w:right="247"/>
-        <w:rPr>
-          <w:rFonts w:ascii="Segoe UI"/>
-        </w:rPr>
-      </w:pPr>
-      <w:r>
-        <w:rPr>
-          <w:rFonts w:ascii="Segoe UI"/>
-        </w:rPr>
-        <w:t>Reflection</w:t>
-      </w:r>
-    </w:p>
-    <w:p>
-      <w:pPr>
-        <w:pStyle w:val="BodyText"/>
-        <w:spacing w:before="1" w:line="283" w:lineRule="auto"/>
-        <w:ind w:left="9" w:right="247"/>
-        <w:rPr>
-          <w:rFonts w:ascii="Segoe UI"/>
-        </w:rPr>
-      </w:pPr>
-    </w:p>
-    <w:p>
-      <w:pPr>
-        <w:pStyle w:val="BodyText"/>
-        <w:spacing w:before="1" w:line="283" w:lineRule="auto"/>
-        <w:ind w:left="9" w:right="247"/>
-        <w:rPr>
-          <w:rFonts w:ascii="Segoe UI"/>
-        </w:rPr>
-      </w:pPr>
-      <w:r>
-        <w:rPr>
-          <w:rFonts w:ascii="Segoe UI"/>
-        </w:rPr>
-        <w:t>Exercise 7: Triangle strips</w:t>
-      </w:r>
-    </w:p>
-    <w:p>
-      <w:pPr>
-        <w:pStyle w:val="BodyText"/>
-        <w:spacing w:before="1" w:line="283" w:lineRule="auto"/>
-        <w:ind w:left="9" w:right="247"/>
-        <w:rPr>
-          <w:rFonts w:ascii="Segoe UI"/>
-        </w:rPr>
-      </w:pPr>
-      <w:r>
-        <w:rPr>
-          <w:rFonts w:ascii="Segoe UI"/>
-        </w:rPr>
-        <w:t>Output</w:t>
-      </w:r>
-    </w:p>
-    <w:p>
-      <w:pPr>
-        <w:pStyle w:val="BodyText"/>
-        <w:spacing w:before="1" w:line="283" w:lineRule="auto"/>
-        <w:ind w:left="9" w:right="247"/>
-        <w:rPr>
-          <w:rFonts w:ascii="Segoe UI"/>
-        </w:rPr>
-      </w:pPr>
-    </w:p>
-    <w:p>
-      <w:pPr>
-        <w:pStyle w:val="BodyText"/>
-        <w:spacing w:before="1" w:line="283" w:lineRule="auto"/>
-        <w:ind w:left="9" w:right="247"/>
-        <w:rPr>
-          <w:rFonts w:ascii="Segoe UI"/>
-        </w:rPr>
-      </w:pPr>
-      <w:r>
-        <w:rPr>
-          <w:rFonts w:ascii="Segoe UI"/>
-        </w:rPr>
-        <w:t>Code</w:t>
-      </w:r>
-    </w:p>
-    <w:p>
-      <w:pPr>
-        <w:pStyle w:val="BodyText"/>
-        <w:spacing w:before="1" w:line="283" w:lineRule="auto"/>
-        <w:ind w:left="9" w:right="247"/>
-        <w:rPr>
-          <w:rFonts w:ascii="Segoe UI"/>
-        </w:rPr>
-      </w:pPr>
-      <w:r>
-        <w:rPr>
-          <w:rFonts w:ascii="Segoe UI"/>
-        </w:rPr>
-        <w:t>Reflection</w:t>
-      </w:r>
-    </w:p>
-    <w:p>
-      <w:pPr>
-        <w:pStyle w:val="BodyText"/>
-        <w:spacing w:before="1" w:line="283" w:lineRule="auto"/>
-        <w:ind w:left="9" w:right="247"/>
-        <w:rPr>
-          <w:rFonts w:ascii="Segoe UI"/>
-        </w:rPr>
-      </w:pPr>
-    </w:p>
-    <w:p>
-      <w:pPr>
-        <w:pStyle w:val="BodyText"/>
-        <w:spacing w:before="1" w:line="283" w:lineRule="auto"/>
-        <w:ind w:left="9" w:right="247"/>
-        <w:rPr>
-          <w:rFonts w:ascii="Segoe UI"/>
-        </w:rPr>
-      </w:pPr>
-      <w:r>
-        <w:rPr>
-          <w:rFonts w:ascii="Segoe UI"/>
-        </w:rPr>
-        <w:t>Exercise 8: Drawing multiple cubes using instanced drawing</w:t>
-      </w:r>
-    </w:p>
-    <w:p>
-      <w:pPr>
-        <w:pStyle w:val="BodyText"/>
-        <w:spacing w:before="1" w:line="283" w:lineRule="auto"/>
-        <w:ind w:left="9" w:right="247"/>
-        <w:rPr>
-          <w:rFonts w:ascii="Segoe UI"/>
-        </w:rPr>
-      </w:pPr>
-      <w:r>
-        <w:rPr>
-          <w:rFonts w:ascii="Segoe UI"/>
-        </w:rPr>
-        <w:t>Output</w:t>
-      </w:r>
-    </w:p>
-    <w:p>
-      <w:pPr>
-        <w:pStyle w:val="BodyText"/>
-        <w:spacing w:before="1" w:line="283" w:lineRule="auto"/>
-        <w:ind w:left="9" w:right="247"/>
-        <w:rPr>
-          <w:rFonts w:ascii="Segoe UI"/>
-        </w:rPr>
-      </w:pPr>
-    </w:p>
-    <w:p>
-      <w:pPr>
-        <w:pStyle w:val="BodyText"/>
-        <w:spacing w:before="1" w:line="283" w:lineRule="auto"/>
-        <w:ind w:left="9" w:right="247"/>
-        <w:rPr>
-          <w:rFonts w:ascii="Segoe UI"/>
-        </w:rPr>
-      </w:pPr>
-      <w:r>
-        <w:rPr>
-          <w:rFonts w:ascii="Segoe UI"/>
-        </w:rPr>
-        <w:t>Code</w:t>
-      </w:r>
-    </w:p>
-    <w:p>
-      <w:pPr>
-        <w:pStyle w:val="BodyText"/>
-        <w:spacing w:before="1" w:line="283" w:lineRule="auto"/>
-        <w:ind w:left="9" w:right="247"/>
-        <w:rPr>
-          <w:rFonts w:ascii="Segoe UI"/>
-        </w:rPr>
-      </w:pPr>
-      <w:r>
-        <w:rPr>
-          <w:rFonts w:ascii="Segoe UI"/>
-        </w:rPr>
-        <w:t>Reflection</w:t>
-      </w:r>
-    </w:p>
-    <w:p>
-      <w:pPr>
-        <w:pStyle w:val="BodyText"/>
-        <w:spacing w:before="1" w:line="283" w:lineRule="auto"/>
-        <w:ind w:left="9" w:right="247"/>
-        <w:rPr>
-          <w:rFonts w:ascii="Segoe UI"/>
-        </w:rPr>
-      </w:pPr>
-    </w:p>
-    <w:p>
-      <w:pPr>
-        <w:pStyle w:val="BodyText"/>
-        <w:spacing w:before="1" w:line="283" w:lineRule="auto"/>
-        <w:ind w:left="9" w:right="247"/>
-        <w:rPr>
-          <w:rFonts w:ascii="Segoe UI"/>
-        </w:rPr>
-      </w:pPr>
-      <w:r>
-        <w:rPr>
-          <w:rFonts w:ascii="Segoe UI"/>
-        </w:rPr>
-        <w:t>Exercise 9: Drawing two cubes using push constants</w:t>
-      </w:r>
-    </w:p>
-    <w:p>
-      <w:pPr>
-        <w:pStyle w:val="BodyText"/>
-        <w:spacing w:before="1" w:line="283" w:lineRule="auto"/>
-        <w:ind w:left="9" w:right="247"/>
-        <w:rPr>
-          <w:rFonts w:ascii="Segoe UI"/>
-        </w:rPr>
-      </w:pPr>
-      <w:r>
-        <w:rPr>
-          <w:rFonts w:ascii="Segoe UI"/>
-        </w:rPr>
-        <w:t>Output</w:t>
-      </w:r>
-    </w:p>
-    <w:p>
-      <w:pPr>
-        <w:pStyle w:val="BodyText"/>
-        <w:spacing w:before="1" w:line="283" w:lineRule="auto"/>
-        <w:ind w:left="9" w:right="247"/>
-        <w:rPr>
-          <w:rFonts w:ascii="Segoe UI"/>
-        </w:rPr>
-      </w:pPr>
-    </w:p>
-    <w:p>
-      <w:pPr>
-        <w:pStyle w:val="BodyText"/>
-        <w:spacing w:before="1" w:line="283" w:lineRule="auto"/>
-        <w:ind w:left="9" w:right="247"/>
-        <w:rPr>
-          <w:rFonts w:ascii="Segoe UI"/>
-        </w:rPr>
-      </w:pPr>
-      <w:r>
-        <w:rPr>
-          <w:rFonts w:ascii="Segoe UI"/>
-        </w:rPr>
-        <w:t>Code</w:t>
-      </w:r>
-    </w:p>
-    <w:p>
-      <w:pPr>
-        <w:pStyle w:val="BodyText"/>
-        <w:spacing w:before="1" w:line="283" w:lineRule="auto"/>
-        <w:ind w:left="9" w:right="247"/>
-        <w:rPr>
-          <w:rFonts w:ascii="Segoe UI"/>
-        </w:rPr>
-      </w:pPr>
-      <w:r>
-        <w:rPr>
-          <w:rFonts w:ascii="Segoe UI"/>
-        </w:rPr>
+        <w:pStyle w:val="Heading2"/>
+      </w:pPr>
+      <w:r>
         <w:t>Reflection</w:t>
       </w:r>
     </w:p>
@@ -3588,7 +3671,7 @@
           <w:sz w:val="21"/>
         </w:rPr>
       </w:pPr>
-      <w:hyperlink r:id="rId13">
+      <w:hyperlink r:id="rId15">
         <w:r>
           <w:rPr>
             <w:rFonts w:ascii="Segoe UI" w:hAnsi="Segoe UI"/>
@@ -4058,14 +4141,7 @@
                               <w:rFonts w:ascii="Arial"/>
                               <w:sz w:val="18"/>
                             </w:rPr>
-                            <w:t>Vulkan</w:t>
-                          </w:r>
-                          <w:r>
-                            <w:rPr>
-                              <w:rFonts w:ascii="Arial"/>
-                              <w:sz w:val="18"/>
-                            </w:rPr>
-                            <w:t>-</w:t>
+                            <w:t>Vulkan-</w:t>
                           </w:r>
                           <w:r>
                             <w:rPr>
@@ -4073,23 +4149,7 @@
                               <w:spacing w:val="-2"/>
                               <w:sz w:val="18"/>
                             </w:rPr>
-                            <w:t>L</w:t>
-                          </w:r>
-                          <w:r>
-                            <w:rPr>
-                              <w:rFonts w:ascii="Arial"/>
-                              <w:spacing w:val="-2"/>
-                              <w:sz w:val="18"/>
-                            </w:rPr>
-                            <w:t>ab1</w:t>
-                          </w:r>
-                          <w:r>
-                            <w:rPr>
-                              <w:rFonts w:ascii="Arial"/>
-                              <w:spacing w:val="-2"/>
-                              <w:sz w:val="18"/>
-                            </w:rPr>
-                            <w:t>.md</w:t>
+                            <w:t>Lab1.md</w:t>
                           </w:r>
                         </w:p>
                       </w:txbxContent>
@@ -4132,14 +4192,7 @@
                         <w:rFonts w:ascii="Arial"/>
                         <w:sz w:val="18"/>
                       </w:rPr>
-                      <w:t>Vulkan</w:t>
-                    </w:r>
-                    <w:r>
-                      <w:rPr>
-                        <w:rFonts w:ascii="Arial"/>
-                        <w:sz w:val="18"/>
-                      </w:rPr>
-                      <w:t>-</w:t>
+                      <w:t>Vulkan-</w:t>
                     </w:r>
                     <w:r>
                       <w:rPr>
@@ -4147,23 +4200,7 @@
                         <w:spacing w:val="-2"/>
                         <w:sz w:val="18"/>
                       </w:rPr>
-                      <w:t>L</w:t>
-                    </w:r>
-                    <w:r>
-                      <w:rPr>
-                        <w:rFonts w:ascii="Arial"/>
-                        <w:spacing w:val="-2"/>
-                        <w:sz w:val="18"/>
-                      </w:rPr>
-                      <w:t>ab1</w:t>
-                    </w:r>
-                    <w:r>
-                      <w:rPr>
-                        <w:rFonts w:ascii="Arial"/>
-                        <w:spacing w:val="-2"/>
-                        <w:sz w:val="18"/>
-                      </w:rPr>
-                      <w:t>.md</w:t>
+                      <w:t>Lab1.md</w:t>
                     </w:r>
                   </w:p>
                 </w:txbxContent>
@@ -5408,6 +5445,32 @@
       <w:rFonts w:ascii="Consolas" w:eastAsia="Consolas" w:hAnsi="Consolas" w:cs="Consolas"/>
     </w:rPr>
   </w:style>
+  <w:style w:type="paragraph" w:styleId="HTMLPreformatted">
+    <w:name w:val="HTML Preformatted"/>
+    <w:basedOn w:val="Normal"/>
+    <w:link w:val="HTMLPreformattedChar"/>
+    <w:uiPriority w:val="99"/>
+    <w:semiHidden/>
+    <w:unhideWhenUsed/>
+    <w:rsid w:val="00860DAC"/>
+    <w:rPr>
+      <w:sz w:val="20"/>
+      <w:szCs w:val="20"/>
+    </w:rPr>
+  </w:style>
+  <w:style w:type="character" w:customStyle="1" w:styleId="HTMLPreformattedChar">
+    <w:name w:val="HTML Preformatted Char"/>
+    <w:basedOn w:val="DefaultParagraphFont"/>
+    <w:link w:val="HTMLPreformatted"/>
+    <w:uiPriority w:val="99"/>
+    <w:semiHidden/>
+    <w:rsid w:val="00860DAC"/>
+    <w:rPr>
+      <w:rFonts w:ascii="Consolas" w:eastAsia="Consolas" w:hAnsi="Consolas" w:cs="Consolas"/>
+      <w:sz w:val="20"/>
+      <w:szCs w:val="20"/>
+    </w:rPr>
+  </w:style>
 </w:styles>
 </file>
 
@@ -5692,4 +5755,10 @@
   <a:objectDefaults/>
   <a:extraClrSchemeLst/>
 </a:theme>
+</file>
+
+<file path=docMetadata/LabelInfo.xml><?xml version="1.0" encoding="utf-8"?>
+<clbl:labelList xmlns:clbl="http://schemas.microsoft.com/office/2020/mipLabelMetadata">
+  <clbl:label id="{490a8197-7b83-4f10-89b9-83189be3835e}" enabled="0" method="" siteId="{490a8197-7b83-4f10-89b9-83189be3835e}" removed="1"/>
+</clbl:labelList>
 </file>
</xml_diff>

<commit_message>
Finished task 6 onto task 7
</commit_message>
<xml_diff>
--- a/VulkanLabs/VulkanLab1/Lab_Startup/Startup_Lab/Vulkan(1_3)_Lab_01/Vulkan-Lab1.docx
+++ b/VulkanLabs/VulkanLab1/Lab_Startup/Startup_Lab/Vulkan(1_3)_Lab_01/Vulkan-Lab1.docx
@@ -106,7 +106,7 @@
           </mc:Choice>
           <mc:Fallback>
             <w:pict>
-              <v:shape w14:anchorId="46932A07" id="Graphic 4" o:spid="_x0000_s1026" style="position:absolute;margin-left:43pt;margin-top:4.5pt;width:510pt;height:.75pt;z-index:-251666432;visibility:visible;mso-wrap-style:square;mso-wrap-distance-left:0;mso-wrap-distance-top:0;mso-wrap-distance-right:0;mso-wrap-distance-bottom:0;mso-position-horizontal:absolute;mso-position-horizontal-relative:page;mso-position-vertical:absolute;mso-position-vertical-relative:text;v-text-anchor:top" coordsize="6477000,9525" o:gfxdata="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" path="m6476999,9524l,9524,,,6476999,r,9524xe" fillcolor="black" stroked="f">
+              <v:shape w14:anchorId="4EB30FC3" id="Graphic 4" o:spid="_x0000_s1026" style="position:absolute;margin-left:43pt;margin-top:4.5pt;width:510pt;height:.75pt;z-index:-251666432;visibility:visible;mso-wrap-style:square;mso-wrap-distance-left:0;mso-wrap-distance-top:0;mso-wrap-distance-right:0;mso-wrap-distance-bottom:0;mso-position-horizontal:absolute;mso-position-horizontal-relative:page;mso-position-vertical:absolute;mso-position-vertical-relative:text;v-text-anchor:top" coordsize="6477000,9525" o:gfxdata="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" path="m6476999,9524l,9524,,,6476999,r,9524xe" fillcolor="black" stroked="f">
                 <v:path arrowok="t"/>
                 <w10:wrap type="topAndBottom" anchorx="page"/>
               </v:shape>
@@ -3447,7 +3447,46 @@
         <w:t>Output</w:t>
       </w:r>
     </w:p>
-    <w:p/>
+    <w:p>
+      <w:r>
+        <w:lastRenderedPageBreak/>
+        <w:drawing>
+          <wp:inline distT="0" distB="0" distL="0" distR="0" wp14:anchorId="6A3D45FE" wp14:editId="6F27B395">
+            <wp:extent cx="6567170" cy="5285105"/>
+            <wp:effectExtent l="0" t="0" r="5080" b="0"/>
+            <wp:docPr id="51761692" name="Picture 1"/>
+            <wp:cNvGraphicFramePr>
+              <a:graphicFrameLocks xmlns:a="http://schemas.openxmlformats.org/drawingml/2006/main" noChangeAspect="1"/>
+            </wp:cNvGraphicFramePr>
+            <a:graphic xmlns:a="http://schemas.openxmlformats.org/drawingml/2006/main">
+              <a:graphicData uri="http://schemas.openxmlformats.org/drawingml/2006/picture">
+                <pic:pic xmlns:pic="http://schemas.openxmlformats.org/drawingml/2006/picture">
+                  <pic:nvPicPr>
+                    <pic:cNvPr id="51761692" name=""/>
+                    <pic:cNvPicPr/>
+                  </pic:nvPicPr>
+                  <pic:blipFill>
+                    <a:blip r:embed="rId15"/>
+                    <a:stretch>
+                      <a:fillRect/>
+                    </a:stretch>
+                  </pic:blipFill>
+                  <pic:spPr>
+                    <a:xfrm>
+                      <a:off x="0" y="0"/>
+                      <a:ext cx="6567170" cy="5285105"/>
+                    </a:xfrm>
+                    <a:prstGeom prst="rect">
+                      <a:avLst/>
+                    </a:prstGeom>
+                  </pic:spPr>
+                </pic:pic>
+              </a:graphicData>
+            </a:graphic>
+          </wp:inline>
+        </w:drawing>
+      </w:r>
+    </w:p>
     <w:p>
       <w:pPr>
         <w:pStyle w:val="Heading2"/>
@@ -3460,9 +3499,6 @@
       <w:pPr>
         <w:pStyle w:val="Heading2"/>
       </w:pPr>
-      <w:r>
-        <w:t>Reflection</w:t>
-      </w:r>
     </w:p>
     <w:p>
       <w:pPr>
@@ -3471,6 +3507,188 @@
         <w:ind w:left="9" w:right="247"/>
         <w:rPr>
           <w:rFonts w:ascii="Segoe UI"/>
+          <w:lang w:val="en-GB"/>
+        </w:rPr>
+      </w:pPr>
+      <w:proofErr w:type="spellStart"/>
+      <w:r>
+        <w:rPr>
+          <w:rFonts w:ascii="Segoe UI"/>
+          <w:lang w:val="en-GB"/>
+        </w:rPr>
+        <w:t>inputAssembly.topology</w:t>
+      </w:r>
+      <w:proofErr w:type="spellEnd"/>
+      <w:r>
+        <w:rPr>
+          <w:rFonts w:ascii="Segoe UI"/>
+          <w:lang w:val="en-GB"/>
+        </w:rPr>
+        <w:t xml:space="preserve"> = VK_PRIMITIVE_TOPOLOGY_LINE_LIST;</w:t>
+      </w:r>
+    </w:p>
+    <w:p>
+      <w:r>
+        <w:t xml:space="preserve">    </w:t>
+      </w:r>
+      <w:proofErr w:type="spellStart"/>
+      <w:r>
+        <w:t>vkCmdDrawIndexed</w:t>
+      </w:r>
+      <w:proofErr w:type="spellEnd"/>
+      <w:r>
+        <w:t>(</w:t>
+      </w:r>
+      <w:proofErr w:type="spellStart"/>
+      <w:r>
+        <w:t>commandBuffer</w:t>
+      </w:r>
+      <w:proofErr w:type="spellEnd"/>
+      <w:r>
+        <w:t xml:space="preserve">, </w:t>
+      </w:r>
+      <w:proofErr w:type="spellStart"/>
+      <w:r>
+        <w:t>static_cast</w:t>
+      </w:r>
+      <w:proofErr w:type="spellEnd"/>
+      <w:r>
+        <w:t>&lt;uint32_t&gt;(</w:t>
+      </w:r>
+      <w:proofErr w:type="spellStart"/>
+      <w:r>
+        <w:t>indices.size</w:t>
+      </w:r>
+      <w:proofErr w:type="spellEnd"/>
+      <w:r>
+        <w:t xml:space="preserve">()), 24, 1, 0, 0); </w:t>
+      </w:r>
+    </w:p>
+    <w:p>
+      <w:pPr>
+        <w:pStyle w:val="Heading2"/>
+      </w:pPr>
+      <w:r>
+        <w:t>Reflection</w:t>
+      </w:r>
+    </w:p>
+    <w:p>
+      <w:pPr>
+        <w:pStyle w:val="BodyText"/>
+        <w:spacing w:before="1" w:line="283" w:lineRule="auto"/>
+        <w:ind w:left="9" w:right="247"/>
+        <w:rPr>
+          <w:rFonts w:ascii="Segoe UI"/>
+        </w:rPr>
+      </w:pPr>
+    </w:p>
+    <w:p>
+      <w:pPr>
+        <w:pStyle w:val="BodyText"/>
+        <w:spacing w:before="1" w:line="283" w:lineRule="auto"/>
+        <w:ind w:left="9" w:right="247"/>
+        <w:rPr>
+          <w:rFonts w:ascii="Segoe UI"/>
+          <w:lang w:val="en-GB"/>
+        </w:rPr>
+      </w:pPr>
+      <w:r>
+        <w:rPr>
+          <w:rFonts w:ascii="Segoe UI"/>
+        </w:rPr>
+        <w:t xml:space="preserve">In this exercise, </w:t>
+      </w:r>
+      <w:r>
+        <w:rPr>
+          <w:rFonts w:ascii="Segoe UI"/>
+        </w:rPr>
+        <w:t xml:space="preserve">the main goal was to draw the cube edges instead of the points/triangles. </w:t>
+      </w:r>
+      <w:r>
+        <w:rPr>
+          <w:rFonts w:ascii="Segoe UI"/>
+        </w:rPr>
+        <w:t xml:space="preserve">In order to do this </w:t>
+      </w:r>
+      <w:proofErr w:type="spellStart"/>
+      <w:r>
+        <w:rPr>
+          <w:rFonts w:ascii="Segoe UI"/>
+          <w:lang w:val="en-GB"/>
+        </w:rPr>
+        <w:t>inputAssembly.topology</w:t>
+      </w:r>
+      <w:proofErr w:type="spellEnd"/>
+      <w:r>
+        <w:rPr>
+          <w:rFonts w:ascii="Segoe UI"/>
+          <w:lang w:val="en-GB"/>
+        </w:rPr>
+        <w:t xml:space="preserve"> = VK_PRIMITIVE_TOPOLOGY_LINE_LIST</w:t>
+      </w:r>
+      <w:r>
+        <w:rPr>
+          <w:rFonts w:ascii="Segoe UI"/>
+          <w:lang w:val="en-GB"/>
+        </w:rPr>
+        <w:t xml:space="preserve"> was used and by using that and </w:t>
+      </w:r>
+      <w:proofErr w:type="spellStart"/>
+      <w:r>
+        <w:t>vkCmdDrawIndexed</w:t>
+      </w:r>
+      <w:proofErr w:type="spellEnd"/>
+      <w:r>
+        <w:t>(</w:t>
+      </w:r>
+      <w:proofErr w:type="spellStart"/>
+      <w:r>
+        <w:t>commandBuffer</w:t>
+      </w:r>
+      <w:proofErr w:type="spellEnd"/>
+      <w:r>
+        <w:t xml:space="preserve">, </w:t>
+      </w:r>
+      <w:proofErr w:type="spellStart"/>
+      <w:r>
+        <w:t>static_cast</w:t>
+      </w:r>
+      <w:proofErr w:type="spellEnd"/>
+      <w:r>
+        <w:t>&lt;uint32_t&gt;(</w:t>
+      </w:r>
+      <w:proofErr w:type="spellStart"/>
+      <w:r>
+        <w:t>indices.size</w:t>
+      </w:r>
+      <w:proofErr w:type="spellEnd"/>
+      <w:r>
+        <w:t>()), 24, 1, 0, 0)</w:t>
+      </w:r>
+      <w:r>
+        <w:t xml:space="preserve"> it should render 12 individual lines </w:t>
+      </w:r>
+      <w:r>
+        <w:t xml:space="preserve">of the cube. However, some lines are missing and it’s only 9 lines in total. </w:t>
+      </w:r>
+      <w:r>
+        <w:t xml:space="preserve">This isn’t due to them being culled out since I did disable culling and I am unsure what causes this. </w:t>
+      </w:r>
+      <w:r>
+        <w:rPr>
+          <w:rFonts w:ascii="Segoe UI"/>
+          <w:lang w:val="en-GB"/>
+        </w:rPr>
+        <w:t xml:space="preserve"> </w:t>
+      </w:r>
+    </w:p>
+    <w:p>
+      <w:pPr>
+        <w:pStyle w:val="BodyText"/>
+        <w:spacing w:before="1" w:line="283" w:lineRule="auto"/>
+        <w:ind w:left="9" w:right="247"/>
+        <w:rPr>
+          <w:rFonts w:ascii="Segoe UI"/>
         </w:rPr>
       </w:pPr>
     </w:p>
@@ -3479,32 +3697,32 @@
         <w:pStyle w:val="Heading1"/>
       </w:pPr>
       <w:r>
+        <w:t>Exercise 7: Triangle strips</w:t>
+      </w:r>
+    </w:p>
+    <w:p>
+      <w:pPr>
+        <w:pStyle w:val="Heading2"/>
+      </w:pPr>
+      <w:r>
+        <w:t>Output</w:t>
+      </w:r>
+    </w:p>
+    <w:p/>
+    <w:p>
+      <w:pPr>
+        <w:pStyle w:val="Heading2"/>
+      </w:pPr>
+      <w:r>
+        <w:t>Code</w:t>
+      </w:r>
+    </w:p>
+    <w:p>
+      <w:pPr>
+        <w:pStyle w:val="Heading2"/>
+      </w:pPr>
+      <w:r>
         <w:lastRenderedPageBreak/>
-        <w:t>Exercise 7: Triangle strips</w:t>
-      </w:r>
-    </w:p>
-    <w:p>
-      <w:pPr>
-        <w:pStyle w:val="Heading2"/>
-      </w:pPr>
-      <w:r>
-        <w:t>Output</w:t>
-      </w:r>
-    </w:p>
-    <w:p/>
-    <w:p>
-      <w:pPr>
-        <w:pStyle w:val="Heading2"/>
-      </w:pPr>
-      <w:r>
-        <w:t>Code</w:t>
-      </w:r>
-    </w:p>
-    <w:p>
-      <w:pPr>
-        <w:pStyle w:val="Heading2"/>
-      </w:pPr>
-      <w:r>
         <w:t>Reflection</w:t>
       </w:r>
     </w:p>
@@ -3671,7 +3889,7 @@
           <w:sz w:val="21"/>
         </w:rPr>
       </w:pPr>
-      <w:hyperlink r:id="rId15">
+      <w:hyperlink r:id="rId16">
         <w:r>
           <w:rPr>
             <w:rFonts w:ascii="Segoe UI" w:hAnsi="Segoe UI"/>
@@ -5356,6 +5574,7 @@
   <w:style w:type="paragraph" w:styleId="BodyText">
     <w:name w:val="Body Text"/>
     <w:basedOn w:val="Normal"/>
+    <w:link w:val="BodyTextChar"/>
     <w:uiPriority w:val="1"/>
     <w:qFormat/>
     <w:pPr>
@@ -5469,6 +5688,18 @@
       <w:rFonts w:ascii="Consolas" w:eastAsia="Consolas" w:hAnsi="Consolas" w:cs="Consolas"/>
       <w:sz w:val="20"/>
       <w:szCs w:val="20"/>
+    </w:rPr>
+  </w:style>
+  <w:style w:type="character" w:customStyle="1" w:styleId="BodyTextChar">
+    <w:name w:val="Body Text Char"/>
+    <w:basedOn w:val="DefaultParagraphFont"/>
+    <w:link w:val="BodyText"/>
+    <w:uiPriority w:val="1"/>
+    <w:rsid w:val="00CF7768"/>
+    <w:rPr>
+      <w:rFonts w:ascii="Consolas" w:eastAsia="Consolas" w:hAnsi="Consolas" w:cs="Consolas"/>
+      <w:sz w:val="21"/>
+      <w:szCs w:val="21"/>
     </w:rPr>
   </w:style>
 </w:styles>

</xml_diff>

<commit_message>
Finished task 7 onto task 8
</commit_message>
<xml_diff>
--- a/VulkanLabs/VulkanLab1/Lab_Startup/Startup_Lab/Vulkan(1_3)_Lab_01/Vulkan-Lab1.docx
+++ b/VulkanLabs/VulkanLab1/Lab_Startup/Startup_Lab/Vulkan(1_3)_Lab_01/Vulkan-Lab1.docx
@@ -106,7 +106,7 @@
           </mc:Choice>
           <mc:Fallback>
             <w:pict>
-              <v:shape w14:anchorId="4EB30FC3" id="Graphic 4" o:spid="_x0000_s1026" style="position:absolute;margin-left:43pt;margin-top:4.5pt;width:510pt;height:.75pt;z-index:-251666432;visibility:visible;mso-wrap-style:square;mso-wrap-distance-left:0;mso-wrap-distance-top:0;mso-wrap-distance-right:0;mso-wrap-distance-bottom:0;mso-position-horizontal:absolute;mso-position-horizontal-relative:page;mso-position-vertical:absolute;mso-position-vertical-relative:text;v-text-anchor:top" coordsize="6477000,9525" o:gfxdata="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" path="m6476999,9524l,9524,,,6476999,r,9524xe" fillcolor="black" stroked="f">
+              <v:shape w14:anchorId="67B8373F" id="Graphic 4" o:spid="_x0000_s1026" style="position:absolute;margin-left:43pt;margin-top:4.5pt;width:510pt;height:.75pt;z-index:-251666432;visibility:visible;mso-wrap-style:square;mso-wrap-distance-left:0;mso-wrap-distance-top:0;mso-wrap-distance-right:0;mso-wrap-distance-bottom:0;mso-position-horizontal:absolute;mso-position-horizontal-relative:page;mso-position-vertical:absolute;mso-position-vertical-relative:text;v-text-anchor:top" coordsize="6477000,9525" o:gfxdata="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" path="m6476999,9524l,9524,,,6476999,r,9524xe" fillcolor="black" stroked="f">
                 <v:path arrowok="t"/>
                 <w10:wrap type="topAndBottom" anchorx="page"/>
               </v:shape>
@@ -750,41 +750,13 @@
           <w:lang w:val="en-GB"/>
         </w:rPr>
       </w:pPr>
-      <w:proofErr w:type="spellStart"/>
       <w:r>
         <w:rPr>
           <w:rFonts w:ascii="Segoe UI"/>
           <w:sz w:val="16"/>
           <w:lang w:val="en-GB"/>
         </w:rPr>
-        <w:t>const</w:t>
-      </w:r>
-      <w:proofErr w:type="spellEnd"/>
-      <w:r>
-        <w:rPr>
-          <w:rFonts w:ascii="Segoe UI"/>
-          <w:sz w:val="16"/>
-          <w:lang w:val="en-GB"/>
-        </w:rPr>
-        <w:t xml:space="preserve"> std::vector&lt;uint16_t&gt; </w:t>
-      </w:r>
-      <w:proofErr w:type="spellStart"/>
-      <w:r>
-        <w:rPr>
-          <w:rFonts w:ascii="Segoe UI"/>
-          <w:sz w:val="16"/>
-          <w:lang w:val="en-GB"/>
-        </w:rPr>
-        <w:t>Quad_indices</w:t>
-      </w:r>
-      <w:proofErr w:type="spellEnd"/>
-      <w:r>
-        <w:rPr>
-          <w:rFonts w:ascii="Segoe UI"/>
-          <w:sz w:val="16"/>
-          <w:lang w:val="en-GB"/>
-        </w:rPr>
-        <w:t xml:space="preserve"> = {</w:t>
+        <w:t>const std::vector&lt;uint16_t&gt; Quad_indices = {</w:t>
       </w:r>
     </w:p>
     <w:p>
@@ -889,43 +861,7 @@
           <w:sz w:val="16"/>
           <w:lang w:val="en-GB"/>
         </w:rPr>
-        <w:t xml:space="preserve">    </w:t>
-      </w:r>
-      <w:proofErr w:type="spellStart"/>
-      <w:r>
-        <w:rPr>
-          <w:rFonts w:ascii="Segoe UI"/>
-          <w:sz w:val="16"/>
-          <w:lang w:val="en-GB"/>
-        </w:rPr>
-        <w:t>vkCmdDraw</w:t>
-      </w:r>
-      <w:proofErr w:type="spellEnd"/>
-      <w:r>
-        <w:rPr>
-          <w:rFonts w:ascii="Segoe UI"/>
-          <w:sz w:val="16"/>
-          <w:lang w:val="en-GB"/>
-        </w:rPr>
-        <w:t>(</w:t>
-      </w:r>
-      <w:proofErr w:type="spellStart"/>
-      <w:r>
-        <w:rPr>
-          <w:rFonts w:ascii="Segoe UI"/>
-          <w:sz w:val="16"/>
-          <w:lang w:val="en-GB"/>
-        </w:rPr>
-        <w:t>commandBuffer</w:t>
-      </w:r>
-      <w:proofErr w:type="spellEnd"/>
-      <w:r>
-        <w:rPr>
-          <w:rFonts w:ascii="Segoe UI"/>
-          <w:sz w:val="16"/>
-          <w:lang w:val="en-GB"/>
-        </w:rPr>
-        <w:t>, 6, 1, 1, 1 ); //should now be able to draw two triangles aka 6 vertices</w:t>
+        <w:t xml:space="preserve">    vkCmdDraw(commandBuffer, 6, 1, 1, 1 ); //should now be able to draw two triangles aka 6 vertices</w:t>
       </w:r>
     </w:p>
     <w:p>
@@ -987,36 +923,12 @@
     </w:p>
     <w:p>
       <w:r>
-        <w:t xml:space="preserve">In this exercise I had to draw two individual triangles by using </w:t>
-      </w:r>
-      <w:proofErr w:type="spellStart"/>
-      <w:r>
-        <w:t>vkCmdDraw</w:t>
-      </w:r>
-      <w:proofErr w:type="spellEnd"/>
-      <w:r>
-        <w:t>().</w:t>
-      </w:r>
-    </w:p>
-    <w:p>
-      <w:r>
-        <w:t xml:space="preserve">The drawing of the triangles was easy enough since I just had to duplicate the first triangle and change the </w:t>
-      </w:r>
-      <w:proofErr w:type="spellStart"/>
-      <w:r>
-        <w:t>xyz</w:t>
-      </w:r>
-      <w:proofErr w:type="spellEnd"/>
-      <w:r>
-        <w:t xml:space="preserve"> coords. It feels a bit similar to OpenGL the main difference is that I need to use the </w:t>
-      </w:r>
-      <w:proofErr w:type="spellStart"/>
-      <w:r>
-        <w:t>vkCmdDraw</w:t>
-      </w:r>
-      <w:proofErr w:type="spellEnd"/>
-      <w:r>
-        <w:t xml:space="preserve">() in order to draw 6 vertices that the triangle needs. </w:t>
+        <w:t>In this exercise I had to draw two individual triangles by using vkCmdDraw().</w:t>
+      </w:r>
+    </w:p>
+    <w:p>
+      <w:r>
+        <w:t xml:space="preserve">The drawing of the triangles was easy enough since I just had to duplicate the first triangle and change the xyz coords. It feels a bit similar to OpenGL the main difference is that I need to use the vkCmdDraw() in order to draw 6 vertices that the triangle needs. </w:t>
       </w:r>
     </w:p>
     <w:p>
@@ -1136,37 +1048,12 @@
           <w:lang w:val="en-GB"/>
         </w:rPr>
       </w:pPr>
-      <w:proofErr w:type="spellStart"/>
-      <w:r>
-        <w:rPr>
-          <w:rFonts w:ascii="Segoe UI"/>
-          <w:lang w:val="en-GB"/>
-        </w:rPr>
-        <w:t>const</w:t>
-      </w:r>
-      <w:proofErr w:type="spellEnd"/>
-      <w:r>
-        <w:rPr>
-          <w:rFonts w:ascii="Segoe UI"/>
-          <w:lang w:val="en-GB"/>
-        </w:rPr>
-        <w:t xml:space="preserve"> std::vector&lt;Vertex&gt; </w:t>
-      </w:r>
-      <w:proofErr w:type="spellStart"/>
-      <w:r>
-        <w:rPr>
-          <w:rFonts w:ascii="Segoe UI"/>
-          <w:lang w:val="en-GB"/>
-        </w:rPr>
-        <w:t>Quad_vertices</w:t>
-      </w:r>
-      <w:proofErr w:type="spellEnd"/>
-      <w:r>
-        <w:rPr>
-          <w:rFonts w:ascii="Segoe UI"/>
-          <w:lang w:val="en-GB"/>
-        </w:rPr>
-        <w:t xml:space="preserve"> = {</w:t>
+      <w:r>
+        <w:rPr>
+          <w:rFonts w:ascii="Segoe UI"/>
+          <w:lang w:val="en-GB"/>
+        </w:rPr>
+        <w:t>const std::vector&lt;Vertex&gt; Quad_vertices = {</w:t>
       </w:r>
     </w:p>
     <w:p>
@@ -1514,37 +1401,12 @@
           <w:lang w:val="en-GB"/>
         </w:rPr>
       </w:pPr>
-      <w:proofErr w:type="spellStart"/>
-      <w:r>
-        <w:rPr>
-          <w:rFonts w:ascii="Segoe UI"/>
-          <w:lang w:val="en-GB"/>
-        </w:rPr>
-        <w:t>const</w:t>
-      </w:r>
-      <w:proofErr w:type="spellEnd"/>
-      <w:r>
-        <w:rPr>
-          <w:rFonts w:ascii="Segoe UI"/>
-          <w:lang w:val="en-GB"/>
-        </w:rPr>
-        <w:t xml:space="preserve"> std::vector&lt;uint16_t&gt; </w:t>
-      </w:r>
-      <w:proofErr w:type="spellStart"/>
-      <w:r>
-        <w:rPr>
-          <w:rFonts w:ascii="Segoe UI"/>
-          <w:lang w:val="en-GB"/>
-        </w:rPr>
-        <w:t>Quad_indices</w:t>
-      </w:r>
-      <w:proofErr w:type="spellEnd"/>
-      <w:r>
-        <w:rPr>
-          <w:rFonts w:ascii="Segoe UI"/>
-          <w:lang w:val="en-GB"/>
-        </w:rPr>
-        <w:t xml:space="preserve"> = {</w:t>
+      <w:r>
+        <w:rPr>
+          <w:rFonts w:ascii="Segoe UI"/>
+          <w:lang w:val="en-GB"/>
+        </w:rPr>
+        <w:t>const std::vector&lt;uint16_t&gt; Quad_indices = {</w:t>
       </w:r>
     </w:p>
     <w:p>
@@ -1657,71 +1519,7 @@
           <w:rFonts w:ascii="Segoe UI"/>
           <w:lang w:val="en-GB"/>
         </w:rPr>
-        <w:t xml:space="preserve">    </w:t>
-      </w:r>
-      <w:proofErr w:type="spellStart"/>
-      <w:r>
-        <w:rPr>
-          <w:rFonts w:ascii="Segoe UI"/>
-          <w:lang w:val="en-GB"/>
-        </w:rPr>
-        <w:t>vkCmdDrawIndexed</w:t>
-      </w:r>
-      <w:proofErr w:type="spellEnd"/>
-      <w:r>
-        <w:rPr>
-          <w:rFonts w:ascii="Segoe UI"/>
-          <w:lang w:val="en-GB"/>
-        </w:rPr>
-        <w:t>(</w:t>
-      </w:r>
-      <w:proofErr w:type="spellStart"/>
-      <w:r>
-        <w:rPr>
-          <w:rFonts w:ascii="Segoe UI"/>
-          <w:lang w:val="en-GB"/>
-        </w:rPr>
-        <w:t>commandBuffer</w:t>
-      </w:r>
-      <w:proofErr w:type="spellEnd"/>
-      <w:r>
-        <w:rPr>
-          <w:rFonts w:ascii="Segoe UI"/>
-          <w:lang w:val="en-GB"/>
-        </w:rPr>
-        <w:t xml:space="preserve">, </w:t>
-      </w:r>
-      <w:proofErr w:type="spellStart"/>
-      <w:r>
-        <w:rPr>
-          <w:rFonts w:ascii="Segoe UI"/>
-          <w:lang w:val="en-GB"/>
-        </w:rPr>
-        <w:t>static_cast</w:t>
-      </w:r>
-      <w:proofErr w:type="spellEnd"/>
-      <w:r>
-        <w:rPr>
-          <w:rFonts w:ascii="Segoe UI"/>
-          <w:lang w:val="en-GB"/>
-        </w:rPr>
-        <w:t>&lt;uint16_t&gt;(</w:t>
-      </w:r>
-      <w:proofErr w:type="spellStart"/>
-      <w:r>
-        <w:rPr>
-          <w:rFonts w:ascii="Segoe UI"/>
-          <w:lang w:val="en-GB"/>
-        </w:rPr>
-        <w:t>indices.size</w:t>
-      </w:r>
-      <w:proofErr w:type="spellEnd"/>
-      <w:r>
-        <w:rPr>
-          <w:rFonts w:ascii="Segoe UI"/>
-          <w:lang w:val="en-GB"/>
-        </w:rPr>
-        <w:t xml:space="preserve">()), 1, 0, 0, 0); </w:t>
+        <w:t xml:space="preserve">    vkCmdDrawIndexed(commandBuffer, static_cast&lt;uint16_t&gt;(indices.size()), 1, 0, 0, 0); </w:t>
       </w:r>
     </w:p>
     <w:p>
@@ -1758,39 +1556,7 @@
         <w:t xml:space="preserve">Exercise two now uses the index buffer </w:t>
       </w:r>
       <w:r>
-        <w:t xml:space="preserve">and as a result both triangles are now in the same position and use the same </w:t>
-      </w:r>
-      <w:proofErr w:type="spellStart"/>
-      <w:r>
-        <w:t>colour</w:t>
-      </w:r>
-      <w:proofErr w:type="spellEnd"/>
-      <w:r>
-        <w:t xml:space="preserve"> </w:t>
-      </w:r>
-      <w:proofErr w:type="spellStart"/>
-      <w:r>
-        <w:t>pallete</w:t>
-      </w:r>
-      <w:proofErr w:type="spellEnd"/>
-      <w:r>
-        <w:t xml:space="preserve">. It’s interesting seeing the difference between </w:t>
-      </w:r>
-      <w:proofErr w:type="spellStart"/>
-      <w:r>
-        <w:t>vkCmdDrawIndex</w:t>
-      </w:r>
-      <w:proofErr w:type="spellEnd"/>
-      <w:r>
-        <w:t xml:space="preserve"> vs </w:t>
-      </w:r>
-      <w:proofErr w:type="spellStart"/>
-      <w:r>
-        <w:t>vkCmdDraw</w:t>
-      </w:r>
-      <w:proofErr w:type="spellEnd"/>
-      <w:r>
-        <w:t xml:space="preserve"> .</w:t>
+        <w:t>and as a result both triangles are now in the same position and use the same colour pallete. It’s interesting seeing the difference between vkCmdDrawIndex vs vkCmdDraw .</w:t>
       </w:r>
     </w:p>
     <w:p>
@@ -1962,37 +1728,12 @@
           <w:lang w:val="en-GB"/>
         </w:rPr>
       </w:pPr>
-      <w:proofErr w:type="spellStart"/>
-      <w:r>
-        <w:rPr>
-          <w:rFonts w:ascii="Segoe UI"/>
-          <w:lang w:val="en-GB"/>
-        </w:rPr>
-        <w:t>const</w:t>
-      </w:r>
-      <w:proofErr w:type="spellEnd"/>
-      <w:r>
-        <w:rPr>
-          <w:rFonts w:ascii="Segoe UI"/>
-          <w:lang w:val="en-GB"/>
-        </w:rPr>
-        <w:t xml:space="preserve"> std::vector&lt;Vertex&gt; </w:t>
-      </w:r>
-      <w:proofErr w:type="spellStart"/>
-      <w:r>
-        <w:rPr>
-          <w:rFonts w:ascii="Segoe UI"/>
-          <w:lang w:val="en-GB"/>
-        </w:rPr>
-        <w:t>Quad_vertices</w:t>
-      </w:r>
-      <w:proofErr w:type="spellEnd"/>
-      <w:r>
-        <w:rPr>
-          <w:rFonts w:ascii="Segoe UI"/>
-          <w:lang w:val="en-GB"/>
-        </w:rPr>
-        <w:t xml:space="preserve"> = {</w:t>
+      <w:r>
+        <w:rPr>
+          <w:rFonts w:ascii="Segoe UI"/>
+          <w:lang w:val="en-GB"/>
+        </w:rPr>
+        <w:t>const std::vector&lt;Vertex&gt; Quad_vertices = {</w:t>
       </w:r>
     </w:p>
     <w:p>
@@ -2359,23 +2100,7 @@
           <w:rFonts w:ascii="Segoe UI"/>
           <w:lang w:val="en-GB"/>
         </w:rPr>
-        <w:t xml:space="preserve">//first and second </w:t>
-      </w:r>
-      <w:proofErr w:type="spellStart"/>
-      <w:r>
-        <w:rPr>
-          <w:rFonts w:ascii="Segoe UI"/>
-          <w:lang w:val="en-GB"/>
-        </w:rPr>
-        <w:t>trianlge</w:t>
-      </w:r>
-      <w:proofErr w:type="spellEnd"/>
-      <w:r>
-        <w:rPr>
-          <w:rFonts w:ascii="Segoe UI"/>
-          <w:lang w:val="en-GB"/>
-        </w:rPr>
-        <w:t xml:space="preserve"> for square shape</w:t>
+        <w:t>//first and second trianlge for square shape</w:t>
       </w:r>
     </w:p>
     <w:p>
@@ -2406,37 +2131,12 @@
           <w:lang w:val="en-GB"/>
         </w:rPr>
       </w:pPr>
-      <w:proofErr w:type="spellStart"/>
-      <w:r>
-        <w:rPr>
-          <w:rFonts w:ascii="Segoe UI"/>
-          <w:lang w:val="en-GB"/>
-        </w:rPr>
-        <w:t>const</w:t>
-      </w:r>
-      <w:proofErr w:type="spellEnd"/>
-      <w:r>
-        <w:rPr>
-          <w:rFonts w:ascii="Segoe UI"/>
-          <w:lang w:val="en-GB"/>
-        </w:rPr>
-        <w:t xml:space="preserve"> std::vector&lt;uint16_t&gt; </w:t>
-      </w:r>
-      <w:proofErr w:type="spellStart"/>
-      <w:r>
-        <w:rPr>
-          <w:rFonts w:ascii="Segoe UI"/>
-          <w:lang w:val="en-GB"/>
-        </w:rPr>
-        <w:t>Quad_indices</w:t>
-      </w:r>
-      <w:proofErr w:type="spellEnd"/>
-      <w:r>
-        <w:rPr>
-          <w:rFonts w:ascii="Segoe UI"/>
-          <w:lang w:val="en-GB"/>
-        </w:rPr>
-        <w:t xml:space="preserve"> = {</w:t>
+      <w:r>
+        <w:rPr>
+          <w:rFonts w:ascii="Segoe UI"/>
+          <w:lang w:val="en-GB"/>
+        </w:rPr>
+        <w:t>const std::vector&lt;uint16_t&gt; Quad_indices = {</w:t>
       </w:r>
     </w:p>
     <w:p>
@@ -2655,71 +2355,7 @@
           <w:rFonts w:ascii="Segoe UI"/>
           <w:lang w:val="en-GB"/>
         </w:rPr>
-        <w:t xml:space="preserve">    </w:t>
-      </w:r>
-      <w:proofErr w:type="spellStart"/>
-      <w:r>
-        <w:rPr>
-          <w:rFonts w:ascii="Segoe UI"/>
-          <w:lang w:val="en-GB"/>
-        </w:rPr>
-        <w:t>vkCmdDrawIndexed</w:t>
-      </w:r>
-      <w:proofErr w:type="spellEnd"/>
-      <w:r>
-        <w:rPr>
-          <w:rFonts w:ascii="Segoe UI"/>
-          <w:lang w:val="en-GB"/>
-        </w:rPr>
-        <w:t>(</w:t>
-      </w:r>
-      <w:proofErr w:type="spellStart"/>
-      <w:r>
-        <w:rPr>
-          <w:rFonts w:ascii="Segoe UI"/>
-          <w:lang w:val="en-GB"/>
-        </w:rPr>
-        <w:t>commandBuffer</w:t>
-      </w:r>
-      <w:proofErr w:type="spellEnd"/>
-      <w:r>
-        <w:rPr>
-          <w:rFonts w:ascii="Segoe UI"/>
-          <w:lang w:val="en-GB"/>
-        </w:rPr>
-        <w:t xml:space="preserve">, </w:t>
-      </w:r>
-      <w:proofErr w:type="spellStart"/>
-      <w:r>
-        <w:rPr>
-          <w:rFonts w:ascii="Segoe UI"/>
-          <w:lang w:val="en-GB"/>
-        </w:rPr>
-        <w:t>static_cast</w:t>
-      </w:r>
-      <w:proofErr w:type="spellEnd"/>
-      <w:r>
-        <w:rPr>
-          <w:rFonts w:ascii="Segoe UI"/>
-          <w:lang w:val="en-GB"/>
-        </w:rPr>
-        <w:t>&lt;uint32_t&gt;(</w:t>
-      </w:r>
-      <w:proofErr w:type="spellStart"/>
-      <w:r>
-        <w:rPr>
-          <w:rFonts w:ascii="Segoe UI"/>
-          <w:lang w:val="en-GB"/>
-        </w:rPr>
-        <w:t>indices.size</w:t>
-      </w:r>
-      <w:proofErr w:type="spellEnd"/>
-      <w:r>
-        <w:rPr>
-          <w:rFonts w:ascii="Segoe UI"/>
-          <w:lang w:val="en-GB"/>
-        </w:rPr>
-        <w:t xml:space="preserve">()), 1, 0, 0, 0); //should draw cube now </w:t>
+        <w:t xml:space="preserve">    vkCmdDrawIndexed(commandBuffer, static_cast&lt;uint32_t&gt;(indices.size()), 1, 0, 0, 0); //should draw cube now </w:t>
       </w:r>
     </w:p>
     <w:p>
@@ -2864,19 +2500,11 @@
           <w:lang w:val="en-GB"/>
         </w:rPr>
       </w:pPr>
-      <w:proofErr w:type="spellStart"/>
-      <w:r>
-        <w:rPr>
-          <w:lang w:val="en-GB"/>
-        </w:rPr>
-        <w:t>rasterizer.polygonMode</w:t>
-      </w:r>
-      <w:proofErr w:type="spellEnd"/>
-      <w:r>
-        <w:rPr>
-          <w:lang w:val="en-GB"/>
-        </w:rPr>
-        <w:t xml:space="preserve"> = VK_POLYGON_MODE_LINE;</w:t>
+      <w:r>
+        <w:rPr>
+          <w:lang w:val="en-GB"/>
+        </w:rPr>
+        <w:t>rasterizer.polygonMode = VK_POLYGON_MODE_LINE;</w:t>
       </w:r>
     </w:p>
     <w:p/>
@@ -3287,19 +2915,11 @@
           <w:lang w:val="en-GB"/>
         </w:rPr>
       </w:pPr>
-      <w:proofErr w:type="spellStart"/>
-      <w:r>
-        <w:rPr>
-          <w:lang w:val="en-GB"/>
-        </w:rPr>
-        <w:t>inputAssembly.topology</w:t>
-      </w:r>
-      <w:proofErr w:type="spellEnd"/>
-      <w:r>
-        <w:rPr>
-          <w:lang w:val="en-GB"/>
-        </w:rPr>
-        <w:t xml:space="preserve"> = VK_PRIMITIVE_TOPOLOGY_POINT_LIST; // render tris = triangle list, render points = point list</w:t>
+      <w:r>
+        <w:rPr>
+          <w:lang w:val="en-GB"/>
+        </w:rPr>
+        <w:t>inputAssembly.topology = VK_PRIMITIVE_TOPOLOGY_POINT_LIST; // render tris = triangle list, render points = point list</w:t>
       </w:r>
     </w:p>
     <w:p>
@@ -3308,27 +2928,9 @@
       </w:r>
     </w:p>
     <w:p>
-      <w:proofErr w:type="spellStart"/>
-      <w:r>
-        <w:t>vkCmdDraw</w:t>
-      </w:r>
-      <w:proofErr w:type="spellEnd"/>
-      <w:r>
-        <w:t>(</w:t>
-      </w:r>
-      <w:proofErr w:type="spellStart"/>
-      <w:r>
-        <w:t>commandBuffer</w:t>
-      </w:r>
-      <w:proofErr w:type="spellEnd"/>
-      <w:r>
-        <w:t xml:space="preserve">, 8, 1, 0, 0 ); //should now be able to draw two triangles aka 6 vertices,  to render cube draw 8 </w:t>
-      </w:r>
-      <w:proofErr w:type="spellStart"/>
-      <w:r>
-        <w:t>verticies</w:t>
-      </w:r>
-      <w:proofErr w:type="spellEnd"/>
+      <w:r>
+        <w:t>vkCmdDraw(commandBuffer, 8, 1, 0, 0 ); //should now be able to draw two triangles aka 6 vertices,  to render cube draw 8 verticies</w:t>
+      </w:r>
     </w:p>
     <w:p>
       <w:pPr>
@@ -3405,21 +3007,8 @@
         </w:rPr>
         <w:t xml:space="preserve"> and by changing the draw method to be </w:t>
       </w:r>
-      <w:proofErr w:type="spellStart"/>
-      <w:r>
-        <w:t>vkCmdDraw</w:t>
-      </w:r>
-      <w:proofErr w:type="spellEnd"/>
-      <w:r>
-        <w:t>(</w:t>
-      </w:r>
-      <w:proofErr w:type="spellStart"/>
-      <w:r>
-        <w:t>commandBuffer</w:t>
-      </w:r>
-      <w:proofErr w:type="spellEnd"/>
-      <w:r>
-        <w:t>, 8, 1, 0, 0</w:t>
+      <w:r>
+        <w:t>vkCmdDraw(commandBuffer, 8, 1, 0, 0</w:t>
       </w:r>
       <w:r>
         <w:t xml:space="preserve">) it enables to draw each separate point of the cube instead of the entire object </w:t>
@@ -3510,58 +3099,299 @@
           <w:lang w:val="en-GB"/>
         </w:rPr>
       </w:pPr>
-      <w:proofErr w:type="spellStart"/>
-      <w:r>
-        <w:rPr>
-          <w:rFonts w:ascii="Segoe UI"/>
-          <w:lang w:val="en-GB"/>
-        </w:rPr>
-        <w:t>inputAssembly.topology</w:t>
-      </w:r>
-      <w:proofErr w:type="spellEnd"/>
-      <w:r>
-        <w:rPr>
-          <w:rFonts w:ascii="Segoe UI"/>
-          <w:lang w:val="en-GB"/>
-        </w:rPr>
-        <w:t xml:space="preserve"> = VK_PRIMITIVE_TOPOLOGY_LINE_LIST;</w:t>
-      </w:r>
-    </w:p>
-    <w:p>
+      <w:r>
+        <w:rPr>
+          <w:rFonts w:ascii="Segoe UI"/>
+          <w:lang w:val="en-GB"/>
+        </w:rPr>
+        <w:t>inputAssembly.topology = VK_PRIMITIVE_TOPOLOGY_LINE_LIST;</w:t>
+      </w:r>
+    </w:p>
+    <w:p>
+      <w:r>
+        <w:t xml:space="preserve">    vkCmdDrawIndexed(commandBuffer, static_cast&lt;uint32_t&gt;(indices.size()), 24, 1, 0, 0); </w:t>
+      </w:r>
+    </w:p>
+    <w:p>
+      <w:pPr>
+        <w:pStyle w:val="Heading2"/>
+      </w:pPr>
+      <w:r>
+        <w:t>Reflection</w:t>
+      </w:r>
+    </w:p>
+    <w:p>
+      <w:pPr>
+        <w:pStyle w:val="BodyText"/>
+        <w:spacing w:before="1" w:line="283" w:lineRule="auto"/>
+        <w:ind w:left="9" w:right="247"/>
+        <w:rPr>
+          <w:rFonts w:ascii="Segoe UI"/>
+        </w:rPr>
+      </w:pPr>
+    </w:p>
+    <w:p>
+      <w:pPr>
+        <w:pStyle w:val="BodyText"/>
+        <w:spacing w:before="1" w:line="283" w:lineRule="auto"/>
+        <w:ind w:left="9" w:right="247"/>
+        <w:rPr>
+          <w:rFonts w:ascii="Segoe UI"/>
+          <w:lang w:val="en-GB"/>
+        </w:rPr>
+      </w:pPr>
+      <w:r>
+        <w:rPr>
+          <w:rFonts w:ascii="Segoe UI"/>
+        </w:rPr>
+        <w:t xml:space="preserve">In this exercise, </w:t>
+      </w:r>
+      <w:r>
+        <w:rPr>
+          <w:rFonts w:ascii="Segoe UI"/>
+        </w:rPr>
+        <w:t xml:space="preserve">the main goal was to draw the cube edges instead of the points/triangles. </w:t>
+      </w:r>
+      <w:r>
+        <w:rPr>
+          <w:rFonts w:ascii="Segoe UI"/>
+        </w:rPr>
+        <w:t xml:space="preserve">In order to do this </w:t>
+      </w:r>
+      <w:r>
+        <w:rPr>
+          <w:rFonts w:ascii="Segoe UI"/>
+          <w:lang w:val="en-GB"/>
+        </w:rPr>
+        <w:t>inputAssembly.topology = VK_PRIMITIVE_TOPOLOGY_LINE_LIST</w:t>
+      </w:r>
+      <w:r>
+        <w:rPr>
+          <w:rFonts w:ascii="Segoe UI"/>
+          <w:lang w:val="en-GB"/>
+        </w:rPr>
+        <w:t xml:space="preserve"> was used and by using that and </w:t>
+      </w:r>
+      <w:r>
+        <w:t>vkCmdDrawIndexed(commandBuffer, static_cast&lt;uint32_t&gt;(indices.size()), 24, 1, 0, 0)</w:t>
+      </w:r>
+      <w:r>
+        <w:t xml:space="preserve"> it should render 12 individual lines </w:t>
+      </w:r>
+      <w:r>
+        <w:t xml:space="preserve">of the cube. However, some lines are missing and it’s only 9 lines in total. </w:t>
+      </w:r>
+      <w:r>
+        <w:t xml:space="preserve">This isn’t due to them being culled out since I did disable culling and I am unsure what causes this. </w:t>
+      </w:r>
+      <w:r>
+        <w:rPr>
+          <w:rFonts w:ascii="Segoe UI"/>
+          <w:lang w:val="en-GB"/>
+        </w:rPr>
+        <w:t xml:space="preserve"> </w:t>
+      </w:r>
+    </w:p>
+    <w:p>
+      <w:pPr>
+        <w:pStyle w:val="BodyText"/>
+        <w:spacing w:before="1" w:line="283" w:lineRule="auto"/>
+        <w:ind w:left="9" w:right="247"/>
+        <w:rPr>
+          <w:rFonts w:ascii="Segoe UI"/>
+        </w:rPr>
+      </w:pPr>
+    </w:p>
+    <w:p>
+      <w:pPr>
+        <w:pStyle w:val="Heading1"/>
+      </w:pPr>
+      <w:r>
+        <w:t>Exercise 7: Triangle strips</w:t>
+      </w:r>
+    </w:p>
+    <w:p>
+      <w:pPr>
+        <w:pStyle w:val="Heading2"/>
+      </w:pPr>
+      <w:r>
+        <w:t>Output</w:t>
+      </w:r>
+    </w:p>
+    <w:p>
+      <w:r>
+        <w:lastRenderedPageBreak/>
+        <w:drawing>
+          <wp:inline distT="0" distB="0" distL="0" distR="0" wp14:anchorId="3203496C" wp14:editId="14CDBF5F">
+            <wp:extent cx="6567170" cy="5285105"/>
+            <wp:effectExtent l="0" t="0" r="5080" b="0"/>
+            <wp:docPr id="1014468798" name="Picture 1"/>
+            <wp:cNvGraphicFramePr>
+              <a:graphicFrameLocks xmlns:a="http://schemas.openxmlformats.org/drawingml/2006/main" noChangeAspect="1"/>
+            </wp:cNvGraphicFramePr>
+            <a:graphic xmlns:a="http://schemas.openxmlformats.org/drawingml/2006/main">
+              <a:graphicData uri="http://schemas.openxmlformats.org/drawingml/2006/picture">
+                <pic:pic xmlns:pic="http://schemas.openxmlformats.org/drawingml/2006/picture">
+                  <pic:nvPicPr>
+                    <pic:cNvPr id="1014468798" name=""/>
+                    <pic:cNvPicPr/>
+                  </pic:nvPicPr>
+                  <pic:blipFill>
+                    <a:blip r:embed="rId16"/>
+                    <a:stretch>
+                      <a:fillRect/>
+                    </a:stretch>
+                  </pic:blipFill>
+                  <pic:spPr>
+                    <a:xfrm>
+                      <a:off x="0" y="0"/>
+                      <a:ext cx="6567170" cy="5285105"/>
+                    </a:xfrm>
+                    <a:prstGeom prst="rect">
+                      <a:avLst/>
+                    </a:prstGeom>
+                  </pic:spPr>
+                </pic:pic>
+              </a:graphicData>
+            </a:graphic>
+          </wp:inline>
+        </w:drawing>
+      </w:r>
+    </w:p>
+    <w:p>
+      <w:pPr>
+        <w:pStyle w:val="Heading2"/>
+      </w:pPr>
+      <w:r>
+        <w:t>Code</w:t>
+      </w:r>
+    </w:p>
+    <w:p/>
+    <w:p>
+      <w:r>
+        <w:t xml:space="preserve">Const std::vector&lt;uint16_t&gt; Quad_indices = </w:t>
+      </w:r>
+      <w:r>
+        <w:t>{</w:t>
+      </w:r>
+    </w:p>
+    <w:p/>
+    <w:p>
+      <w:r>
+        <w:t>//drawing index triangle strips</w:t>
+      </w:r>
+    </w:p>
+    <w:p>
+      <w:r>
+        <w:t xml:space="preserve">//0xFFFF tells vulkan to stop reading this line and move to the next </w:t>
+      </w:r>
+    </w:p>
+    <w:p>
+      <w:r>
+        <w:t>//front</w:t>
+      </w:r>
+    </w:p>
+    <w:p>
+      <w:r>
+        <w:t>0, 1, 3,2, 0xFFFF,</w:t>
+      </w:r>
+    </w:p>
+    <w:p>
+      <w:r>
+        <w:t>//back</w:t>
+      </w:r>
+    </w:p>
+    <w:p>
+      <w:r>
+        <w:t>4,5, 7, 6, 0xFFFF,</w:t>
+      </w:r>
+    </w:p>
+    <w:p>
+      <w:r>
+        <w:t>//left</w:t>
+      </w:r>
+    </w:p>
+    <w:p>
+      <w:r>
+        <w:t>0, 4, 3, 7, 0xFFFF,</w:t>
+      </w:r>
+    </w:p>
+    <w:p>
+      <w:r>
+        <w:t>//right</w:t>
+      </w:r>
+    </w:p>
+    <w:p>
+      <w:r>
+        <w:t>1,5, 2, 6, 0xFFFF,</w:t>
+      </w:r>
+    </w:p>
+    <w:p>
+      <w:r>
+        <w:t>//bottom</w:t>
+      </w:r>
+    </w:p>
+    <w:p>
+      <w:r>
+        <w:t>0, 1, 4, 5, 0xFFFF,</w:t>
+      </w:r>
+    </w:p>
+    <w:p>
+      <w:r>
+        <w:t>//top</w:t>
+      </w:r>
+    </w:p>
+    <w:p>
+      <w:r>
+        <w:t>3,2,7,6</w:t>
+      </w:r>
+    </w:p>
+    <w:p>
+      <w:r>
+        <w:t>}</w:t>
+      </w:r>
+    </w:p>
+    <w:p>
+      <w:pPr>
+        <w:rPr>
+          <w:lang w:val="en-GB"/>
+        </w:rPr>
+      </w:pPr>
+      <w:r>
+        <w:rPr>
+          <w:lang w:val="en-GB"/>
+        </w:rPr>
+        <w:t>inputAssembly.topology = VK_PRIMITIVE_TOPOLOGY_TRIANGLE_STRIP; // render tris = triangle list, render points = point list, render lines = line list</w:t>
+      </w:r>
+    </w:p>
+    <w:p>
+      <w:pPr>
+        <w:rPr>
+          <w:lang w:val="en-GB"/>
+        </w:rPr>
+      </w:pPr>
+      <w:r>
+        <w:rPr>
+          <w:lang w:val="en-GB"/>
+        </w:rPr>
+        <w:t>inputAssembly.primitiveRestartEnable = VK_TRUE; //need to turn this from false to true (relates to 0xFFFF thing)</w:t>
+      </w:r>
       <w:r>
         <w:t xml:space="preserve">    </w:t>
       </w:r>
-      <w:proofErr w:type="spellStart"/>
-      <w:r>
-        <w:t>vkCmdDrawIndexed</w:t>
-      </w:r>
-      <w:proofErr w:type="spellEnd"/>
-      <w:r>
-        <w:t>(</w:t>
-      </w:r>
-      <w:proofErr w:type="spellStart"/>
-      <w:r>
-        <w:t>commandBuffer</w:t>
-      </w:r>
-      <w:proofErr w:type="spellEnd"/>
-      <w:r>
-        <w:t xml:space="preserve">, </w:t>
-      </w:r>
-      <w:proofErr w:type="spellStart"/>
-      <w:r>
-        <w:t>static_cast</w:t>
-      </w:r>
-      <w:proofErr w:type="spellEnd"/>
-      <w:r>
-        <w:t>&lt;uint32_t&gt;(</w:t>
-      </w:r>
-      <w:proofErr w:type="spellStart"/>
-      <w:r>
-        <w:t>indices.size</w:t>
-      </w:r>
-      <w:proofErr w:type="spellEnd"/>
-      <w:r>
-        <w:t xml:space="preserve">()), 24, 1, 0, 0); </w:t>
+    </w:p>
+    <w:p>
+      <w:r>
+        <w:t>rasterizer.polygonMode = VK_POLYGON_MODE_FILL; // wireframe mode = line, regular mode = fill</w:t>
+      </w:r>
+    </w:p>
+    <w:p>
+      <w:r>
+        <w:t xml:space="preserve">    vkCmdDrawIndexed(commandBuffer, static_cast&lt;uint32_t&gt;(indices.size()), 1, 0, 0, 0); //should draw cube now (uint32), 24 objects (should render 12 lines of cube, only </w:t>
+      </w:r>
+      <w:r>
+        <w:lastRenderedPageBreak/>
+        <w:t>renders 9 lines Task 6 stuff). We're back to rendering cube normally</w:t>
       </w:r>
     </w:p>
     <w:p>
@@ -3586,155 +3416,145 @@
       <w:pPr>
         <w:pStyle w:val="BodyText"/>
         <w:spacing w:before="1" w:line="283" w:lineRule="auto"/>
-        <w:ind w:left="9" w:right="247"/>
-        <w:rPr>
-          <w:rFonts w:ascii="Segoe UI"/>
-          <w:lang w:val="en-GB"/>
-        </w:rPr>
-      </w:pPr>
-      <w:r>
-        <w:rPr>
-          <w:rFonts w:ascii="Segoe UI"/>
-        </w:rPr>
-        <w:t xml:space="preserve">In this exercise, </w:t>
-      </w:r>
-      <w:r>
-        <w:rPr>
-          <w:rFonts w:ascii="Segoe UI"/>
-        </w:rPr>
-        <w:t xml:space="preserve">the main goal was to draw the cube edges instead of the points/triangles. </w:t>
-      </w:r>
-      <w:r>
-        <w:rPr>
-          <w:rFonts w:ascii="Segoe UI"/>
-        </w:rPr>
-        <w:t xml:space="preserve">In order to do this </w:t>
-      </w:r>
-      <w:proofErr w:type="spellStart"/>
-      <w:r>
-        <w:rPr>
-          <w:rFonts w:ascii="Segoe UI"/>
-          <w:lang w:val="en-GB"/>
-        </w:rPr>
-        <w:t>inputAssembly.topology</w:t>
-      </w:r>
-      <w:proofErr w:type="spellEnd"/>
-      <w:r>
-        <w:rPr>
-          <w:rFonts w:ascii="Segoe UI"/>
-          <w:lang w:val="en-GB"/>
-        </w:rPr>
-        <w:t xml:space="preserve"> = VK_PRIMITIVE_TOPOLOGY_LINE_LIST</w:t>
-      </w:r>
-      <w:r>
-        <w:rPr>
-          <w:rFonts w:ascii="Segoe UI"/>
-          <w:lang w:val="en-GB"/>
-        </w:rPr>
-        <w:t xml:space="preserve"> was used and by using that and </w:t>
-      </w:r>
-      <w:proofErr w:type="spellStart"/>
-      <w:r>
-        <w:t>vkCmdDrawIndexed</w:t>
-      </w:r>
-      <w:proofErr w:type="spellEnd"/>
-      <w:r>
-        <w:t>(</w:t>
-      </w:r>
-      <w:proofErr w:type="spellStart"/>
-      <w:r>
-        <w:t>commandBuffer</w:t>
-      </w:r>
-      <w:proofErr w:type="spellEnd"/>
-      <w:r>
-        <w:t xml:space="preserve">, </w:t>
-      </w:r>
-      <w:proofErr w:type="spellStart"/>
-      <w:r>
-        <w:t>static_cast</w:t>
-      </w:r>
-      <w:proofErr w:type="spellEnd"/>
-      <w:r>
-        <w:t>&lt;uint32_t&gt;(</w:t>
-      </w:r>
-      <w:proofErr w:type="spellStart"/>
-      <w:r>
-        <w:t>indices.size</w:t>
-      </w:r>
-      <w:proofErr w:type="spellEnd"/>
-      <w:r>
-        <w:t>()), 24, 1, 0, 0)</w:t>
-      </w:r>
-      <w:r>
-        <w:t xml:space="preserve"> it should render 12 individual lines </w:t>
-      </w:r>
-      <w:r>
-        <w:t xml:space="preserve">of the cube. However, some lines are missing and it’s only 9 lines in total. </w:t>
-      </w:r>
-      <w:r>
-        <w:t xml:space="preserve">This isn’t due to them being culled out since I did disable culling and I am unsure what causes this. </w:t>
-      </w:r>
-      <w:r>
-        <w:rPr>
-          <w:rFonts w:ascii="Segoe UI"/>
-          <w:lang w:val="en-GB"/>
-        </w:rPr>
-        <w:t xml:space="preserve"> </w:t>
-      </w:r>
-    </w:p>
-    <w:p>
-      <w:pPr>
-        <w:pStyle w:val="BodyText"/>
-        <w:spacing w:before="1" w:line="283" w:lineRule="auto"/>
-        <w:ind w:left="9" w:right="247"/>
-        <w:rPr>
-          <w:rFonts w:ascii="Segoe UI"/>
-        </w:rPr>
-      </w:pPr>
-    </w:p>
-    <w:p>
-      <w:pPr>
-        <w:pStyle w:val="Heading1"/>
-      </w:pPr>
-      <w:r>
-        <w:t>Exercise 7: Triangle strips</w:t>
-      </w:r>
-    </w:p>
-    <w:p>
-      <w:pPr>
-        <w:pStyle w:val="Heading2"/>
-      </w:pPr>
-      <w:r>
-        <w:t>Output</w:t>
-      </w:r>
-    </w:p>
-    <w:p/>
-    <w:p>
-      <w:pPr>
-        <w:pStyle w:val="Heading2"/>
-      </w:pPr>
-      <w:r>
-        <w:t>Code</w:t>
-      </w:r>
-    </w:p>
-    <w:p>
-      <w:pPr>
-        <w:pStyle w:val="Heading2"/>
-      </w:pPr>
-      <w:r>
-        <w:lastRenderedPageBreak/>
-        <w:t>Reflection</w:t>
-      </w:r>
-    </w:p>
-    <w:p>
-      <w:pPr>
-        <w:pStyle w:val="BodyText"/>
-        <w:spacing w:before="1" w:line="283" w:lineRule="auto"/>
-        <w:ind w:left="9" w:right="247"/>
-        <w:rPr>
-          <w:rFonts w:ascii="Segoe UI"/>
-        </w:rPr>
-      </w:pPr>
+        <w:ind w:left="0" w:right="247"/>
+        <w:rPr>
+          <w:lang w:val="en-GB"/>
+        </w:rPr>
+      </w:pPr>
+      <w:r>
+        <w:rPr>
+          <w:rFonts w:ascii="Segoe UI"/>
+        </w:rPr>
+        <w:t xml:space="preserve">In this task we are rendering triangle strips </w:t>
+      </w:r>
+      <w:r>
+        <w:rPr>
+          <w:rFonts w:ascii="Segoe UI"/>
+        </w:rPr>
+        <w:t xml:space="preserve">instead of the old method of drawing </w:t>
+      </w:r>
+      <w:r>
+        <w:rPr>
+          <w:rFonts w:ascii="Segoe UI"/>
+        </w:rPr>
+        <w:t xml:space="preserve">triangle lines </w:t>
+      </w:r>
+      <w:r>
+        <w:rPr>
+          <w:rFonts w:ascii="Segoe UI"/>
+        </w:rPr>
+        <w:t xml:space="preserve">to make up a cube. </w:t>
+      </w:r>
+      <w:r>
+        <w:rPr>
+          <w:rFonts w:ascii="Segoe UI"/>
+        </w:rPr>
+        <w:t>For</w:t>
+      </w:r>
+      <w:r>
+        <w:rPr>
+          <w:rFonts w:ascii="Segoe UI"/>
+        </w:rPr>
+        <w:t xml:space="preserve"> this to happen, we add 0xFFFF which makes </w:t>
+      </w:r>
+      <w:r>
+        <w:rPr>
+          <w:rFonts w:ascii="Segoe UI"/>
+        </w:rPr>
+        <w:t>Vulkan</w:t>
+      </w:r>
+      <w:r>
+        <w:rPr>
+          <w:rFonts w:ascii="Segoe UI"/>
+        </w:rPr>
+        <w:t xml:space="preserve"> stop reading that index line and then move to the next one</w:t>
+      </w:r>
+      <w:r>
+        <w:rPr>
+          <w:rFonts w:ascii="Segoe UI"/>
+        </w:rPr>
+        <w:t xml:space="preserve"> and by using </w:t>
+      </w:r>
+      <w:r>
+        <w:rPr>
+          <w:lang w:val="en-GB"/>
+        </w:rPr>
+        <w:t>VK_PRIMITIVE_TOPOLOGY_TRIANGLE_STRIP</w:t>
+      </w:r>
+      <w:r>
+        <w:rPr>
+          <w:lang w:val="en-GB"/>
+        </w:rPr>
+        <w:t xml:space="preserve"> and enabling primitive restart</w:t>
+      </w:r>
+      <w:r>
+        <w:rPr>
+          <w:lang w:val="en-GB"/>
+        </w:rPr>
+        <w:t>. The reason why we want to use triangle strips instead of lines is that strips is less memory inte</w:t>
+      </w:r>
+      <w:r>
+        <w:rPr>
+          <w:lang w:val="en-GB"/>
+        </w:rPr>
+        <w:t xml:space="preserve">nsive and it works through defining the first three </w:t>
+      </w:r>
+      <w:r>
+        <w:rPr>
+          <w:lang w:val="en-GB"/>
+        </w:rPr>
+        <w:t>vertices</w:t>
+      </w:r>
+      <w:r>
+        <w:rPr>
+          <w:lang w:val="en-GB"/>
+        </w:rPr>
+        <w:t xml:space="preserve"> of a triangle with each new vertex </w:t>
+      </w:r>
+      <w:r>
+        <w:rPr>
+          <w:lang w:val="en-GB"/>
+        </w:rPr>
+        <w:t>combing with two of the older vertices.</w:t>
+      </w:r>
+    </w:p>
+    <w:p>
+      <w:pPr>
+        <w:pStyle w:val="BodyText"/>
+        <w:spacing w:before="1" w:line="283" w:lineRule="auto"/>
+        <w:ind w:left="0" w:right="247"/>
+        <w:rPr>
+          <w:lang w:val="en-GB"/>
+        </w:rPr>
+      </w:pPr>
+      <w:r>
+        <w:rPr>
+          <w:lang w:val="en-GB"/>
+        </w:rPr>
+        <w:t xml:space="preserve">This is unlike line </w:t>
+      </w:r>
+      <w:r>
+        <w:rPr>
+          <w:lang w:val="en-GB"/>
+        </w:rPr>
+        <w:t>topology where it treats each verticies as a connected line.</w:t>
+      </w:r>
+    </w:p>
+    <w:p>
+      <w:pPr>
+        <w:pStyle w:val="BodyText"/>
+        <w:spacing w:before="1" w:line="283" w:lineRule="auto"/>
+        <w:ind w:left="0" w:right="247"/>
+        <w:rPr>
+          <w:rFonts w:ascii="Segoe UI"/>
+        </w:rPr>
+      </w:pPr>
+      <w:r>
+        <w:rPr>
+          <w:lang w:val="en-GB"/>
+        </w:rPr>
+        <w:t>Overall performance doesn’t seem to be quite different between the two it might be due to how GPU works like optimizations?</w:t>
+      </w:r>
     </w:p>
     <w:p>
       <w:pPr>
@@ -3889,7 +3709,7 @@
           <w:sz w:val="21"/>
         </w:rPr>
       </w:pPr>
-      <w:hyperlink r:id="rId16">
+      <w:hyperlink r:id="rId17">
         <w:r>
           <w:rPr>
             <w:rFonts w:ascii="Segoe UI" w:hAnsi="Segoe UI"/>

</xml_diff>

<commit_message>
finished task 8 need to finish task 9
</commit_message>
<xml_diff>
--- a/VulkanLabs/VulkanLab1/Lab_Startup/Startup_Lab/Vulkan(1_3)_Lab_01/Vulkan-Lab1.docx
+++ b/VulkanLabs/VulkanLab1/Lab_Startup/Startup_Lab/Vulkan(1_3)_Lab_01/Vulkan-Lab1.docx
@@ -106,7 +106,7 @@
           </mc:Choice>
           <mc:Fallback>
             <w:pict>
-              <v:shape w14:anchorId="67B8373F" id="Graphic 4" o:spid="_x0000_s1026" style="position:absolute;margin-left:43pt;margin-top:4.5pt;width:510pt;height:.75pt;z-index:-251666432;visibility:visible;mso-wrap-style:square;mso-wrap-distance-left:0;mso-wrap-distance-top:0;mso-wrap-distance-right:0;mso-wrap-distance-bottom:0;mso-position-horizontal:absolute;mso-position-horizontal-relative:page;mso-position-vertical:absolute;mso-position-vertical-relative:text;v-text-anchor:top" coordsize="6477000,9525" o:gfxdata="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" path="m6476999,9524l,9524,,,6476999,r,9524xe" fillcolor="black" stroked="f">
+              <v:shape w14:anchorId="5B75DD86" id="Graphic 4" o:spid="_x0000_s1026" style="position:absolute;margin-left:43pt;margin-top:4.5pt;width:510pt;height:.75pt;z-index:-251666432;visibility:visible;mso-wrap-style:square;mso-wrap-distance-left:0;mso-wrap-distance-top:0;mso-wrap-distance-right:0;mso-wrap-distance-bottom:0;mso-position-horizontal:absolute;mso-position-horizontal-relative:page;mso-position-vertical:absolute;mso-position-vertical-relative:text;v-text-anchor:top" coordsize="6477000,9525" o:gfxdata="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" path="m6476999,9524l,9524,,,6476999,r,9524xe" fillcolor="black" stroked="f">
                 <v:path arrowok="t"/>
                 <w10:wrap type="topAndBottom" anchorx="page"/>
               </v:shape>
@@ -3572,20 +3572,181 @@
         <w:t>Output</w:t>
       </w:r>
     </w:p>
+    <w:p>
+      <w:r>
+        <w:t>5 cubes rendered in one scene</w:t>
+      </w:r>
+    </w:p>
+    <w:p>
+      <w:pPr>
+        <w:pStyle w:val="Heading2"/>
+      </w:pPr>
+    </w:p>
+    <w:p>
+      <w:r>
+        <w:drawing>
+          <wp:inline distT="0" distB="0" distL="0" distR="0" wp14:anchorId="3F4936C4" wp14:editId="34652B46">
+            <wp:extent cx="6567170" cy="3570605"/>
+            <wp:effectExtent l="0" t="0" r="5080" b="0"/>
+            <wp:docPr id="344478239" name="Picture 1"/>
+            <wp:cNvGraphicFramePr>
+              <a:graphicFrameLocks xmlns:a="http://schemas.openxmlformats.org/drawingml/2006/main" noChangeAspect="1"/>
+            </wp:cNvGraphicFramePr>
+            <a:graphic xmlns:a="http://schemas.openxmlformats.org/drawingml/2006/main">
+              <a:graphicData uri="http://schemas.openxmlformats.org/drawingml/2006/picture">
+                <pic:pic xmlns:pic="http://schemas.openxmlformats.org/drawingml/2006/picture">
+                  <pic:nvPicPr>
+                    <pic:cNvPr id="344478239" name=""/>
+                    <pic:cNvPicPr/>
+                  </pic:nvPicPr>
+                  <pic:blipFill>
+                    <a:blip r:embed="rId17"/>
+                    <a:stretch>
+                      <a:fillRect/>
+                    </a:stretch>
+                  </pic:blipFill>
+                  <pic:spPr>
+                    <a:xfrm>
+                      <a:off x="0" y="0"/>
+                      <a:ext cx="6567170" cy="3570605"/>
+                    </a:xfrm>
+                    <a:prstGeom prst="rect">
+                      <a:avLst/>
+                    </a:prstGeom>
+                  </pic:spPr>
+                </pic:pic>
+              </a:graphicData>
+            </a:graphic>
+          </wp:inline>
+        </w:drawing>
+      </w:r>
+    </w:p>
+    <w:p>
+      <w:pPr>
+        <w:pStyle w:val="Heading2"/>
+      </w:pPr>
+      <w:r>
+        <w:t>Code</w:t>
+      </w:r>
+    </w:p>
     <w:p/>
     <w:p>
       <w:pPr>
+        <w:rPr>
+          <w:lang w:val="en-GB"/>
+        </w:rPr>
+      </w:pPr>
+      <w:r>
+        <w:rPr>
+          <w:lang w:val="en-GB"/>
+        </w:rPr>
+        <w:t xml:space="preserve"> vkCmdDrawIndexed(commandBuffer, static_cast&lt;uint32_t&gt;(indices.size()), 5, 0, 0, 0); </w:t>
+      </w:r>
+      <w:r>
+        <w:rPr>
+          <w:lang w:val="en-GB"/>
+        </w:rPr>
+        <w:t>//renders 5 cubes</w:t>
+      </w:r>
+    </w:p>
+    <w:p/>
+    <w:p>
+      <w:r>
+        <w:t>Shader.vert</w:t>
+      </w:r>
+    </w:p>
+    <w:p>
+      <w:r>
+        <w:t>#version 450</w:t>
+      </w:r>
+    </w:p>
+    <w:p/>
+    <w:p>
+      <w:r>
+        <w:t>layout(binding = 0) uniform UniformBufferObject {</w:t>
+      </w:r>
+    </w:p>
+    <w:p>
+      <w:r>
+        <w:t xml:space="preserve">    mat4 model;</w:t>
+      </w:r>
+    </w:p>
+    <w:p>
+      <w:r>
+        <w:t xml:space="preserve">    mat4 view;</w:t>
+      </w:r>
+    </w:p>
+    <w:p>
+      <w:r>
+        <w:t xml:space="preserve">    mat4 proj;</w:t>
+      </w:r>
+    </w:p>
+    <w:p>
+      <w:r>
+        <w:t>} ubo;</w:t>
+      </w:r>
+    </w:p>
+    <w:p/>
+    <w:p>
+      <w:r>
+        <w:t>layout(location = 0) in vec3 inPosition;</w:t>
+      </w:r>
+    </w:p>
+    <w:p>
+      <w:r>
+        <w:lastRenderedPageBreak/>
+        <w:t>layout(location = 1) in vec3 inColor;</w:t>
+      </w:r>
+    </w:p>
+    <w:p/>
+    <w:p>
+      <w:r>
+        <w:t>layout(location = 0) out vec3 fragColor;</w:t>
+      </w:r>
+    </w:p>
+    <w:p/>
+    <w:p>
+      <w:r>
+        <w:t>void main() {</w:t>
+      </w:r>
+    </w:p>
+    <w:p>
+      <w:r>
+        <w:t xml:space="preserve">    vec3 offset = vec3(gl_InstanceIndex * 1.5 - 3.0, 0.0, 0.0);</w:t>
+      </w:r>
+    </w:p>
+    <w:p/>
+    <w:p>
+      <w:r>
+        <w:t xml:space="preserve">    vec4 worldPosition = ubo.model * vec4(inPosition, 1.0);</w:t>
+      </w:r>
+    </w:p>
+    <w:p>
+      <w:r>
+        <w:t xml:space="preserve">    worldPosition.xyz += offset;</w:t>
+      </w:r>
+    </w:p>
+    <w:p/>
+    <w:p>
+      <w:r>
+        <w:t xml:space="preserve">    gl_Position = ubo.proj * ubo.view * ubo.model * worldPosition;</w:t>
+      </w:r>
+    </w:p>
+    <w:p>
+      <w:r>
+        <w:t xml:space="preserve">    fragColor = inColor;</w:t>
+      </w:r>
+    </w:p>
+    <w:p>
+      <w:r>
+        <w:t>}</w:t>
+      </w:r>
+    </w:p>
+    <w:p>
+      <w:pPr>
         <w:pStyle w:val="Heading2"/>
       </w:pPr>
       <w:r>
-        <w:t>Code</w:t>
-      </w:r>
-    </w:p>
-    <w:p>
-      <w:pPr>
-        <w:pStyle w:val="Heading2"/>
-      </w:pPr>
-      <w:r>
         <w:t>Reflection</w:t>
       </w:r>
     </w:p>
@@ -3598,6 +3759,82 @@
           <w:rFonts w:ascii="Segoe UI"/>
         </w:rPr>
       </w:pPr>
+    </w:p>
+    <w:p>
+      <w:pPr>
+        <w:pStyle w:val="BodyText"/>
+        <w:spacing w:before="1" w:line="283" w:lineRule="auto"/>
+        <w:ind w:left="9" w:right="247"/>
+        <w:rPr>
+          <w:rFonts w:ascii="Segoe UI"/>
+        </w:rPr>
+      </w:pPr>
+      <w:r>
+        <w:rPr>
+          <w:rFonts w:ascii="Segoe UI"/>
+        </w:rPr>
+        <w:t xml:space="preserve">In this exercise we are drawing multiple </w:t>
+      </w:r>
+      <w:r>
+        <w:rPr>
+          <w:rFonts w:ascii="Segoe UI"/>
+        </w:rPr>
+        <w:t>objects in one scene instead of just one. In order to do this the vkcmdDraw</w:t>
+      </w:r>
+      <w:r>
+        <w:rPr>
+          <w:rFonts w:ascii="Segoe UI"/>
+        </w:rPr>
+        <w:t xml:space="preserve">Index we draw for example 5 instances of one cube and then in the shader code we modify it so each of these cubes have a unique position. </w:t>
+      </w:r>
+      <w:r>
+        <w:rPr>
+          <w:rFonts w:ascii="Segoe UI"/>
+        </w:rPr>
+        <w:t xml:space="preserve">Overall, the way of doing this is a bit strange since you need to add the positions of new cubes in the </w:t>
+      </w:r>
+      <w:r>
+        <w:rPr>
+          <w:rFonts w:ascii="Segoe UI"/>
+        </w:rPr>
+        <w:t>vertex shader when in OpenGL I don</w:t>
+      </w:r>
+      <w:r>
+        <w:rPr>
+          <w:rFonts w:ascii="Segoe UI"/>
+        </w:rPr>
+        <w:t>’</w:t>
+      </w:r>
+      <w:r>
+        <w:rPr>
+          <w:rFonts w:ascii="Segoe UI"/>
+        </w:rPr>
+        <w:t xml:space="preserve">t think you did that and it was in a regular class. </w:t>
+      </w:r>
+      <w:r>
+        <w:rPr>
+          <w:rFonts w:ascii="Segoe UI"/>
+        </w:rPr>
+        <w:t xml:space="preserve">The vulkan method at least </w:t>
+      </w:r>
+      <w:r>
+        <w:rPr>
+          <w:rFonts w:ascii="Segoe UI"/>
+        </w:rPr>
+        <w:t>I can sort of understand why it</w:t>
+      </w:r>
+      <w:r>
+        <w:rPr>
+          <w:rFonts w:ascii="Segoe UI"/>
+        </w:rPr>
+        <w:t>’</w:t>
+      </w:r>
+      <w:r>
+        <w:rPr>
+          <w:rFonts w:ascii="Segoe UI"/>
+        </w:rPr>
+        <w:t>s like this since you just need to modify the shader code to add new positions and you can add more objects in the scene from the index code.</w:t>
+      </w:r>
     </w:p>
     <w:p>
       <w:pPr>
@@ -3709,7 +3946,7 @@
           <w:sz w:val="21"/>
         </w:rPr>
       </w:pPr>
-      <w:hyperlink r:id="rId17">
+      <w:hyperlink r:id="rId18">
         <w:r>
           <w:rPr>
             <w:rFonts w:ascii="Segoe UI" w:hAnsi="Segoe UI"/>

</xml_diff>

<commit_message>
updated q2 of word doc
</commit_message>
<xml_diff>
--- a/VulkanLabs/VulkanLab1/Lab_Startup/Startup_Lab/Vulkan(1_3)_Lab_01/Vulkan-Lab1.docx
+++ b/VulkanLabs/VulkanLab1/Lab_Startup/Startup_Lab/Vulkan(1_3)_Lab_01/Vulkan-Lab1.docx
@@ -1,6 +1,6 @@
 
 <file path=word/document.xml><?xml version="1.0" encoding="utf-8"?>
-<w:document xmlns:wpc="http://schemas.microsoft.com/office/word/2010/wordprocessingCanvas" xmlns:cx="http://schemas.microsoft.com/office/drawing/2014/chartex" xmlns:cx1="http://schemas.microsoft.com/office/drawing/2015/9/8/chartex" xmlns:cx2="http://schemas.microsoft.com/office/drawing/2015/10/21/chartex" xmlns:cx3="http://schemas.microsoft.com/office/drawing/2016/5/9/chartex" xmlns:cx4="http://schemas.microsoft.com/office/drawing/2016/5/10/chartex" xmlns:cx5="http://schemas.microsoft.com/office/drawing/2016/5/11/chartex" xmlns:cx6="http://schemas.microsoft.com/office/drawing/2016/5/12/chartex" xmlns:cx7="http://schemas.microsoft.com/office/drawing/2016/5/13/chartex" xmlns:cx8="http://schemas.microsoft.com/office/drawing/2016/5/14/chartex" xmlns:mc="http://schemas.openxmlformats.org/markup-compatibility/2006" xmlns:aink="http://schemas.microsoft.com/office/drawing/2016/ink" xmlns:am3d="http://schemas.microsoft.com/office/drawing/2017/model3d" xmlns:o="urn:schemas-microsoft-com:office:office" xmlns:oel="http://schemas.microsoft.com/office/2019/extlst" xmlns:r="http://schemas.openxmlformats.org/officeDocument/2006/relationships" xmlns:m="http://schemas.openxmlformats.org/officeDocument/2006/math" xmlns:v="urn:schemas-microsoft-com:vml" xmlns:wp14="http://schemas.microsoft.com/office/word/2010/wordprocessingDrawing" xmlns:wp="http://schemas.openxmlformats.org/drawingml/2006/wordprocessingDrawing" xmlns:w10="urn:schemas-microsoft-com:office:word" xmlns:w="http://schemas.openxmlformats.org/wordprocessingml/2006/main" xmlns:w14="http://schemas.microsoft.com/office/word/2010/wordml" xmlns:w15="http://schemas.microsoft.com/office/word/2012/wordml" xmlns:w16cei="http://schemas.microsoft.com/office/word/2026/wordml/cei" xmlns:w16cex="http://schemas.microsoft.com/office/word/2018/wordml/cex" xmlns:w16cid="http://schemas.microsoft.com/office/word/2016/wordml/cid" xmlns:w16="http://schemas.microsoft.com/office/word/2018/wordml" xmlns:w16du="http://schemas.microsoft.com/office/word/2023/wordml/word16du" xmlns:w16sdtdh="http://schemas.microsoft.com/office/word/2020/wordml/sdtdatahash" xmlns:w16sdtfl="http://schemas.microsoft.com/office/word/2024/wordml/sdtformatlock" xmlns:w16se="http://schemas.microsoft.com/office/word/2015/wordml/symex" xmlns:wpg="http://schemas.microsoft.com/office/word/2010/wordprocessingGroup" xmlns:wpi="http://schemas.microsoft.com/office/word/2010/wordprocessingInk" xmlns:wne="http://schemas.microsoft.com/office/word/2006/wordml" xmlns:wps="http://schemas.microsoft.com/office/word/2010/wordprocessingShape" mc:Ignorable="w14 w15 w16se w16cid w16 w16cex w16sdtdh w16sdtfl w16du wp14">
+<w:document xmlns:wpc="http://schemas.microsoft.com/office/word/2010/wordprocessingCanvas" xmlns:cx="http://schemas.microsoft.com/office/drawing/2014/chartex" xmlns:cx1="http://schemas.microsoft.com/office/drawing/2015/9/8/chartex" xmlns:cx2="http://schemas.microsoft.com/office/drawing/2015/10/21/chartex" xmlns:cx3="http://schemas.microsoft.com/office/drawing/2016/5/9/chartex" xmlns:cx4="http://schemas.microsoft.com/office/drawing/2016/5/10/chartex" xmlns:cx5="http://schemas.microsoft.com/office/drawing/2016/5/11/chartex" xmlns:cx6="http://schemas.microsoft.com/office/drawing/2016/5/12/chartex" xmlns:cx7="http://schemas.microsoft.com/office/drawing/2016/5/13/chartex" xmlns:cx8="http://schemas.microsoft.com/office/drawing/2016/5/14/chartex" xmlns:mc="http://schemas.openxmlformats.org/markup-compatibility/2006" xmlns:aink="http://schemas.microsoft.com/office/drawing/2016/ink" xmlns:am3d="http://schemas.microsoft.com/office/drawing/2017/model3d" xmlns:o="urn:schemas-microsoft-com:office:office" xmlns:oel="http://schemas.microsoft.com/office/2019/extlst" xmlns:r="http://schemas.openxmlformats.org/officeDocument/2006/relationships" xmlns:m="http://schemas.openxmlformats.org/officeDocument/2006/math" xmlns:v="urn:schemas-microsoft-com:vml" xmlns:wp14="http://schemas.microsoft.com/office/word/2010/wordprocessingDrawing" xmlns:wp="http://schemas.openxmlformats.org/drawingml/2006/wordprocessingDrawing" xmlns:w10="urn:schemas-microsoft-com:office:word" xmlns:w="http://schemas.openxmlformats.org/wordprocessingml/2006/main" xmlns:w14="http://schemas.microsoft.com/office/word/2010/wordml" xmlns:w15="http://schemas.microsoft.com/office/word/2012/wordml" xmlns:w16cex="http://schemas.microsoft.com/office/word/2018/wordml/cex" xmlns:w16cid="http://schemas.microsoft.com/office/word/2016/wordml/cid" xmlns:w16="http://schemas.microsoft.com/office/word/2018/wordml" xmlns:w16du="http://schemas.microsoft.com/office/word/2023/wordml/word16du" xmlns:w16sdtdh="http://schemas.microsoft.com/office/word/2020/wordml/sdtdatahash" xmlns:w16sdtfl="http://schemas.microsoft.com/office/word/2024/wordml/sdtformatlock" xmlns:w16se="http://schemas.microsoft.com/office/word/2015/wordml/symex" xmlns:wpg="http://schemas.microsoft.com/office/word/2010/wordprocessingGroup" xmlns:wpi="http://schemas.microsoft.com/office/word/2010/wordprocessingInk" xmlns:wne="http://schemas.microsoft.com/office/word/2006/wordml" xmlns:wps="http://schemas.microsoft.com/office/word/2010/wordprocessingShape" mc:Ignorable="w14 w15 w16se w16cid w16 w16cex w16sdtdh w16sdtfl w16du wp14">
   <w:body>
     <w:p>
       <w:pPr>
@@ -106,7 +106,7 @@
           </mc:Choice>
           <mc:Fallback>
             <w:pict>
-              <v:shape w14:anchorId="5E98879B" id="Graphic 4" o:spid="_x0000_s1026" style="position:absolute;margin-left:43pt;margin-top:4.5pt;width:510pt;height:.75pt;z-index:-251666432;visibility:visible;mso-wrap-style:square;mso-wrap-distance-left:0;mso-wrap-distance-top:0;mso-wrap-distance-right:0;mso-wrap-distance-bottom:0;mso-position-horizontal:absolute;mso-position-horizontal-relative:page;mso-position-vertical:absolute;mso-position-vertical-relative:text;v-text-anchor:top" coordsize="6477000,9525" o:gfxdata="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" path="m6476999,9524l,9524,,,6476999,r,9524xe" fillcolor="black" stroked="f">
+              <v:shape w14:anchorId="149EFC73" id="Graphic 4" o:spid="_x0000_s1026" style="position:absolute;margin-left:43pt;margin-top:4.5pt;width:510pt;height:.75pt;z-index:-251666432;visibility:visible;mso-wrap-style:square;mso-wrap-distance-left:0;mso-wrap-distance-top:0;mso-wrap-distance-right:0;mso-wrap-distance-bottom:0;mso-position-horizontal:absolute;mso-position-horizontal-relative:page;mso-position-vertical:absolute;mso-position-vertical-relative:text;v-text-anchor:top" coordsize="6477000,9525" o:gfxdata="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" path="m6476999,9524l,9524,,,6476999,r,9524xe" fillcolor="black" stroked="f">
                 <v:path arrowok="t"/>
                 <w10:wrap type="topAndBottom" anchorx="page"/>
               </v:shape>
@@ -669,25 +669,26 @@
           <w:sz w:val="16"/>
           <w:lang w:val="en-GB"/>
         </w:rPr>
-        <w:t xml:space="preserve"> {{-0.5f, -0.5f, 0.5f}, {1.0f, 1.0f, 0.5f</w:t>
-      </w:r>
-      <w:proofErr w:type="gramStart"/>
-      <w:r>
+        <w:t xml:space="preserve"> {{-0.5f, -0.5f, 0.5f}, {1.0f, 1.0f, 0.5f} }, //4</w:t>
+      </w:r>
+    </w:p>
+    <w:p>
+      <w:pPr>
+        <w:pStyle w:val="BodyText"/>
+        <w:spacing w:before="10"/>
         <w:rPr>
           <w:rFonts w:ascii="Segoe UI"/>
           <w:sz w:val="16"/>
           <w:lang w:val="en-GB"/>
         </w:rPr>
-        <w:t>} }</w:t>
-      </w:r>
-      <w:proofErr w:type="gramEnd"/>
+      </w:pPr>
       <w:r>
         <w:rPr>
           <w:rFonts w:ascii="Segoe UI"/>
           <w:sz w:val="16"/>
           <w:lang w:val="en-GB"/>
         </w:rPr>
-        <w:t>, //4</w:t>
+        <w:t xml:space="preserve"> {{0.5f, -0.5f, 0.5f}, {0.0f,1.0f,0.5f}}, //5</w:t>
       </w:r>
     </w:p>
     <w:p>
@@ -706,7 +707,7 @@
           <w:sz w:val="16"/>
           <w:lang w:val="en-GB"/>
         </w:rPr>
-        <w:t xml:space="preserve"> {{0.5f, -0.5f, 0.5f}, {0.0f,1.0f,0.5f}}, //5</w:t>
+        <w:t xml:space="preserve"> {{0.5f, 0.5f, 0.5f}, {0.0f,0.0f,1.0f}}, //6</w:t>
       </w:r>
     </w:p>
     <w:p>
@@ -725,7 +726,7 @@
           <w:sz w:val="16"/>
           <w:lang w:val="en-GB"/>
         </w:rPr>
-        <w:t xml:space="preserve"> {{0.5f, 0.5f, 0.5f}, {0.0f,0.0f,1.0f}}, //6</w:t>
+        <w:t xml:space="preserve"> {{-0.5f, 0.5f, 0.5f}, {1.0f,1.0f,1.0f}}, //7</w:t>
       </w:r>
     </w:p>
     <w:p>
@@ -738,89 +739,24 @@
           <w:lang w:val="en-GB"/>
         </w:rPr>
       </w:pPr>
-      <w:r>
+    </w:p>
+    <w:p>
+      <w:pPr>
+        <w:pStyle w:val="BodyText"/>
+        <w:spacing w:before="10"/>
         <w:rPr>
           <w:rFonts w:ascii="Segoe UI"/>
           <w:sz w:val="16"/>
           <w:lang w:val="en-GB"/>
         </w:rPr>
-        <w:t xml:space="preserve"> {{-0.5f, 0.5f, 0.5f}, {1.0f,1.0f,1.0f}}, //7</w:t>
-      </w:r>
-    </w:p>
-    <w:p>
-      <w:pPr>
-        <w:pStyle w:val="BodyText"/>
-        <w:spacing w:before="10"/>
+      </w:pPr>
+      <w:r>
         <w:rPr>
           <w:rFonts w:ascii="Segoe UI"/>
           <w:sz w:val="16"/>
           <w:lang w:val="en-GB"/>
         </w:rPr>
-      </w:pPr>
-    </w:p>
-    <w:p>
-      <w:pPr>
-        <w:pStyle w:val="BodyText"/>
-        <w:spacing w:before="10"/>
-        <w:rPr>
-          <w:rFonts w:ascii="Segoe UI"/>
-          <w:sz w:val="16"/>
-          <w:lang w:val="en-GB"/>
-        </w:rPr>
-      </w:pPr>
-      <w:proofErr w:type="spellStart"/>
-      <w:r>
-        <w:rPr>
-          <w:rFonts w:ascii="Segoe UI"/>
-          <w:sz w:val="16"/>
-          <w:lang w:val="en-GB"/>
-        </w:rPr>
-        <w:t>const</w:t>
-      </w:r>
-      <w:proofErr w:type="spellEnd"/>
-      <w:r>
-        <w:rPr>
-          <w:rFonts w:ascii="Segoe UI"/>
-          <w:sz w:val="16"/>
-          <w:lang w:val="en-GB"/>
-        </w:rPr>
-        <w:t xml:space="preserve"> </w:t>
-      </w:r>
-      <w:proofErr w:type="gramStart"/>
-      <w:r>
-        <w:rPr>
-          <w:rFonts w:ascii="Segoe UI"/>
-          <w:sz w:val="16"/>
-          <w:lang w:val="en-GB"/>
-        </w:rPr>
-        <w:t>std::</w:t>
-      </w:r>
-      <w:proofErr w:type="gramEnd"/>
-      <w:r>
-        <w:rPr>
-          <w:rFonts w:ascii="Segoe UI"/>
-          <w:sz w:val="16"/>
-          <w:lang w:val="en-GB"/>
-        </w:rPr>
-        <w:t xml:space="preserve">vector&lt;uint16_t&gt; </w:t>
-      </w:r>
-      <w:proofErr w:type="spellStart"/>
-      <w:r>
-        <w:rPr>
-          <w:rFonts w:ascii="Segoe UI"/>
-          <w:sz w:val="16"/>
-          <w:lang w:val="en-GB"/>
-        </w:rPr>
-        <w:t>Quad_indices</w:t>
-      </w:r>
-      <w:proofErr w:type="spellEnd"/>
-      <w:r>
-        <w:rPr>
-          <w:rFonts w:ascii="Segoe UI"/>
-          <w:sz w:val="16"/>
-          <w:lang w:val="en-GB"/>
-        </w:rPr>
-        <w:t xml:space="preserve"> = {</w:t>
+        <w:t>const std::vector&lt;uint16_t&gt; Quad_indices = {</w:t>
       </w:r>
     </w:p>
     <w:p>
@@ -925,63 +861,7 @@
           <w:sz w:val="16"/>
           <w:lang w:val="en-GB"/>
         </w:rPr>
-        <w:t xml:space="preserve">    </w:t>
-      </w:r>
-      <w:proofErr w:type="spellStart"/>
-      <w:proofErr w:type="gramStart"/>
-      <w:r>
-        <w:rPr>
-          <w:rFonts w:ascii="Segoe UI"/>
-          <w:sz w:val="16"/>
-          <w:lang w:val="en-GB"/>
-        </w:rPr>
-        <w:t>vkCmdDraw</w:t>
-      </w:r>
-      <w:proofErr w:type="spellEnd"/>
-      <w:r>
-        <w:rPr>
-          <w:rFonts w:ascii="Segoe UI"/>
-          <w:sz w:val="16"/>
-          <w:lang w:val="en-GB"/>
-        </w:rPr>
-        <w:t>(</w:t>
-      </w:r>
-      <w:proofErr w:type="spellStart"/>
-      <w:proofErr w:type="gramEnd"/>
-      <w:r>
-        <w:rPr>
-          <w:rFonts w:ascii="Segoe UI"/>
-          <w:sz w:val="16"/>
-          <w:lang w:val="en-GB"/>
-        </w:rPr>
-        <w:t>commandBuffer</w:t>
-      </w:r>
-      <w:proofErr w:type="spellEnd"/>
-      <w:r>
-        <w:rPr>
-          <w:rFonts w:ascii="Segoe UI"/>
-          <w:sz w:val="16"/>
-          <w:lang w:val="en-GB"/>
-        </w:rPr>
-        <w:t xml:space="preserve">, 6, 1, 1, </w:t>
-      </w:r>
-      <w:proofErr w:type="gramStart"/>
-      <w:r>
-        <w:rPr>
-          <w:rFonts w:ascii="Segoe UI"/>
-          <w:sz w:val="16"/>
-          <w:lang w:val="en-GB"/>
-        </w:rPr>
-        <w:t>1 )</w:t>
-      </w:r>
-      <w:proofErr w:type="gramEnd"/>
-      <w:r>
-        <w:rPr>
-          <w:rFonts w:ascii="Segoe UI"/>
-          <w:sz w:val="16"/>
-          <w:lang w:val="en-GB"/>
-        </w:rPr>
-        <w:t>; //should now be able to draw two triangles aka 6 vertices</w:t>
+        <w:t xml:space="preserve">    vkCmdDraw(commandBuffer, 6, 1, 1, 1 ); //should now be able to draw two triangles aka 6 vertices</w:t>
       </w:r>
     </w:p>
     <w:p>
@@ -1043,62 +923,12 @@
     </w:p>
     <w:p>
       <w:r>
-        <w:t xml:space="preserve">In this exercise I had to draw two individual triangles by using </w:t>
-      </w:r>
-      <w:proofErr w:type="spellStart"/>
-      <w:proofErr w:type="gramStart"/>
-      <w:r>
-        <w:t>vkCmdDraw</w:t>
-      </w:r>
-      <w:proofErr w:type="spellEnd"/>
-      <w:r>
-        <w:t>(</w:t>
-      </w:r>
-      <w:proofErr w:type="gramEnd"/>
-      <w:r>
-        <w:t>).</w:t>
-      </w:r>
-    </w:p>
-    <w:p>
-      <w:r>
-        <w:t xml:space="preserve">The drawing of the triangles was easy enough since I just had to duplicate the first triangle and change the </w:t>
-      </w:r>
-      <w:proofErr w:type="spellStart"/>
-      <w:r>
-        <w:t>xyz</w:t>
-      </w:r>
-      <w:proofErr w:type="spellEnd"/>
-      <w:r>
-        <w:t xml:space="preserve"> coords. It feels a bit </w:t>
-      </w:r>
-      <w:proofErr w:type="gramStart"/>
-      <w:r>
-        <w:t>similar to</w:t>
-      </w:r>
-      <w:proofErr w:type="gramEnd"/>
-      <w:r>
-        <w:t xml:space="preserve"> OpenGL the main difference is that I need to use the </w:t>
-      </w:r>
-      <w:proofErr w:type="spellStart"/>
-      <w:proofErr w:type="gramStart"/>
-      <w:r>
-        <w:t>vkCmdDraw</w:t>
-      </w:r>
-      <w:proofErr w:type="spellEnd"/>
-      <w:r>
-        <w:t>(</w:t>
-      </w:r>
-      <w:proofErr w:type="gramEnd"/>
-      <w:r>
-        <w:t xml:space="preserve">) </w:t>
-      </w:r>
-      <w:proofErr w:type="gramStart"/>
-      <w:r>
-        <w:t>in order to</w:t>
-      </w:r>
-      <w:proofErr w:type="gramEnd"/>
-      <w:r>
-        <w:t xml:space="preserve"> draw 6 vertices that the triangle needs. </w:t>
+        <w:t>In this exercise I had to draw two individual triangles by using vkCmdDraw().</w:t>
+      </w:r>
+    </w:p>
+    <w:p>
+      <w:r>
+        <w:t xml:space="preserve">The drawing of the triangles was easy enough since I just had to duplicate the first triangle and change the xyz coords. It feels a bit similar to OpenGL the main difference is that I need to use the vkCmdDraw() in order to draw 6 vertices that the triangle needs. </w:t>
       </w:r>
     </w:p>
     <w:p>
@@ -1218,53 +1048,12 @@
           <w:lang w:val="en-GB"/>
         </w:rPr>
       </w:pPr>
-      <w:proofErr w:type="spellStart"/>
-      <w:r>
-        <w:rPr>
-          <w:rFonts w:ascii="Segoe UI"/>
-          <w:lang w:val="en-GB"/>
-        </w:rPr>
-        <w:t>const</w:t>
-      </w:r>
-      <w:proofErr w:type="spellEnd"/>
-      <w:r>
-        <w:rPr>
-          <w:rFonts w:ascii="Segoe UI"/>
-          <w:lang w:val="en-GB"/>
-        </w:rPr>
-        <w:t xml:space="preserve"> </w:t>
-      </w:r>
-      <w:proofErr w:type="gramStart"/>
-      <w:r>
-        <w:rPr>
-          <w:rFonts w:ascii="Segoe UI"/>
-          <w:lang w:val="en-GB"/>
-        </w:rPr>
-        <w:t>std::</w:t>
-      </w:r>
-      <w:proofErr w:type="gramEnd"/>
-      <w:r>
-        <w:rPr>
-          <w:rFonts w:ascii="Segoe UI"/>
-          <w:lang w:val="en-GB"/>
-        </w:rPr>
-        <w:t xml:space="preserve">vector&lt;Vertex&gt; </w:t>
-      </w:r>
-      <w:proofErr w:type="spellStart"/>
-      <w:r>
-        <w:rPr>
-          <w:rFonts w:ascii="Segoe UI"/>
-          <w:lang w:val="en-GB"/>
-        </w:rPr>
-        <w:t>Quad_vertices</w:t>
-      </w:r>
-      <w:proofErr w:type="spellEnd"/>
-      <w:r>
-        <w:rPr>
-          <w:rFonts w:ascii="Segoe UI"/>
-          <w:lang w:val="en-GB"/>
-        </w:rPr>
-        <w:t xml:space="preserve"> = {</w:t>
+      <w:r>
+        <w:rPr>
+          <w:rFonts w:ascii="Segoe UI"/>
+          <w:lang w:val="en-GB"/>
+        </w:rPr>
+        <w:t>const std::vector&lt;Vertex&gt; Quad_vertices = {</w:t>
       </w:r>
     </w:p>
     <w:p>
@@ -1465,23 +1254,7 @@
           <w:rFonts w:ascii="Segoe UI"/>
           <w:lang w:val="en-GB"/>
         </w:rPr>
-        <w:t xml:space="preserve">    {{-0.5f, -0.5f, 0.5f}, {1.0f, 1.0f, 0.5f</w:t>
-      </w:r>
-      <w:proofErr w:type="gramStart"/>
-      <w:r>
-        <w:rPr>
-          <w:rFonts w:ascii="Segoe UI"/>
-          <w:lang w:val="en-GB"/>
-        </w:rPr>
-        <w:t>} }</w:t>
-      </w:r>
-      <w:proofErr w:type="gramEnd"/>
-      <w:r>
-        <w:rPr>
-          <w:rFonts w:ascii="Segoe UI"/>
-          <w:lang w:val="en-GB"/>
-        </w:rPr>
-        <w:t>, //4</w:t>
+        <w:t xml:space="preserve">    {{-0.5f, -0.5f, 0.5f}, {1.0f, 1.0f, 0.5f} }, //4</w:t>
       </w:r>
     </w:p>
     <w:p>
@@ -1628,53 +1401,12 @@
           <w:lang w:val="en-GB"/>
         </w:rPr>
       </w:pPr>
-      <w:proofErr w:type="spellStart"/>
-      <w:r>
-        <w:rPr>
-          <w:rFonts w:ascii="Segoe UI"/>
-          <w:lang w:val="en-GB"/>
-        </w:rPr>
-        <w:t>const</w:t>
-      </w:r>
-      <w:proofErr w:type="spellEnd"/>
-      <w:r>
-        <w:rPr>
-          <w:rFonts w:ascii="Segoe UI"/>
-          <w:lang w:val="en-GB"/>
-        </w:rPr>
-        <w:t xml:space="preserve"> </w:t>
-      </w:r>
-      <w:proofErr w:type="gramStart"/>
-      <w:r>
-        <w:rPr>
-          <w:rFonts w:ascii="Segoe UI"/>
-          <w:lang w:val="en-GB"/>
-        </w:rPr>
-        <w:t>std::</w:t>
-      </w:r>
-      <w:proofErr w:type="gramEnd"/>
-      <w:r>
-        <w:rPr>
-          <w:rFonts w:ascii="Segoe UI"/>
-          <w:lang w:val="en-GB"/>
-        </w:rPr>
-        <w:t xml:space="preserve">vector&lt;uint16_t&gt; </w:t>
-      </w:r>
-      <w:proofErr w:type="spellStart"/>
-      <w:r>
-        <w:rPr>
-          <w:rFonts w:ascii="Segoe UI"/>
-          <w:lang w:val="en-GB"/>
-        </w:rPr>
-        <w:t>Quad_indices</w:t>
-      </w:r>
-      <w:proofErr w:type="spellEnd"/>
-      <w:r>
-        <w:rPr>
-          <w:rFonts w:ascii="Segoe UI"/>
-          <w:lang w:val="en-GB"/>
-        </w:rPr>
-        <w:t xml:space="preserve"> = {</w:t>
+      <w:r>
+        <w:rPr>
+          <w:rFonts w:ascii="Segoe UI"/>
+          <w:lang w:val="en-GB"/>
+        </w:rPr>
+        <w:t>const std::vector&lt;uint16_t&gt; Quad_indices = {</w:t>
       </w:r>
     </w:p>
     <w:p>
@@ -1787,75 +1519,7 @@
           <w:rFonts w:ascii="Segoe UI"/>
           <w:lang w:val="en-GB"/>
         </w:rPr>
-        <w:t xml:space="preserve">    </w:t>
-      </w:r>
-      <w:proofErr w:type="spellStart"/>
-      <w:proofErr w:type="gramStart"/>
-      <w:r>
-        <w:rPr>
-          <w:rFonts w:ascii="Segoe UI"/>
-          <w:lang w:val="en-GB"/>
-        </w:rPr>
-        <w:t>vkCmdDrawIndexed</w:t>
-      </w:r>
-      <w:proofErr w:type="spellEnd"/>
-      <w:r>
-        <w:rPr>
-          <w:rFonts w:ascii="Segoe UI"/>
-          <w:lang w:val="en-GB"/>
-        </w:rPr>
-        <w:t>(</w:t>
-      </w:r>
-      <w:proofErr w:type="spellStart"/>
-      <w:proofErr w:type="gramEnd"/>
-      <w:r>
-        <w:rPr>
-          <w:rFonts w:ascii="Segoe UI"/>
-          <w:lang w:val="en-GB"/>
-        </w:rPr>
-        <w:t>commandBuffer</w:t>
-      </w:r>
-      <w:proofErr w:type="spellEnd"/>
-      <w:r>
-        <w:rPr>
-          <w:rFonts w:ascii="Segoe UI"/>
-          <w:lang w:val="en-GB"/>
-        </w:rPr>
-        <w:t xml:space="preserve">, </w:t>
-      </w:r>
-      <w:proofErr w:type="spellStart"/>
-      <w:r>
-        <w:rPr>
-          <w:rFonts w:ascii="Segoe UI"/>
-          <w:lang w:val="en-GB"/>
-        </w:rPr>
-        <w:t>static_cast</w:t>
-      </w:r>
-      <w:proofErr w:type="spellEnd"/>
-      <w:r>
-        <w:rPr>
-          <w:rFonts w:ascii="Segoe UI"/>
-          <w:lang w:val="en-GB"/>
-        </w:rPr>
-        <w:t>&lt;uint16_t&gt;(</w:t>
-      </w:r>
-      <w:proofErr w:type="spellStart"/>
-      <w:proofErr w:type="gramStart"/>
-      <w:r>
-        <w:rPr>
-          <w:rFonts w:ascii="Segoe UI"/>
-          <w:lang w:val="en-GB"/>
-        </w:rPr>
-        <w:t>indices.size</w:t>
-      </w:r>
-      <w:proofErr w:type="spellEnd"/>
-      <w:proofErr w:type="gramEnd"/>
-      <w:r>
-        <w:rPr>
-          <w:rFonts w:ascii="Segoe UI"/>
-          <w:lang w:val="en-GB"/>
-        </w:rPr>
-        <w:t xml:space="preserve">()), 1, 0, 0, 0); </w:t>
+        <w:t xml:space="preserve">    vkCmdDrawIndexed(commandBuffer, static_cast&lt;uint16_t&gt;(indices.size()), 1, 0, 0, 0); </w:t>
       </w:r>
     </w:p>
     <w:p>
@@ -1877,6 +1541,18 @@
       </w:r>
       <w:r>
         <w:t>eflection</w:t>
+      </w:r>
+    </w:p>
+    <w:p/>
+    <w:p>
+      <w:r>
+        <w:t xml:space="preserve">Exercise two now uses the index buffer </w:t>
+      </w:r>
+      <w:r>
+        <w:t>and as a result both triangles are now in the same position and use the same colour pallete. It’s interesting seeing the difference between vkCmdDrawIndex vs vkCmdDraw</w:t>
+      </w:r>
+      <w:r>
+        <w:t xml:space="preserve">. </w:t>
       </w:r>
     </w:p>
     <w:p/>
@@ -1889,47 +1565,53 @@
         </w:sectPr>
       </w:pPr>
       <w:r>
-        <w:t xml:space="preserve">Exercise two now uses the index buffer </w:t>
-      </w:r>
-      <w:r>
-        <w:t xml:space="preserve">and as a result both triangles are now in the same position and use the same </w:t>
-      </w:r>
-      <w:proofErr w:type="spellStart"/>
-      <w:r>
-        <w:t>colour</w:t>
-      </w:r>
-      <w:proofErr w:type="spellEnd"/>
+        <w:t>Since vkCmdDrawIndex</w:t>
+      </w:r>
       <w:r>
         <w:t xml:space="preserve"> </w:t>
       </w:r>
-      <w:proofErr w:type="spellStart"/>
-      <w:r>
-        <w:t>pallete</w:t>
-      </w:r>
-      <w:proofErr w:type="spellEnd"/>
-      <w:r>
-        <w:t xml:space="preserve">. It’s interesting seeing the difference between </w:t>
-      </w:r>
-      <w:proofErr w:type="spellStart"/>
-      <w:proofErr w:type="gramStart"/>
-      <w:r>
-        <w:t>vkCmdDrawIndex</w:t>
-      </w:r>
-      <w:proofErr w:type="spellEnd"/>
-      <w:proofErr w:type="gramEnd"/>
-      <w:r>
-        <w:t xml:space="preserve"> vs </w:t>
-      </w:r>
-      <w:proofErr w:type="spellStart"/>
-      <w:proofErr w:type="gramStart"/>
-      <w:r>
-        <w:t>vkCmdDraw</w:t>
-      </w:r>
-      <w:proofErr w:type="spellEnd"/>
-      <w:r>
-        <w:t xml:space="preserve"> .</w:t>
-      </w:r>
-      <w:proofErr w:type="gramEnd"/>
+      <w:r>
+        <w:t xml:space="preserve">it </w:t>
+      </w:r>
+      <w:r>
+        <w:t xml:space="preserve">draws </w:t>
+      </w:r>
+      <w:r>
+        <w:t>from a separate index buffer which makes it so you don’t run into the problem of having to draw the</w:t>
+      </w:r>
+      <w:r>
+        <w:t xml:space="preserve"> primitive</w:t>
+      </w:r>
+      <w:r>
+        <w:t xml:space="preserve"> twice</w:t>
+      </w:r>
+      <w:r>
+        <w:t xml:space="preserve"> (rendering each point as well)</w:t>
+      </w:r>
+      <w:r>
+        <w:t xml:space="preserve"> </w:t>
+      </w:r>
+      <w:r>
+        <w:t>y</w:t>
+      </w:r>
+      <w:r>
+        <w:t>ou can instead reuse</w:t>
+      </w:r>
+      <w:r>
+        <w:t xml:space="preserve"> each verticies and reduce duplicated vertex data</w:t>
+      </w:r>
+      <w:r>
+        <w:t>. This becomes more effective with more complex models</w:t>
+      </w:r>
+      <w:r>
+        <w:t xml:space="preserve"> with a lot more tris. VkCmdDraw instead</w:t>
+      </w:r>
+      <w:r>
+        <w:t xml:space="preserve"> draws vertices from the vertex buffer in sequence.</w:t>
+      </w:r>
+      <w:r>
+        <w:t xml:space="preserve"> </w:t>
+      </w:r>
     </w:p>
     <w:p>
       <w:pPr>
@@ -2100,53 +1782,12 @@
           <w:lang w:val="en-GB"/>
         </w:rPr>
       </w:pPr>
-      <w:proofErr w:type="spellStart"/>
-      <w:r>
-        <w:rPr>
-          <w:rFonts w:ascii="Segoe UI"/>
-          <w:lang w:val="en-GB"/>
-        </w:rPr>
-        <w:t>const</w:t>
-      </w:r>
-      <w:proofErr w:type="spellEnd"/>
-      <w:r>
-        <w:rPr>
-          <w:rFonts w:ascii="Segoe UI"/>
-          <w:lang w:val="en-GB"/>
-        </w:rPr>
-        <w:t xml:space="preserve"> </w:t>
-      </w:r>
-      <w:proofErr w:type="gramStart"/>
-      <w:r>
-        <w:rPr>
-          <w:rFonts w:ascii="Segoe UI"/>
-          <w:lang w:val="en-GB"/>
-        </w:rPr>
-        <w:t>std::</w:t>
-      </w:r>
-      <w:proofErr w:type="gramEnd"/>
-      <w:r>
-        <w:rPr>
-          <w:rFonts w:ascii="Segoe UI"/>
-          <w:lang w:val="en-GB"/>
-        </w:rPr>
-        <w:t xml:space="preserve">vector&lt;Vertex&gt; </w:t>
-      </w:r>
-      <w:proofErr w:type="spellStart"/>
-      <w:r>
-        <w:rPr>
-          <w:rFonts w:ascii="Segoe UI"/>
-          <w:lang w:val="en-GB"/>
-        </w:rPr>
-        <w:t>Quad_vertices</w:t>
-      </w:r>
-      <w:proofErr w:type="spellEnd"/>
-      <w:r>
-        <w:rPr>
-          <w:rFonts w:ascii="Segoe UI"/>
-          <w:lang w:val="en-GB"/>
-        </w:rPr>
-        <w:t xml:space="preserve"> = {</w:t>
+      <w:r>
+        <w:rPr>
+          <w:rFonts w:ascii="Segoe UI"/>
+          <w:lang w:val="en-GB"/>
+        </w:rPr>
+        <w:t>const std::vector&lt;Vertex&gt; Quad_vertices = {</w:t>
       </w:r>
     </w:p>
     <w:p>
@@ -2361,23 +2002,7 @@
           <w:rFonts w:ascii="Segoe UI"/>
           <w:lang w:val="en-GB"/>
         </w:rPr>
-        <w:t xml:space="preserve">    {{-0.5f, -0.5f, 0.5f}, {1.0f, 1.0f, 0.5f</w:t>
-      </w:r>
-      <w:proofErr w:type="gramStart"/>
-      <w:r>
-        <w:rPr>
-          <w:rFonts w:ascii="Segoe UI"/>
-          <w:lang w:val="en-GB"/>
-        </w:rPr>
-        <w:t>} }</w:t>
-      </w:r>
-      <w:proofErr w:type="gramEnd"/>
-      <w:r>
-        <w:rPr>
-          <w:rFonts w:ascii="Segoe UI"/>
-          <w:lang w:val="en-GB"/>
-        </w:rPr>
-        <w:t>, //4</w:t>
+        <w:t xml:space="preserve">    {{-0.5f, -0.5f, 0.5f}, {1.0f, 1.0f, 0.5f} }, //4</w:t>
       </w:r>
     </w:p>
     <w:p>
@@ -2529,23 +2154,7 @@
           <w:rFonts w:ascii="Segoe UI"/>
           <w:lang w:val="en-GB"/>
         </w:rPr>
-        <w:t xml:space="preserve">//first and second </w:t>
-      </w:r>
-      <w:proofErr w:type="spellStart"/>
-      <w:r>
-        <w:rPr>
-          <w:rFonts w:ascii="Segoe UI"/>
-          <w:lang w:val="en-GB"/>
-        </w:rPr>
-        <w:t>trianlge</w:t>
-      </w:r>
-      <w:proofErr w:type="spellEnd"/>
-      <w:r>
-        <w:rPr>
-          <w:rFonts w:ascii="Segoe UI"/>
-          <w:lang w:val="en-GB"/>
-        </w:rPr>
-        <w:t xml:space="preserve"> for square shape</w:t>
+        <w:t>//first and second trianlge for square shape</w:t>
       </w:r>
     </w:p>
     <w:p>
@@ -2576,53 +2185,12 @@
           <w:lang w:val="en-GB"/>
         </w:rPr>
       </w:pPr>
-      <w:proofErr w:type="spellStart"/>
-      <w:r>
-        <w:rPr>
-          <w:rFonts w:ascii="Segoe UI"/>
-          <w:lang w:val="en-GB"/>
-        </w:rPr>
-        <w:t>const</w:t>
-      </w:r>
-      <w:proofErr w:type="spellEnd"/>
-      <w:r>
-        <w:rPr>
-          <w:rFonts w:ascii="Segoe UI"/>
-          <w:lang w:val="en-GB"/>
-        </w:rPr>
-        <w:t xml:space="preserve"> </w:t>
-      </w:r>
-      <w:proofErr w:type="gramStart"/>
-      <w:r>
-        <w:rPr>
-          <w:rFonts w:ascii="Segoe UI"/>
-          <w:lang w:val="en-GB"/>
-        </w:rPr>
-        <w:t>std::</w:t>
-      </w:r>
-      <w:proofErr w:type="gramEnd"/>
-      <w:r>
-        <w:rPr>
-          <w:rFonts w:ascii="Segoe UI"/>
-          <w:lang w:val="en-GB"/>
-        </w:rPr>
-        <w:t xml:space="preserve">vector&lt;uint16_t&gt; </w:t>
-      </w:r>
-      <w:proofErr w:type="spellStart"/>
-      <w:r>
-        <w:rPr>
-          <w:rFonts w:ascii="Segoe UI"/>
-          <w:lang w:val="en-GB"/>
-        </w:rPr>
-        <w:t>Quad_indices</w:t>
-      </w:r>
-      <w:proofErr w:type="spellEnd"/>
-      <w:r>
-        <w:rPr>
-          <w:rFonts w:ascii="Segoe UI"/>
-          <w:lang w:val="en-GB"/>
-        </w:rPr>
-        <w:t xml:space="preserve"> = {</w:t>
+      <w:r>
+        <w:rPr>
+          <w:rFonts w:ascii="Segoe UI"/>
+          <w:lang w:val="en-GB"/>
+        </w:rPr>
+        <w:t>const std::vector&lt;uint16_t&gt; Quad_indices = {</w:t>
       </w:r>
     </w:p>
     <w:p>
@@ -2823,21 +2391,7 @@
         <w:rPr>
           <w:rFonts w:ascii="Segoe UI"/>
         </w:rPr>
-        <w:t xml:space="preserve">Enabling to draw </w:t>
-      </w:r>
-      <w:proofErr w:type="gramStart"/>
-      <w:r>
-        <w:rPr>
-          <w:rFonts w:ascii="Segoe UI"/>
-        </w:rPr>
-        <w:t>cube</w:t>
-      </w:r>
-      <w:proofErr w:type="gramEnd"/>
-      <w:r>
-        <w:rPr>
-          <w:rFonts w:ascii="Segoe UI"/>
-        </w:rPr>
-        <w:t xml:space="preserve"> </w:t>
+        <w:t xml:space="preserve">Enabling to draw cube </w:t>
       </w:r>
     </w:p>
     <w:p>
@@ -2855,75 +2409,7 @@
           <w:rFonts w:ascii="Segoe UI"/>
           <w:lang w:val="en-GB"/>
         </w:rPr>
-        <w:t xml:space="preserve">    </w:t>
-      </w:r>
-      <w:proofErr w:type="spellStart"/>
-      <w:proofErr w:type="gramStart"/>
-      <w:r>
-        <w:rPr>
-          <w:rFonts w:ascii="Segoe UI"/>
-          <w:lang w:val="en-GB"/>
-        </w:rPr>
-        <w:t>vkCmdDrawIndexed</w:t>
-      </w:r>
-      <w:proofErr w:type="spellEnd"/>
-      <w:r>
-        <w:rPr>
-          <w:rFonts w:ascii="Segoe UI"/>
-          <w:lang w:val="en-GB"/>
-        </w:rPr>
-        <w:t>(</w:t>
-      </w:r>
-      <w:proofErr w:type="spellStart"/>
-      <w:proofErr w:type="gramEnd"/>
-      <w:r>
-        <w:rPr>
-          <w:rFonts w:ascii="Segoe UI"/>
-          <w:lang w:val="en-GB"/>
-        </w:rPr>
-        <w:t>commandBuffer</w:t>
-      </w:r>
-      <w:proofErr w:type="spellEnd"/>
-      <w:r>
-        <w:rPr>
-          <w:rFonts w:ascii="Segoe UI"/>
-          <w:lang w:val="en-GB"/>
-        </w:rPr>
-        <w:t xml:space="preserve">, </w:t>
-      </w:r>
-      <w:proofErr w:type="spellStart"/>
-      <w:r>
-        <w:rPr>
-          <w:rFonts w:ascii="Segoe UI"/>
-          <w:lang w:val="en-GB"/>
-        </w:rPr>
-        <w:t>static_cast</w:t>
-      </w:r>
-      <w:proofErr w:type="spellEnd"/>
-      <w:r>
-        <w:rPr>
-          <w:rFonts w:ascii="Segoe UI"/>
-          <w:lang w:val="en-GB"/>
-        </w:rPr>
-        <w:t>&lt;uint32_t&gt;(</w:t>
-      </w:r>
-      <w:proofErr w:type="spellStart"/>
-      <w:proofErr w:type="gramStart"/>
-      <w:r>
-        <w:rPr>
-          <w:rFonts w:ascii="Segoe UI"/>
-          <w:lang w:val="en-GB"/>
-        </w:rPr>
-        <w:t>indices.size</w:t>
-      </w:r>
-      <w:proofErr w:type="spellEnd"/>
-      <w:proofErr w:type="gramEnd"/>
-      <w:r>
-        <w:rPr>
-          <w:rFonts w:ascii="Segoe UI"/>
-          <w:lang w:val="en-GB"/>
-        </w:rPr>
-        <w:t xml:space="preserve">()), 1, 0, 0, 0); //should draw cube now </w:t>
+        <w:t xml:space="preserve">    vkCmdDrawIndexed(commandBuffer, static_cast&lt;uint32_t&gt;(indices.size()), 1, 0, 0, 0); //should draw cube now </w:t>
       </w:r>
     </w:p>
     <w:p>
@@ -2995,7 +2481,19 @@
         <w:rPr>
           <w:rFonts w:ascii="Segoe UI"/>
         </w:rPr>
-        <w:t>, but it will take a while to get used to how different Vulkan works compared to OpenGL.</w:t>
+        <w:t>, but it will take a while to get used to how different Vulkan works compared to OpenGL</w:t>
+      </w:r>
+      <w:r>
+        <w:rPr>
+          <w:rFonts w:ascii="Segoe UI"/>
+        </w:rPr>
+        <w:t>, at least in that drawing stuff seems be a lot more manual</w:t>
+      </w:r>
+      <w:r>
+        <w:rPr>
+          <w:rFonts w:ascii="Segoe UI"/>
+        </w:rPr>
+        <w:t>.</w:t>
       </w:r>
     </w:p>
     <w:p>
@@ -3016,6 +2514,9 @@
     </w:p>
     <w:p>
       <w:r>
+        <w:rPr>
+          <w:noProof/>
+        </w:rPr>
         <w:lastRenderedPageBreak/>
         <w:drawing>
           <wp:inline distT="0" distB="0" distL="0" distR="0" wp14:anchorId="592056C0" wp14:editId="59021425">
@@ -3068,21 +2569,11 @@
           <w:lang w:val="en-GB"/>
         </w:rPr>
       </w:pPr>
-      <w:proofErr w:type="spellStart"/>
-      <w:proofErr w:type="gramStart"/>
-      <w:r>
-        <w:rPr>
-          <w:lang w:val="en-GB"/>
-        </w:rPr>
-        <w:t>rasterizer.polygonMode</w:t>
-      </w:r>
-      <w:proofErr w:type="spellEnd"/>
-      <w:proofErr w:type="gramEnd"/>
-      <w:r>
-        <w:rPr>
-          <w:lang w:val="en-GB"/>
-        </w:rPr>
-        <w:t xml:space="preserve"> = VK_POLYGON_MODE_LINE;</w:t>
+      <w:r>
+        <w:rPr>
+          <w:lang w:val="en-GB"/>
+        </w:rPr>
+        <w:t>rasterizer.polygonMode = VK_POLYGON_MODE_LINE;</w:t>
       </w:r>
     </w:p>
     <w:p/>
@@ -3117,18 +2608,7 @@
           <w:szCs w:val="21"/>
           <w:lang w:val="en-GB"/>
         </w:rPr>
-        <w:t>VK</w:t>
-      </w:r>
-      <w:r>
-        <w:rPr>
-          <w:rFonts w:ascii="Segoe UI" w:eastAsia="Segoe UI" w:hAnsi="Segoe UI" w:cs="Segoe UI"/>
-          <w:b/>
-          <w:bCs/>
-          <w:sz w:val="21"/>
-          <w:szCs w:val="21"/>
-          <w:lang w:val="en-GB"/>
-        </w:rPr>
-        <w:t>_POLYGON_MODE_</w:t>
+        <w:t>VK_POLYGON_MODE_</w:t>
       </w:r>
       <w:r>
         <w:rPr>
@@ -3493,19 +2973,11 @@
           <w:lang w:val="en-GB"/>
         </w:rPr>
       </w:pPr>
-      <w:proofErr w:type="spellStart"/>
-      <w:r>
-        <w:rPr>
-          <w:lang w:val="en-GB"/>
-        </w:rPr>
-        <w:t>inputAssembly.topology</w:t>
-      </w:r>
-      <w:proofErr w:type="spellEnd"/>
-      <w:r>
-        <w:rPr>
-          <w:lang w:val="en-GB"/>
-        </w:rPr>
-        <w:t xml:space="preserve"> = VK_PRIMITIVE_TOPOLOGY_POINT_LIST; // render tris = triangle list, render points = point list</w:t>
+      <w:r>
+        <w:rPr>
+          <w:lang w:val="en-GB"/>
+        </w:rPr>
+        <w:t>inputAssembly.topology = VK_PRIMITIVE_TOPOLOGY_POINT_LIST; // render tris = triangle list, render points = point list</w:t>
       </w:r>
     </w:p>
     <w:p>
@@ -3514,45 +2986,9 @@
       </w:r>
     </w:p>
     <w:p>
-      <w:proofErr w:type="spellStart"/>
-      <w:proofErr w:type="gramStart"/>
-      <w:r>
-        <w:t>vkCmdDraw</w:t>
-      </w:r>
-      <w:proofErr w:type="spellEnd"/>
-      <w:r>
-        <w:t>(</w:t>
-      </w:r>
-      <w:proofErr w:type="spellStart"/>
-      <w:proofErr w:type="gramEnd"/>
-      <w:r>
-        <w:t>commandBuffer</w:t>
-      </w:r>
-      <w:proofErr w:type="spellEnd"/>
-      <w:r>
-        <w:t xml:space="preserve">, 8, 1, 0, </w:t>
-      </w:r>
-      <w:proofErr w:type="gramStart"/>
-      <w:r>
-        <w:t>0 )</w:t>
-      </w:r>
-      <w:proofErr w:type="gramEnd"/>
-      <w:r>
-        <w:t xml:space="preserve">; //should now be able to draw two triangles aka 6 </w:t>
-      </w:r>
-      <w:proofErr w:type="gramStart"/>
-      <w:r>
-        <w:t>vertices,  to</w:t>
-      </w:r>
-      <w:proofErr w:type="gramEnd"/>
-      <w:r>
-        <w:t xml:space="preserve"> render cube draw 8 </w:t>
-      </w:r>
-      <w:proofErr w:type="spellStart"/>
-      <w:r>
-        <w:t>verticies</w:t>
-      </w:r>
-      <w:proofErr w:type="spellEnd"/>
+      <w:r>
+        <w:t>vkCmdDraw(commandBuffer, 8, 1, 0, 0 ); //should now be able to draw two triangles aka 6 vertices,  to render cube draw 8 verticies</w:t>
+      </w:r>
     </w:p>
     <w:p>
       <w:pPr>
@@ -3629,23 +3065,8 @@
         </w:rPr>
         <w:t xml:space="preserve"> and by changing the draw method to be </w:t>
       </w:r>
-      <w:proofErr w:type="spellStart"/>
-      <w:proofErr w:type="gramStart"/>
-      <w:r>
-        <w:t>vkCmdDraw</w:t>
-      </w:r>
-      <w:proofErr w:type="spellEnd"/>
-      <w:r>
-        <w:t>(</w:t>
-      </w:r>
-      <w:proofErr w:type="spellStart"/>
-      <w:proofErr w:type="gramEnd"/>
-      <w:r>
-        <w:t>commandBuffer</w:t>
-      </w:r>
-      <w:proofErr w:type="spellEnd"/>
-      <w:r>
-        <w:t>, 8, 1, 0, 0</w:t>
+      <w:r>
+        <w:t>vkCmdDraw(commandBuffer, 8, 1, 0, 0</w:t>
       </w:r>
       <w:r>
         <w:t xml:space="preserve">) it enables to draw each separate point of the cube instead of the entire object </w:t>
@@ -3654,15 +3075,7 @@
         <w:t xml:space="preserve">like before. </w:t>
       </w:r>
       <w:r>
-        <w:t xml:space="preserve">I don’t believe this could be done in </w:t>
-      </w:r>
-      <w:proofErr w:type="gramStart"/>
-      <w:r>
-        <w:t>OpenGL</w:t>
-      </w:r>
-      <w:proofErr w:type="gramEnd"/>
-      <w:r>
-        <w:t xml:space="preserve"> but I need to check again. </w:t>
+        <w:t xml:space="preserve">I don’t believe this could be done in OpenGL but I need to check again. </w:t>
       </w:r>
     </w:p>
     <w:p>
@@ -3683,6 +3096,9 @@
     </w:p>
     <w:p>
       <w:r>
+        <w:rPr>
+          <w:noProof/>
+        </w:rPr>
         <w:lastRenderedPageBreak/>
         <w:drawing>
           <wp:inline distT="0" distB="0" distL="0" distR="0" wp14:anchorId="6A3D45FE" wp14:editId="6F27B395">
@@ -3744,62 +3160,17 @@
           <w:lang w:val="en-GB"/>
         </w:rPr>
       </w:pPr>
-      <w:proofErr w:type="spellStart"/>
-      <w:r>
-        <w:rPr>
-          <w:rFonts w:ascii="Segoe UI"/>
-          <w:lang w:val="en-GB"/>
-        </w:rPr>
-        <w:t>inputAssembly.topology</w:t>
-      </w:r>
-      <w:proofErr w:type="spellEnd"/>
-      <w:r>
-        <w:rPr>
-          <w:rFonts w:ascii="Segoe UI"/>
-          <w:lang w:val="en-GB"/>
-        </w:rPr>
-        <w:t xml:space="preserve"> = VK_PRIMITIVE_TOPOLOGY_LINE_LIST;</w:t>
-      </w:r>
-    </w:p>
-    <w:p>
-      <w:r>
-        <w:t xml:space="preserve">    </w:t>
-      </w:r>
-      <w:proofErr w:type="spellStart"/>
-      <w:proofErr w:type="gramStart"/>
-      <w:r>
-        <w:t>vkCmdDrawIndexed</w:t>
-      </w:r>
-      <w:proofErr w:type="spellEnd"/>
-      <w:r>
-        <w:t>(</w:t>
-      </w:r>
-      <w:proofErr w:type="spellStart"/>
-      <w:proofErr w:type="gramEnd"/>
-      <w:r>
-        <w:t>commandBuffer</w:t>
-      </w:r>
-      <w:proofErr w:type="spellEnd"/>
-      <w:r>
-        <w:t xml:space="preserve">, </w:t>
-      </w:r>
-      <w:proofErr w:type="spellStart"/>
-      <w:r>
-        <w:t>static_cast</w:t>
-      </w:r>
-      <w:proofErr w:type="spellEnd"/>
-      <w:r>
-        <w:t>&lt;uint32_t&gt;(</w:t>
-      </w:r>
-      <w:proofErr w:type="spellStart"/>
-      <w:proofErr w:type="gramStart"/>
-      <w:r>
-        <w:t>indices.size</w:t>
-      </w:r>
-      <w:proofErr w:type="spellEnd"/>
-      <w:proofErr w:type="gramEnd"/>
-      <w:r>
-        <w:t xml:space="preserve">()), 24, 1, 0, 0); </w:t>
+      <w:r>
+        <w:rPr>
+          <w:rFonts w:ascii="Segoe UI"/>
+          <w:lang w:val="en-GB"/>
+        </w:rPr>
+        <w:t>inputAssembly.topology = VK_PRIMITIVE_TOPOLOGY_LINE_LIST;</w:t>
+      </w:r>
+    </w:p>
+    <w:p>
+      <w:r>
+        <w:t xml:space="preserve">    vkCmdDrawIndexed(commandBuffer, static_cast&lt;uint32_t&gt;(indices.size()), 24, 1, 0, 0); </w:t>
       </w:r>
     </w:p>
     <w:p>
@@ -3842,35 +3213,18 @@
         </w:rPr>
         <w:t xml:space="preserve">the main goal was to draw the cube edges instead of the points/triangles. </w:t>
       </w:r>
-      <w:proofErr w:type="gramStart"/>
-      <w:r>
-        <w:rPr>
-          <w:rFonts w:ascii="Segoe UI"/>
-        </w:rPr>
-        <w:t>In order to</w:t>
-      </w:r>
-      <w:proofErr w:type="gramEnd"/>
-      <w:r>
-        <w:rPr>
-          <w:rFonts w:ascii="Segoe UI"/>
-        </w:rPr>
-        <w:t xml:space="preserve"> do this </w:t>
-      </w:r>
-      <w:proofErr w:type="spellStart"/>
-      <w:r>
-        <w:rPr>
-          <w:rFonts w:ascii="Segoe UI"/>
-          <w:lang w:val="en-GB"/>
-        </w:rPr>
-        <w:t>inputAssembly.topology</w:t>
-      </w:r>
-      <w:proofErr w:type="spellEnd"/>
-      <w:r>
-        <w:rPr>
-          <w:rFonts w:ascii="Segoe UI"/>
-          <w:lang w:val="en-GB"/>
-        </w:rPr>
-        <w:t xml:space="preserve"> = VK_PRIMITIVE_TOPOLOGY_LINE_LIST</w:t>
+      <w:r>
+        <w:rPr>
+          <w:rFonts w:ascii="Segoe UI"/>
+        </w:rPr>
+        <w:t xml:space="preserve">In order to do this </w:t>
+      </w:r>
+      <w:r>
+        <w:rPr>
+          <w:rFonts w:ascii="Segoe UI"/>
+          <w:lang w:val="en-GB"/>
+        </w:rPr>
+        <w:t>inputAssembly.topology = VK_PRIMITIVE_TOPOLOGY_LINE_LIST</w:t>
       </w:r>
       <w:r>
         <w:rPr>
@@ -3879,41 +3233,8 @@
         </w:rPr>
         <w:t xml:space="preserve"> was used and by using that and </w:t>
       </w:r>
-      <w:proofErr w:type="spellStart"/>
-      <w:proofErr w:type="gramStart"/>
-      <w:r>
-        <w:t>vkCmdDrawIndexed</w:t>
-      </w:r>
-      <w:proofErr w:type="spellEnd"/>
-      <w:r>
-        <w:t>(</w:t>
-      </w:r>
-      <w:proofErr w:type="spellStart"/>
-      <w:proofErr w:type="gramEnd"/>
-      <w:r>
-        <w:t>commandBuffer</w:t>
-      </w:r>
-      <w:proofErr w:type="spellEnd"/>
-      <w:r>
-        <w:t xml:space="preserve">, </w:t>
-      </w:r>
-      <w:proofErr w:type="spellStart"/>
-      <w:r>
-        <w:t>static_cast</w:t>
-      </w:r>
-      <w:proofErr w:type="spellEnd"/>
-      <w:r>
-        <w:t>&lt;uint32_t&gt;(</w:t>
-      </w:r>
-      <w:proofErr w:type="spellStart"/>
-      <w:proofErr w:type="gramStart"/>
-      <w:r>
-        <w:t>indices.size</w:t>
-      </w:r>
-      <w:proofErr w:type="spellEnd"/>
-      <w:proofErr w:type="gramEnd"/>
-      <w:r>
-        <w:t>()), 24, 1, 0, 0)</w:t>
+      <w:r>
+        <w:t>vkCmdDrawIndexed(commandBuffer, static_cast&lt;uint32_t&gt;(indices.size()), 24, 1, 0, 0)</w:t>
       </w:r>
       <w:r>
         <w:t xml:space="preserve"> it should render 12 individual lines </w:t>
@@ -3960,6 +3281,9 @@
     </w:p>
     <w:p>
       <w:r>
+        <w:rPr>
+          <w:noProof/>
+        </w:rPr>
         <w:lastRenderedPageBreak/>
         <w:drawing>
           <wp:inline distT="0" distB="0" distL="0" distR="0" wp14:anchorId="3203496C" wp14:editId="14CDBF5F">
@@ -4009,23 +3333,7 @@
     <w:p/>
     <w:p>
       <w:r>
-        <w:t xml:space="preserve">Const </w:t>
-      </w:r>
-      <w:proofErr w:type="gramStart"/>
-      <w:r>
-        <w:t>std::</w:t>
-      </w:r>
-      <w:proofErr w:type="gramEnd"/>
-      <w:r>
-        <w:t xml:space="preserve">vector&lt;uint16_t&gt; </w:t>
-      </w:r>
-      <w:proofErr w:type="spellStart"/>
-      <w:r>
-        <w:t>Quad_indices</w:t>
-      </w:r>
-      <w:proofErr w:type="spellEnd"/>
-      <w:r>
-        <w:t xml:space="preserve"> = </w:t>
+        <w:t xml:space="preserve">Const std::vector&lt;uint16_t&gt; Quad_indices = </w:t>
       </w:r>
       <w:r>
         <w:t>{</w:t>
@@ -4039,15 +3347,7 @@
     </w:p>
     <w:p>
       <w:r>
-        <w:t xml:space="preserve">//0xFFFF tells </w:t>
-      </w:r>
-      <w:proofErr w:type="spellStart"/>
-      <w:r>
-        <w:t>vulkan</w:t>
-      </w:r>
-      <w:proofErr w:type="spellEnd"/>
-      <w:r>
-        <w:t xml:space="preserve"> to stop reading this line and move to the next </w:t>
+        <w:t xml:space="preserve">//0xFFFF tells vulkan to stop reading this line and move to the next </w:t>
       </w:r>
     </w:p>
     <w:p>
@@ -4121,105 +3421,41 @@
           <w:lang w:val="en-GB"/>
         </w:rPr>
       </w:pPr>
-      <w:proofErr w:type="spellStart"/>
-      <w:r>
-        <w:rPr>
-          <w:lang w:val="en-GB"/>
-        </w:rPr>
-        <w:t>inputAssembly.topology</w:t>
-      </w:r>
-      <w:proofErr w:type="spellEnd"/>
-      <w:r>
-        <w:rPr>
-          <w:lang w:val="en-GB"/>
-        </w:rPr>
-        <w:t xml:space="preserve"> = VK_PRIMITIVE_TOPOLOGY_TRIANGLE_STRIP; // render tris = triangle list, render points = point list, render lines = line list</w:t>
-      </w:r>
-    </w:p>
-    <w:p>
-      <w:pPr>
-        <w:rPr>
-          <w:lang w:val="en-GB"/>
-        </w:rPr>
-      </w:pPr>
-      <w:proofErr w:type="spellStart"/>
-      <w:r>
-        <w:rPr>
-          <w:lang w:val="en-GB"/>
-        </w:rPr>
-        <w:t>inputAssembly.primitiveRestartEnable</w:t>
-      </w:r>
-      <w:proofErr w:type="spellEnd"/>
-      <w:r>
-        <w:rPr>
-          <w:lang w:val="en-GB"/>
-        </w:rPr>
-        <w:t xml:space="preserve"> = VK_TRUE; //need to turn this from false to true (relates to 0xFFFF thing)</w:t>
+      <w:r>
+        <w:rPr>
+          <w:lang w:val="en-GB"/>
+        </w:rPr>
+        <w:t>inputAssembly.topology = VK_PRIMITIVE_TOPOLOGY_TRIANGLE_STRIP; // render tris = triangle list, render points = point list, render lines = line list</w:t>
+      </w:r>
+    </w:p>
+    <w:p>
+      <w:pPr>
+        <w:rPr>
+          <w:lang w:val="en-GB"/>
+        </w:rPr>
+      </w:pPr>
+      <w:r>
+        <w:rPr>
+          <w:lang w:val="en-GB"/>
+        </w:rPr>
+        <w:t>inputAssembly.primitiveRestartEnable = VK_TRUE; //need to turn this from false to true (relates to 0xFFFF thing)</w:t>
       </w:r>
       <w:r>
         <w:t xml:space="preserve">    </w:t>
       </w:r>
     </w:p>
     <w:p>
-      <w:proofErr w:type="spellStart"/>
-      <w:proofErr w:type="gramStart"/>
-      <w:r>
-        <w:t>rasterizer.polygonMode</w:t>
-      </w:r>
-      <w:proofErr w:type="spellEnd"/>
-      <w:proofErr w:type="gramEnd"/>
-      <w:r>
-        <w:t xml:space="preserve"> = VK_POLYGON_MODE_FILL; // wireframe mode = line, regular mode = fill</w:t>
-      </w:r>
-    </w:p>
-    <w:p>
-      <w:r>
-        <w:t xml:space="preserve">    </w:t>
-      </w:r>
-      <w:proofErr w:type="spellStart"/>
-      <w:proofErr w:type="gramStart"/>
-      <w:r>
-        <w:t>vkCmdDrawIndexed</w:t>
-      </w:r>
-      <w:proofErr w:type="spellEnd"/>
-      <w:r>
-        <w:t>(</w:t>
-      </w:r>
-      <w:proofErr w:type="spellStart"/>
-      <w:proofErr w:type="gramEnd"/>
-      <w:r>
-        <w:t>commandBuffer</w:t>
-      </w:r>
-      <w:proofErr w:type="spellEnd"/>
-      <w:r>
-        <w:t xml:space="preserve">, </w:t>
-      </w:r>
-      <w:proofErr w:type="spellStart"/>
-      <w:r>
-        <w:t>static_cast</w:t>
-      </w:r>
-      <w:proofErr w:type="spellEnd"/>
-      <w:r>
-        <w:t>&lt;uint32_t&gt;(</w:t>
-      </w:r>
-      <w:proofErr w:type="spellStart"/>
-      <w:proofErr w:type="gramStart"/>
-      <w:r>
-        <w:t>indices.size</w:t>
-      </w:r>
-      <w:proofErr w:type="spellEnd"/>
-      <w:proofErr w:type="gramEnd"/>
-      <w:r>
-        <w:t xml:space="preserve">()), 1, 0, 0, 0); //should draw cube now (uint32), 24 objects (should render 12 lines of cube, only </w:t>
-      </w:r>
-      <w:proofErr w:type="gramStart"/>
+      <w:r>
+        <w:t>rasterizer.polygonMode = VK_POLYGON_MODE_FILL; // wireframe mode = line, regular mode = fill</w:t>
+      </w:r>
+    </w:p>
+    <w:p>
+      <w:r>
+        <w:t xml:space="preserve">    vkCmdDrawIndexed(commandBuffer, static_cast&lt;uint32_t&gt;(indices.size()), 1, 0, 0, 0); //should draw cube now (uint32), 24 objects (should render 12 lines of cube, only </w:t>
+      </w:r>
       <w:r>
         <w:lastRenderedPageBreak/>
-        <w:t>renders</w:t>
-      </w:r>
-      <w:proofErr w:type="gramEnd"/>
-      <w:r>
-        <w:t xml:space="preserve"> 9 lines Task 6 stuff). We're back to rendering cube normally</w:t>
+        <w:t>renders 9 lines Task 6 stuff). We're back to rendering cube normally</w:t>
       </w:r>
     </w:p>
     <w:p>
@@ -4365,21 +3601,7 @@
         <w:rPr>
           <w:lang w:val="en-GB"/>
         </w:rPr>
-        <w:t xml:space="preserve">topology where it treats each </w:t>
-      </w:r>
-      <w:proofErr w:type="spellStart"/>
-      <w:r>
-        <w:rPr>
-          <w:lang w:val="en-GB"/>
-        </w:rPr>
-        <w:t>verticies</w:t>
-      </w:r>
-      <w:proofErr w:type="spellEnd"/>
-      <w:r>
-        <w:rPr>
-          <w:lang w:val="en-GB"/>
-        </w:rPr>
-        <w:t xml:space="preserve"> as a connected line.</w:t>
+        <w:t>topology where it treats each verticies as a connected line.</w:t>
       </w:r>
     </w:p>
     <w:p>
@@ -4426,6 +3648,9 @@
     </w:p>
     <w:p>
       <w:r>
+        <w:rPr>
+          <w:noProof/>
+        </w:rPr>
         <w:drawing>
           <wp:inline distT="0" distB="0" distL="0" distR="0" wp14:anchorId="3F4936C4" wp14:editId="34652B46">
             <wp:extent cx="6567170" cy="3570605"/>
@@ -4482,67 +3707,7 @@
         <w:rPr>
           <w:lang w:val="en-GB"/>
         </w:rPr>
-        <w:t xml:space="preserve"> </w:t>
-      </w:r>
-      <w:proofErr w:type="spellStart"/>
-      <w:proofErr w:type="gramStart"/>
-      <w:r>
-        <w:rPr>
-          <w:lang w:val="en-GB"/>
-        </w:rPr>
-        <w:t>vkCmdDrawIndexed</w:t>
-      </w:r>
-      <w:proofErr w:type="spellEnd"/>
-      <w:r>
-        <w:rPr>
-          <w:lang w:val="en-GB"/>
-        </w:rPr>
-        <w:t>(</w:t>
-      </w:r>
-      <w:proofErr w:type="spellStart"/>
-      <w:proofErr w:type="gramEnd"/>
-      <w:r>
-        <w:rPr>
-          <w:lang w:val="en-GB"/>
-        </w:rPr>
-        <w:t>commandBuffer</w:t>
-      </w:r>
-      <w:proofErr w:type="spellEnd"/>
-      <w:r>
-        <w:rPr>
-          <w:lang w:val="en-GB"/>
-        </w:rPr>
-        <w:t xml:space="preserve">, </w:t>
-      </w:r>
-      <w:proofErr w:type="spellStart"/>
-      <w:r>
-        <w:rPr>
-          <w:lang w:val="en-GB"/>
-        </w:rPr>
-        <w:t>static_cast</w:t>
-      </w:r>
-      <w:proofErr w:type="spellEnd"/>
-      <w:r>
-        <w:rPr>
-          <w:lang w:val="en-GB"/>
-        </w:rPr>
-        <w:t>&lt;uint32_t&gt;(</w:t>
-      </w:r>
-      <w:proofErr w:type="spellStart"/>
-      <w:proofErr w:type="gramStart"/>
-      <w:r>
-        <w:rPr>
-          <w:lang w:val="en-GB"/>
-        </w:rPr>
-        <w:t>indices.size</w:t>
-      </w:r>
-      <w:proofErr w:type="spellEnd"/>
-      <w:proofErr w:type="gramEnd"/>
-      <w:r>
-        <w:rPr>
-          <w:lang w:val="en-GB"/>
-        </w:rPr>
-        <w:t xml:space="preserve">()), 5, 0, 0, 0); </w:t>
+        <w:t xml:space="preserve"> vkCmdDrawIndexed(commandBuffer, static_cast&lt;uint32_t&gt;(indices.size()), 5, 0, 0, 0); </w:t>
       </w:r>
       <w:r>
         <w:rPr>
@@ -4553,11 +3718,9 @@
     </w:p>
     <w:p/>
     <w:p>
-      <w:proofErr w:type="spellStart"/>
       <w:r>
         <w:t>Shader.vert</w:t>
       </w:r>
-      <w:proofErr w:type="spellEnd"/>
     </w:p>
     <w:p>
       <w:r>
@@ -4566,21 +3729,8 @@
     </w:p>
     <w:p/>
     <w:p>
-      <w:proofErr w:type="gramStart"/>
-      <w:r>
-        <w:t>layout(</w:t>
-      </w:r>
-      <w:proofErr w:type="gramEnd"/>
-      <w:r>
-        <w:t xml:space="preserve">binding = 0) uniform </w:t>
-      </w:r>
-      <w:proofErr w:type="spellStart"/>
-      <w:r>
-        <w:t>UniformBufferObject</w:t>
-      </w:r>
-      <w:proofErr w:type="spellEnd"/>
-      <w:r>
-        <w:t xml:space="preserve"> {</w:t>
+      <w:r>
+        <w:t>layout(binding = 0) uniform UniformBufferObject {</w:t>
       </w:r>
     </w:p>
     <w:p>
@@ -4595,230 +3745,63 @@
     </w:p>
     <w:p>
       <w:r>
-        <w:t xml:space="preserve">    mat4 </w:t>
-      </w:r>
-      <w:proofErr w:type="spellStart"/>
-      <w:r>
-        <w:t>proj</w:t>
-      </w:r>
-      <w:proofErr w:type="spellEnd"/>
-      <w:r>
-        <w:t>;</w:t>
-      </w:r>
-    </w:p>
-    <w:p>
-      <w:r>
-        <w:t xml:space="preserve">} </w:t>
-      </w:r>
-      <w:proofErr w:type="spellStart"/>
-      <w:r>
-        <w:t>ubo</w:t>
-      </w:r>
-      <w:proofErr w:type="spellEnd"/>
-      <w:r>
-        <w:t>;</w:t>
+        <w:t xml:space="preserve">    mat4 proj;</w:t>
+      </w:r>
+    </w:p>
+    <w:p>
+      <w:r>
+        <w:t>} ubo;</w:t>
       </w:r>
     </w:p>
     <w:p/>
     <w:p>
-      <w:proofErr w:type="gramStart"/>
-      <w:r>
-        <w:t>layout(</w:t>
-      </w:r>
-      <w:proofErr w:type="gramEnd"/>
-      <w:r>
-        <w:t xml:space="preserve">location = 0) in vec3 </w:t>
-      </w:r>
-      <w:proofErr w:type="spellStart"/>
-      <w:r>
-        <w:t>inPosition</w:t>
-      </w:r>
-      <w:proofErr w:type="spellEnd"/>
-      <w:r>
-        <w:t>;</w:t>
-      </w:r>
-    </w:p>
-    <w:p>
-      <w:proofErr w:type="gramStart"/>
+      <w:r>
+        <w:t>layout(location = 0) in vec3 inPosition;</w:t>
+      </w:r>
+    </w:p>
+    <w:p>
       <w:r>
         <w:lastRenderedPageBreak/>
-        <w:t>layout(</w:t>
-      </w:r>
-      <w:proofErr w:type="gramEnd"/>
-      <w:r>
-        <w:t xml:space="preserve">location = 1) in vec3 </w:t>
-      </w:r>
-      <w:proofErr w:type="spellStart"/>
-      <w:r>
-        <w:t>inColor</w:t>
-      </w:r>
-      <w:proofErr w:type="spellEnd"/>
-      <w:r>
-        <w:t>;</w:t>
+        <w:t>layout(location = 1) in vec3 inColor;</w:t>
       </w:r>
     </w:p>
     <w:p/>
     <w:p>
-      <w:proofErr w:type="gramStart"/>
-      <w:r>
-        <w:t>layout(</w:t>
-      </w:r>
-      <w:proofErr w:type="gramEnd"/>
-      <w:r>
-        <w:t xml:space="preserve">location = 0) out vec3 </w:t>
-      </w:r>
-      <w:proofErr w:type="spellStart"/>
-      <w:r>
-        <w:t>fragColor</w:t>
-      </w:r>
-      <w:proofErr w:type="spellEnd"/>
-      <w:r>
-        <w:t>;</w:t>
+      <w:r>
+        <w:t>layout(location = 0) out vec3 fragColor;</w:t>
       </w:r>
     </w:p>
     <w:p/>
     <w:p>
       <w:r>
-        <w:t xml:space="preserve">void </w:t>
-      </w:r>
-      <w:proofErr w:type="gramStart"/>
-      <w:r>
-        <w:t>main(</w:t>
-      </w:r>
-      <w:proofErr w:type="gramEnd"/>
-      <w:r>
-        <w:t>) {</w:t>
-      </w:r>
-    </w:p>
-    <w:p>
-      <w:r>
-        <w:t xml:space="preserve">    vec3 offset = vec3(</w:t>
-      </w:r>
-      <w:proofErr w:type="spellStart"/>
-      <w:r>
-        <w:t>gl_InstanceIndex</w:t>
-      </w:r>
-      <w:proofErr w:type="spellEnd"/>
-      <w:r>
-        <w:t xml:space="preserve"> * 1.5 - 3.0, 0.0, 0.0);</w:t>
+        <w:t>void main() {</w:t>
+      </w:r>
+    </w:p>
+    <w:p>
+      <w:r>
+        <w:t xml:space="preserve">    vec3 offset = vec3(gl_InstanceIndex * 1.5 - 3.0, 0.0, 0.0);</w:t>
       </w:r>
     </w:p>
     <w:p/>
     <w:p>
       <w:r>
-        <w:t xml:space="preserve">    vec4 </w:t>
-      </w:r>
-      <w:proofErr w:type="spellStart"/>
-      <w:r>
-        <w:t>worldPosition</w:t>
-      </w:r>
-      <w:proofErr w:type="spellEnd"/>
-      <w:r>
-        <w:t xml:space="preserve"> = </w:t>
-      </w:r>
-      <w:proofErr w:type="spellStart"/>
-      <w:proofErr w:type="gramStart"/>
-      <w:r>
-        <w:t>ubo.model</w:t>
-      </w:r>
-      <w:proofErr w:type="spellEnd"/>
-      <w:proofErr w:type="gramEnd"/>
-      <w:r>
-        <w:t xml:space="preserve"> * vec4(</w:t>
-      </w:r>
-      <w:proofErr w:type="spellStart"/>
-      <w:r>
-        <w:t>inPosition</w:t>
-      </w:r>
-      <w:proofErr w:type="spellEnd"/>
-      <w:r>
-        <w:t>, 1.0);</w:t>
-      </w:r>
-    </w:p>
-    <w:p>
-      <w:r>
-        <w:t xml:space="preserve">    </w:t>
-      </w:r>
-      <w:proofErr w:type="spellStart"/>
-      <w:r>
-        <w:t>worldPosition.xyz</w:t>
-      </w:r>
-      <w:proofErr w:type="spellEnd"/>
-      <w:r>
-        <w:t xml:space="preserve"> += offset;</w:t>
+        <w:t xml:space="preserve">    vec4 worldPosition = ubo.model * vec4(inPosition, 1.0);</w:t>
+      </w:r>
+    </w:p>
+    <w:p>
+      <w:r>
+        <w:t xml:space="preserve">    worldPosition.xyz += offset;</w:t>
       </w:r>
     </w:p>
     <w:p/>
     <w:p>
       <w:r>
-        <w:t xml:space="preserve">    </w:t>
-      </w:r>
-      <w:proofErr w:type="spellStart"/>
-      <w:r>
-        <w:t>gl_Position</w:t>
-      </w:r>
-      <w:proofErr w:type="spellEnd"/>
-      <w:r>
-        <w:t xml:space="preserve"> = </w:t>
-      </w:r>
-      <w:proofErr w:type="spellStart"/>
-      <w:proofErr w:type="gramStart"/>
-      <w:r>
-        <w:t>ubo.proj</w:t>
-      </w:r>
-      <w:proofErr w:type="spellEnd"/>
-      <w:proofErr w:type="gramEnd"/>
-      <w:r>
-        <w:t xml:space="preserve"> * </w:t>
-      </w:r>
-      <w:proofErr w:type="spellStart"/>
-      <w:proofErr w:type="gramStart"/>
-      <w:r>
-        <w:t>ubo.view</w:t>
-      </w:r>
-      <w:proofErr w:type="spellEnd"/>
-      <w:proofErr w:type="gramEnd"/>
-      <w:r>
-        <w:t xml:space="preserve"> * </w:t>
-      </w:r>
-      <w:proofErr w:type="spellStart"/>
-      <w:proofErr w:type="gramStart"/>
-      <w:r>
-        <w:t>ubo.model</w:t>
-      </w:r>
-      <w:proofErr w:type="spellEnd"/>
-      <w:proofErr w:type="gramEnd"/>
-      <w:r>
-        <w:t xml:space="preserve"> * </w:t>
-      </w:r>
-      <w:proofErr w:type="spellStart"/>
-      <w:r>
-        <w:t>worldPosition</w:t>
-      </w:r>
-      <w:proofErr w:type="spellEnd"/>
-      <w:r>
-        <w:t>;</w:t>
-      </w:r>
-    </w:p>
-    <w:p>
-      <w:r>
-        <w:t xml:space="preserve">    </w:t>
-      </w:r>
-      <w:proofErr w:type="spellStart"/>
-      <w:r>
-        <w:t>fragColor</w:t>
-      </w:r>
-      <w:proofErr w:type="spellEnd"/>
-      <w:r>
-        <w:t xml:space="preserve"> = </w:t>
-      </w:r>
-      <w:proofErr w:type="spellStart"/>
-      <w:r>
-        <w:t>inColor</w:t>
-      </w:r>
-      <w:proofErr w:type="spellEnd"/>
-      <w:r>
-        <w:t>;</w:t>
+        <w:t xml:space="preserve">    gl_Position = ubo.proj * ubo.view * ubo.model * worldPosition;</w:t>
+      </w:r>
+    </w:p>
+    <w:p>
+      <w:r>
+        <w:t xml:space="preserve">    fragColor = inColor;</w:t>
       </w:r>
     </w:p>
     <w:p>
@@ -4875,27 +3858,13 @@
         <w:rPr>
           <w:rFonts w:ascii="Segoe UI"/>
         </w:rPr>
-        <w:t xml:space="preserve"> do this the </w:t>
-      </w:r>
-      <w:proofErr w:type="spellStart"/>
-      <w:r>
-        <w:rPr>
-          <w:rFonts w:ascii="Segoe UI"/>
-        </w:rPr>
-        <w:t>vkcmdDraw</w:t>
-      </w:r>
-      <w:r>
-        <w:rPr>
-          <w:rFonts w:ascii="Segoe UI"/>
-        </w:rPr>
-        <w:t>Index</w:t>
-      </w:r>
-      <w:proofErr w:type="spellEnd"/>
-      <w:r>
-        <w:rPr>
-          <w:rFonts w:ascii="Segoe UI"/>
-        </w:rPr>
-        <w:t xml:space="preserve"> we draw for example 5 instances of one cube and then in the shader code we modify it so each of these cubes have a unique position. </w:t>
+        <w:t xml:space="preserve"> do this the vkcmdDraw</w:t>
+      </w:r>
+      <w:r>
+        <w:rPr>
+          <w:rFonts w:ascii="Segoe UI"/>
+        </w:rPr>
+        <w:t xml:space="preserve">Index we draw for example 5 instances of one cube and then in the shader code we modify it so each of these cubes have a unique position. </w:t>
       </w:r>
       <w:r>
         <w:rPr>
@@ -5000,6 +3969,9 @@
     </w:p>
     <w:p>
       <w:r>
+        <w:rPr>
+          <w:noProof/>
+        </w:rPr>
         <w:lastRenderedPageBreak/>
         <w:drawing>
           <wp:inline distT="0" distB="0" distL="0" distR="0" wp14:anchorId="0B6C25B1" wp14:editId="535052C3">
@@ -5048,116 +4020,22 @@
     </w:p>
     <w:p>
       <w:r>
-        <w:t xml:space="preserve">struct </w:t>
-      </w:r>
-      <w:proofErr w:type="spellStart"/>
-      <w:r>
-        <w:t>UniformBufferObject</w:t>
-      </w:r>
-      <w:proofErr w:type="spellEnd"/>
-      <w:r>
-        <w:t xml:space="preserve"> {</w:t>
-      </w:r>
-    </w:p>
-    <w:p>
-      <w:r>
-        <w:t xml:space="preserve">    //</w:t>
-      </w:r>
-      <w:proofErr w:type="spellStart"/>
-      <w:proofErr w:type="gramStart"/>
-      <w:r>
-        <w:t>alignas</w:t>
-      </w:r>
-      <w:proofErr w:type="spellEnd"/>
-      <w:r>
-        <w:t>(</w:t>
-      </w:r>
-      <w:proofErr w:type="gramEnd"/>
-      <w:r>
-        <w:t xml:space="preserve">16) </w:t>
-      </w:r>
-      <w:proofErr w:type="spellStart"/>
-      <w:proofErr w:type="gramStart"/>
-      <w:r>
-        <w:t>glm</w:t>
-      </w:r>
-      <w:proofErr w:type="spellEnd"/>
-      <w:r>
-        <w:t>::</w:t>
-      </w:r>
-      <w:proofErr w:type="gramEnd"/>
-      <w:r>
-        <w:t>mat4 model;</w:t>
-      </w:r>
-    </w:p>
-    <w:p>
-      <w:r>
-        <w:t xml:space="preserve">    </w:t>
-      </w:r>
-      <w:proofErr w:type="spellStart"/>
-      <w:proofErr w:type="gramStart"/>
-      <w:r>
-        <w:t>alignas</w:t>
-      </w:r>
-      <w:proofErr w:type="spellEnd"/>
-      <w:r>
-        <w:t>(</w:t>
-      </w:r>
-      <w:proofErr w:type="gramEnd"/>
-      <w:r>
-        <w:t xml:space="preserve">16) </w:t>
-      </w:r>
-      <w:proofErr w:type="spellStart"/>
-      <w:proofErr w:type="gramStart"/>
-      <w:r>
-        <w:t>glm</w:t>
-      </w:r>
-      <w:proofErr w:type="spellEnd"/>
-      <w:r>
-        <w:t>::</w:t>
-      </w:r>
-      <w:proofErr w:type="gramEnd"/>
-      <w:r>
-        <w:t>mat4 view;</w:t>
-      </w:r>
-    </w:p>
-    <w:p>
-      <w:r>
-        <w:t xml:space="preserve">    </w:t>
-      </w:r>
-      <w:proofErr w:type="spellStart"/>
-      <w:proofErr w:type="gramStart"/>
-      <w:r>
-        <w:t>alignas</w:t>
-      </w:r>
-      <w:proofErr w:type="spellEnd"/>
-      <w:r>
-        <w:t>(</w:t>
-      </w:r>
-      <w:proofErr w:type="gramEnd"/>
-      <w:r>
-        <w:t xml:space="preserve">16) </w:t>
-      </w:r>
-      <w:proofErr w:type="spellStart"/>
-      <w:proofErr w:type="gramStart"/>
-      <w:r>
-        <w:t>glm</w:t>
-      </w:r>
-      <w:proofErr w:type="spellEnd"/>
-      <w:r>
-        <w:t>::</w:t>
-      </w:r>
-      <w:proofErr w:type="gramEnd"/>
-      <w:r>
-        <w:t xml:space="preserve">mat4 </w:t>
-      </w:r>
-      <w:proofErr w:type="spellStart"/>
-      <w:r>
-        <w:t>proj</w:t>
-      </w:r>
-      <w:proofErr w:type="spellEnd"/>
-      <w:r>
-        <w:t>;</w:t>
+        <w:t>struct UniformBufferObject {</w:t>
+      </w:r>
+    </w:p>
+    <w:p>
+      <w:r>
+        <w:t xml:space="preserve">    //alignas(16) glm::mat4 model;</w:t>
+      </w:r>
+    </w:p>
+    <w:p>
+      <w:r>
+        <w:t xml:space="preserve">    alignas(16) glm::mat4 view;</w:t>
+      </w:r>
+    </w:p>
+    <w:p>
+      <w:r>
+        <w:t xml:space="preserve">    alignas(16) glm::mat4 proj;</w:t>
       </w:r>
     </w:p>
     <w:p>
@@ -5172,33 +4050,12 @@
     </w:p>
     <w:p>
       <w:r>
-        <w:t xml:space="preserve">struct </w:t>
-      </w:r>
-      <w:proofErr w:type="spellStart"/>
-      <w:r>
-        <w:t>ModelPushConstant</w:t>
-      </w:r>
-      <w:proofErr w:type="spellEnd"/>
-      <w:r>
-        <w:t xml:space="preserve"> {</w:t>
-      </w:r>
-    </w:p>
-    <w:p>
-      <w:r>
-        <w:t xml:space="preserve">    </w:t>
-      </w:r>
-      <w:proofErr w:type="spellStart"/>
-      <w:proofErr w:type="gramStart"/>
-      <w:r>
-        <w:t>glm</w:t>
-      </w:r>
-      <w:proofErr w:type="spellEnd"/>
-      <w:r>
-        <w:t>::</w:t>
-      </w:r>
-      <w:proofErr w:type="gramEnd"/>
-      <w:r>
-        <w:t>mat4 model;</w:t>
+        <w:t>struct ModelPushConstant {</w:t>
+      </w:r>
+    </w:p>
+    <w:p>
+      <w:r>
+        <w:t xml:space="preserve">    glm::mat4 model;</w:t>
       </w:r>
     </w:p>
     <w:p>
@@ -5231,42 +4088,7 @@
           <w:lang w:val="en-GB"/>
         </w:rPr>
         <w:tab/>
-      </w:r>
-      <w:proofErr w:type="spellStart"/>
-      <w:r>
-        <w:rPr>
-          <w:lang w:val="en-GB"/>
-        </w:rPr>
-        <w:t>VkPushConstantRange</w:t>
-      </w:r>
-      <w:proofErr w:type="spellEnd"/>
-      <w:r>
-        <w:rPr>
-          <w:lang w:val="en-GB"/>
-        </w:rPr>
-        <w:t xml:space="preserve"> </w:t>
-      </w:r>
-      <w:proofErr w:type="spellStart"/>
-      <w:proofErr w:type="gramStart"/>
-      <w:r>
-        <w:rPr>
-          <w:lang w:val="en-GB"/>
-        </w:rPr>
-        <w:t>pushConstantRange</w:t>
-      </w:r>
-      <w:proofErr w:type="spellEnd"/>
-      <w:r>
-        <w:rPr>
-          <w:lang w:val="en-GB"/>
-        </w:rPr>
-        <w:t>{</w:t>
-      </w:r>
-      <w:proofErr w:type="gramEnd"/>
-      <w:r>
-        <w:rPr>
-          <w:lang w:val="en-GB"/>
-        </w:rPr>
-        <w:t>};</w:t>
+        <w:t>VkPushConstantRange pushConstantRange{};</w:t>
       </w:r>
     </w:p>
     <w:p>
@@ -5280,20 +4102,7 @@
           <w:lang w:val="en-GB"/>
         </w:rPr>
         <w:tab/>
-      </w:r>
-      <w:proofErr w:type="spellStart"/>
-      <w:r>
-        <w:rPr>
-          <w:lang w:val="en-GB"/>
-        </w:rPr>
-        <w:t>pushConstantRange.stageFlags</w:t>
-      </w:r>
-      <w:proofErr w:type="spellEnd"/>
-      <w:r>
-        <w:rPr>
-          <w:lang w:val="en-GB"/>
-        </w:rPr>
-        <w:t xml:space="preserve"> = VK_SHADER_STAGE_VERTEX_BIT;</w:t>
+        <w:t>pushConstantRange.stageFlags = VK_SHADER_STAGE_VERTEX_BIT;</w:t>
       </w:r>
     </w:p>
     <w:p>
@@ -5307,20 +4116,7 @@
           <w:lang w:val="en-GB"/>
         </w:rPr>
         <w:tab/>
-      </w:r>
-      <w:proofErr w:type="spellStart"/>
-      <w:r>
-        <w:rPr>
-          <w:lang w:val="en-GB"/>
-        </w:rPr>
-        <w:t>pushConstantRange.offset</w:t>
-      </w:r>
-      <w:proofErr w:type="spellEnd"/>
-      <w:r>
-        <w:rPr>
-          <w:lang w:val="en-GB"/>
-        </w:rPr>
-        <w:t xml:space="preserve"> = 0;</w:t>
+        <w:t>pushConstantRange.offset = 0;</w:t>
       </w:r>
     </w:p>
     <w:p>
@@ -5334,50 +4130,7 @@
           <w:lang w:val="en-GB"/>
         </w:rPr>
         <w:tab/>
-      </w:r>
-      <w:proofErr w:type="spellStart"/>
-      <w:r>
-        <w:rPr>
-          <w:lang w:val="en-GB"/>
-        </w:rPr>
-        <w:t>pushConstantRange.size</w:t>
-      </w:r>
-      <w:proofErr w:type="spellEnd"/>
-      <w:r>
-        <w:rPr>
-          <w:lang w:val="en-GB"/>
-        </w:rPr>
-        <w:t xml:space="preserve"> = </w:t>
-      </w:r>
-      <w:proofErr w:type="spellStart"/>
-      <w:proofErr w:type="gramStart"/>
-      <w:r>
-        <w:rPr>
-          <w:lang w:val="en-GB"/>
-        </w:rPr>
-        <w:t>sizeof</w:t>
-      </w:r>
-      <w:proofErr w:type="spellEnd"/>
-      <w:r>
-        <w:rPr>
-          <w:lang w:val="en-GB"/>
-        </w:rPr>
-        <w:t>(</w:t>
-      </w:r>
-      <w:proofErr w:type="spellStart"/>
-      <w:proofErr w:type="gramEnd"/>
-      <w:r>
-        <w:rPr>
-          <w:lang w:val="en-GB"/>
-        </w:rPr>
-        <w:t>ModelPushConstant</w:t>
-      </w:r>
-      <w:proofErr w:type="spellEnd"/>
-      <w:r>
-        <w:rPr>
-          <w:lang w:val="en-GB"/>
-        </w:rPr>
-        <w:t>);</w:t>
+        <w:t>pushConstantRange.size = sizeof(ModelPushConstant);</w:t>
       </w:r>
     </w:p>
     <w:p/>
@@ -5393,251 +4146,29 @@
     </w:p>
     <w:p>
       <w:r>
-        <w:t xml:space="preserve"> </w:t>
-      </w:r>
-      <w:proofErr w:type="spellStart"/>
-      <w:r>
-        <w:t>ModelPushConstant</w:t>
-      </w:r>
-      <w:proofErr w:type="spellEnd"/>
-      <w:r>
-        <w:t xml:space="preserve"> </w:t>
-      </w:r>
-      <w:proofErr w:type="spellStart"/>
-      <w:proofErr w:type="gramStart"/>
-      <w:r>
-        <w:t>pushUBO</w:t>
-      </w:r>
-      <w:proofErr w:type="spellEnd"/>
-      <w:r>
-        <w:t>{</w:t>
-      </w:r>
-      <w:proofErr w:type="gramEnd"/>
-      <w:r>
-        <w:t>};</w:t>
-      </w:r>
-    </w:p>
-    <w:p>
-      <w:r>
-        <w:t xml:space="preserve"> </w:t>
-      </w:r>
-      <w:proofErr w:type="spellStart"/>
-      <w:r>
-        <w:t>pushUBO.model</w:t>
-      </w:r>
-      <w:proofErr w:type="spellEnd"/>
-      <w:r>
-        <w:t xml:space="preserve"> = </w:t>
-      </w:r>
-      <w:proofErr w:type="spellStart"/>
-      <w:proofErr w:type="gramStart"/>
-      <w:r>
-        <w:t>glm</w:t>
-      </w:r>
-      <w:proofErr w:type="spellEnd"/>
-      <w:r>
-        <w:t>::translate(</w:t>
-      </w:r>
-      <w:proofErr w:type="spellStart"/>
-      <w:r>
-        <w:t>glm</w:t>
-      </w:r>
-      <w:proofErr w:type="spellEnd"/>
-      <w:r>
-        <w:t>::</w:t>
-      </w:r>
-      <w:proofErr w:type="gramEnd"/>
-      <w:r>
-        <w:t xml:space="preserve">mat4(1.0f), </w:t>
-      </w:r>
-      <w:proofErr w:type="spellStart"/>
-      <w:proofErr w:type="gramStart"/>
-      <w:r>
-        <w:t>glm</w:t>
-      </w:r>
-      <w:proofErr w:type="spellEnd"/>
-      <w:r>
-        <w:t>::</w:t>
-      </w:r>
-      <w:proofErr w:type="gramEnd"/>
-      <w:r>
-        <w:t>vec3(-1.0f, 0.0f, 0.0</w:t>
-      </w:r>
-      <w:proofErr w:type="gramStart"/>
-      <w:r>
-        <w:t>f))</w:t>
-      </w:r>
-      <w:proofErr w:type="gramEnd"/>
-      <w:r>
-        <w:t>;</w:t>
-      </w:r>
-    </w:p>
-    <w:p>
-      <w:r>
-        <w:t xml:space="preserve"> </w:t>
-      </w:r>
-      <w:proofErr w:type="spellStart"/>
-      <w:proofErr w:type="gramStart"/>
-      <w:r>
-        <w:t>vkCmdPushConstants</w:t>
-      </w:r>
-      <w:proofErr w:type="spellEnd"/>
-      <w:r>
-        <w:t>(</w:t>
-      </w:r>
-      <w:proofErr w:type="spellStart"/>
-      <w:proofErr w:type="gramEnd"/>
-      <w:r>
-        <w:t>commandBuffer</w:t>
-      </w:r>
-      <w:proofErr w:type="spellEnd"/>
-      <w:r>
-        <w:t xml:space="preserve">, </w:t>
-      </w:r>
-      <w:proofErr w:type="spellStart"/>
-      <w:r>
-        <w:t>pipelineLayout</w:t>
-      </w:r>
-      <w:proofErr w:type="spellEnd"/>
-      <w:r>
-        <w:t xml:space="preserve">, VK_SHADER_STAGE_VERTEX_BIT, 0, </w:t>
-      </w:r>
-      <w:proofErr w:type="spellStart"/>
-      <w:proofErr w:type="gramStart"/>
-      <w:r>
-        <w:t>sizeof</w:t>
-      </w:r>
-      <w:proofErr w:type="spellEnd"/>
-      <w:r>
-        <w:t>(</w:t>
-      </w:r>
-      <w:proofErr w:type="spellStart"/>
-      <w:proofErr w:type="gramEnd"/>
-      <w:r>
-        <w:t>ModelPushConstant</w:t>
-      </w:r>
-      <w:proofErr w:type="spellEnd"/>
-      <w:r>
-        <w:t>), &amp;</w:t>
-      </w:r>
-      <w:proofErr w:type="spellStart"/>
-      <w:r>
-        <w:t>pushUBO</w:t>
-      </w:r>
-      <w:proofErr w:type="spellEnd"/>
-      <w:r>
-        <w:t>);</w:t>
+        <w:t xml:space="preserve"> ModelPushConstant pushUBO{};</w:t>
+      </w:r>
+    </w:p>
+    <w:p>
+      <w:r>
+        <w:t xml:space="preserve"> pushUBO.model = glm::translate(glm::mat4(1.0f), glm::vec3(-1.0f, 0.0f, 0.0f));</w:t>
+      </w:r>
+    </w:p>
+    <w:p>
+      <w:r>
+        <w:t xml:space="preserve"> vkCmdPushConstants(commandBuffer, pipelineLayout, VK_SHADER_STAGE_VERTEX_BIT, 0, sizeof(ModelPushConstant), &amp;pushUBO);</w:t>
       </w:r>
     </w:p>
     <w:p/>
     <w:p>
       <w:r>
-        <w:t xml:space="preserve"> //</w:t>
-      </w:r>
-      <w:proofErr w:type="spellStart"/>
-      <w:proofErr w:type="gramStart"/>
-      <w:r>
-        <w:t>vkCmdDraw</w:t>
-      </w:r>
-      <w:proofErr w:type="spellEnd"/>
-      <w:r>
-        <w:t>(</w:t>
-      </w:r>
-      <w:proofErr w:type="spellStart"/>
-      <w:proofErr w:type="gramEnd"/>
-      <w:r>
-        <w:t>commandBuffer</w:t>
-      </w:r>
-      <w:proofErr w:type="spellEnd"/>
-      <w:r>
-        <w:t xml:space="preserve">, 8, 1, 0, </w:t>
-      </w:r>
-      <w:proofErr w:type="gramStart"/>
-      <w:r>
-        <w:t>0 )</w:t>
-      </w:r>
-      <w:proofErr w:type="gramEnd"/>
-      <w:r>
-        <w:t xml:space="preserve">; //should now be able to draw two triangles aka 6 </w:t>
-      </w:r>
-      <w:proofErr w:type="gramStart"/>
-      <w:r>
-        <w:t>vertices,  to</w:t>
-      </w:r>
-      <w:proofErr w:type="gramEnd"/>
-      <w:r>
-        <w:t xml:space="preserve"> render cube draw 8 </w:t>
-      </w:r>
-      <w:proofErr w:type="spellStart"/>
-      <w:r>
-        <w:t>verticies</w:t>
-      </w:r>
-      <w:proofErr w:type="spellEnd"/>
+        <w:t xml:space="preserve"> //vkCmdDraw(commandBuffer, 8, 1, 0, 0 ); //should now be able to draw two triangles aka 6 vertices,  to render cube draw 8 verticies</w:t>
+      </w:r>
     </w:p>
     <w:p>
       <w:r>
         <w:lastRenderedPageBreak/>
-        <w:t xml:space="preserve"> </w:t>
-      </w:r>
-      <w:proofErr w:type="spellStart"/>
-      <w:proofErr w:type="gramStart"/>
-      <w:r>
-        <w:t>vkCmdDrawIndexed</w:t>
-      </w:r>
-      <w:proofErr w:type="spellEnd"/>
-      <w:r>
-        <w:t>(</w:t>
-      </w:r>
-      <w:proofErr w:type="spellStart"/>
-      <w:proofErr w:type="gramEnd"/>
-      <w:r>
-        <w:t>commandBuffer</w:t>
-      </w:r>
-      <w:proofErr w:type="spellEnd"/>
-      <w:r>
-        <w:t xml:space="preserve">, </w:t>
-      </w:r>
-      <w:proofErr w:type="spellStart"/>
-      <w:r>
-        <w:t>static_cast</w:t>
-      </w:r>
-      <w:proofErr w:type="spellEnd"/>
-      <w:r>
-        <w:t>&lt;uint32_t&gt;(</w:t>
-      </w:r>
-      <w:proofErr w:type="spellStart"/>
-      <w:proofErr w:type="gramStart"/>
-      <w:r>
-        <w:t>indices.size</w:t>
-      </w:r>
-      <w:proofErr w:type="spellEnd"/>
-      <w:proofErr w:type="gramEnd"/>
-      <w:r>
-        <w:t xml:space="preserve">()), 1, 0, 0, 0); //should draw cube now (uint32), 24 objects (should render 12 lines of cube, only </w:t>
-      </w:r>
-      <w:proofErr w:type="gramStart"/>
-      <w:r>
-        <w:t>renders</w:t>
-      </w:r>
-      <w:proofErr w:type="gramEnd"/>
-      <w:r>
-        <w:t xml:space="preserve"> 9 lines Task 6 stuff). We're back to rendering </w:t>
-      </w:r>
-      <w:proofErr w:type="gramStart"/>
-      <w:r>
-        <w:t>cube</w:t>
-      </w:r>
-      <w:proofErr w:type="gramEnd"/>
-      <w:r>
-        <w:t xml:space="preserve"> normally, </w:t>
-      </w:r>
-      <w:proofErr w:type="gramStart"/>
-      <w:r>
-        <w:t>renders</w:t>
-      </w:r>
-      <w:proofErr w:type="gramEnd"/>
-      <w:r>
-        <w:t xml:space="preserve"> 5 cubes now</w:t>
+        <w:t xml:space="preserve"> vkCmdDrawIndexed(commandBuffer, static_cast&lt;uint32_t&gt;(indices.size()), 1, 0, 0, 0); //should draw cube now (uint32), 24 objects (should render 12 lines of cube, only renders 9 lines Task 6 stuff). We're back to rendering cube normally, renders 5 cubes now</w:t>
       </w:r>
     </w:p>
     <w:p>
@@ -5653,182 +4184,24 @@
     </w:p>
     <w:p>
       <w:r>
-        <w:t xml:space="preserve"> </w:t>
-      </w:r>
-      <w:proofErr w:type="spellStart"/>
-      <w:r>
-        <w:t>pushUBO.model</w:t>
-      </w:r>
-      <w:proofErr w:type="spellEnd"/>
-      <w:r>
-        <w:t xml:space="preserve"> = </w:t>
-      </w:r>
-      <w:proofErr w:type="spellStart"/>
-      <w:proofErr w:type="gramStart"/>
-      <w:r>
-        <w:t>glm</w:t>
-      </w:r>
-      <w:proofErr w:type="spellEnd"/>
-      <w:r>
-        <w:t>::translate(</w:t>
-      </w:r>
-      <w:proofErr w:type="spellStart"/>
-      <w:r>
-        <w:t>glm</w:t>
-      </w:r>
-      <w:proofErr w:type="spellEnd"/>
-      <w:r>
-        <w:t>::</w:t>
-      </w:r>
-      <w:proofErr w:type="gramEnd"/>
-      <w:r>
-        <w:t xml:space="preserve">mat4(1.0f), </w:t>
-      </w:r>
-      <w:proofErr w:type="spellStart"/>
-      <w:proofErr w:type="gramStart"/>
-      <w:r>
-        <w:t>glm</w:t>
-      </w:r>
-      <w:proofErr w:type="spellEnd"/>
-      <w:r>
-        <w:t>::</w:t>
-      </w:r>
-      <w:proofErr w:type="gramEnd"/>
-      <w:r>
-        <w:t>vec3(1.0f, 0.0f, 0.0f));</w:t>
-      </w:r>
-    </w:p>
-    <w:p>
-      <w:r>
-        <w:t xml:space="preserve"> </w:t>
-      </w:r>
-      <w:proofErr w:type="spellStart"/>
-      <w:proofErr w:type="gramStart"/>
-      <w:r>
-        <w:t>vkCmdPushConstants</w:t>
-      </w:r>
-      <w:proofErr w:type="spellEnd"/>
-      <w:r>
-        <w:t>(</w:t>
-      </w:r>
-      <w:proofErr w:type="spellStart"/>
-      <w:proofErr w:type="gramEnd"/>
-      <w:r>
-        <w:t>commandBuffer</w:t>
-      </w:r>
-      <w:proofErr w:type="spellEnd"/>
-      <w:r>
-        <w:t xml:space="preserve">, </w:t>
-      </w:r>
-      <w:proofErr w:type="spellStart"/>
-      <w:r>
-        <w:t>pipelineLayout</w:t>
-      </w:r>
-      <w:proofErr w:type="spellEnd"/>
-      <w:r>
-        <w:t xml:space="preserve">, VK_SHADER_STAGE_VERTEX_BIT, 0, </w:t>
-      </w:r>
-      <w:proofErr w:type="spellStart"/>
-      <w:proofErr w:type="gramStart"/>
-      <w:r>
-        <w:t>sizeof</w:t>
-      </w:r>
-      <w:proofErr w:type="spellEnd"/>
-      <w:r>
-        <w:t>(</w:t>
-      </w:r>
-      <w:proofErr w:type="spellStart"/>
-      <w:proofErr w:type="gramEnd"/>
-      <w:r>
-        <w:t>ModelPushConstant</w:t>
-      </w:r>
-      <w:proofErr w:type="spellEnd"/>
-      <w:r>
-        <w:t>), &amp;</w:t>
-      </w:r>
-      <w:proofErr w:type="spellStart"/>
-      <w:r>
-        <w:t>pushUBO</w:t>
-      </w:r>
-      <w:proofErr w:type="spellEnd"/>
-      <w:r>
-        <w:t>);</w:t>
-      </w:r>
-    </w:p>
-    <w:p>
-      <w:r>
-        <w:t xml:space="preserve"> </w:t>
-      </w:r>
-      <w:proofErr w:type="spellStart"/>
-      <w:proofErr w:type="gramStart"/>
-      <w:r>
-        <w:t>vkCmdDrawIndexed</w:t>
-      </w:r>
-      <w:proofErr w:type="spellEnd"/>
-      <w:r>
-        <w:t>(</w:t>
-      </w:r>
-      <w:proofErr w:type="spellStart"/>
-      <w:proofErr w:type="gramEnd"/>
-      <w:r>
-        <w:t>commandBuffer</w:t>
-      </w:r>
-      <w:proofErr w:type="spellEnd"/>
-      <w:r>
-        <w:t xml:space="preserve">, </w:t>
-      </w:r>
-      <w:proofErr w:type="spellStart"/>
-      <w:r>
-        <w:t>static_cast</w:t>
-      </w:r>
-      <w:proofErr w:type="spellEnd"/>
-      <w:r>
-        <w:t>&lt;uint32_t&gt;(</w:t>
-      </w:r>
-      <w:proofErr w:type="spellStart"/>
-      <w:proofErr w:type="gramStart"/>
-      <w:r>
-        <w:t>indices.size</w:t>
-      </w:r>
-      <w:proofErr w:type="spellEnd"/>
-      <w:proofErr w:type="gramEnd"/>
-      <w:r>
-        <w:t xml:space="preserve">()), 1, 0, 0, 0); //should draw cube now (uint32), 24 objects (should render 12 lines of cube, only </w:t>
-      </w:r>
-      <w:proofErr w:type="gramStart"/>
-      <w:r>
-        <w:t>renders</w:t>
-      </w:r>
-      <w:proofErr w:type="gramEnd"/>
-      <w:r>
-        <w:t xml:space="preserve"> 9 lines Task 6 stuff). We're back to rendering </w:t>
-      </w:r>
-      <w:proofErr w:type="gramStart"/>
-      <w:r>
-        <w:t>cube</w:t>
-      </w:r>
-      <w:proofErr w:type="gramEnd"/>
-      <w:r>
-        <w:t xml:space="preserve"> normally, </w:t>
-      </w:r>
-      <w:proofErr w:type="gramStart"/>
-      <w:r>
-        <w:t>renders</w:t>
-      </w:r>
-      <w:proofErr w:type="gramEnd"/>
-      <w:r>
-        <w:t xml:space="preserve"> 5 cubes now</w:t>
+        <w:t xml:space="preserve"> pushUBO.model = glm::translate(glm::mat4(1.0f), glm::vec3(1.0f, 0.0f, 0.0f));</w:t>
+      </w:r>
+    </w:p>
+    <w:p>
+      <w:r>
+        <w:t xml:space="preserve"> vkCmdPushConstants(commandBuffer, pipelineLayout, VK_SHADER_STAGE_VERTEX_BIT, 0, sizeof(ModelPushConstant), &amp;pushUBO);</w:t>
+      </w:r>
+    </w:p>
+    <w:p>
+      <w:r>
+        <w:t xml:space="preserve"> vkCmdDrawIndexed(commandBuffer, static_cast&lt;uint32_t&gt;(indices.size()), 1, 0, 0, 0); //should draw cube now (uint32), 24 objects (should render 12 lines of cube, only renders 9 lines Task 6 stuff). We're back to rendering cube normally, renders 5 cubes now</w:t>
       </w:r>
     </w:p>
     <w:p/>
     <w:p>
-      <w:proofErr w:type="spellStart"/>
-      <w:proofErr w:type="gramStart"/>
       <w:r>
         <w:t>shader.vert</w:t>
       </w:r>
-      <w:proofErr w:type="spellEnd"/>
-      <w:proofErr w:type="gramEnd"/>
     </w:p>
     <w:p/>
     <w:p>
@@ -5857,33 +4230,11 @@
           <w:lang w:val="en-GB"/>
         </w:rPr>
       </w:pPr>
-      <w:proofErr w:type="gramStart"/>
-      <w:r>
-        <w:rPr>
-          <w:lang w:val="en-GB"/>
-        </w:rPr>
-        <w:t>layout(</w:t>
-      </w:r>
-      <w:proofErr w:type="gramEnd"/>
-      <w:r>
-        <w:rPr>
-          <w:lang w:val="en-GB"/>
-        </w:rPr>
-        <w:t xml:space="preserve">binding = 0) uniform </w:t>
-      </w:r>
-      <w:proofErr w:type="spellStart"/>
-      <w:r>
-        <w:rPr>
-          <w:lang w:val="en-GB"/>
-        </w:rPr>
-        <w:t>UniformBufferObject</w:t>
-      </w:r>
-      <w:proofErr w:type="spellEnd"/>
-      <w:r>
-        <w:rPr>
-          <w:lang w:val="en-GB"/>
-        </w:rPr>
-        <w:t xml:space="preserve"> {</w:t>
+      <w:r>
+        <w:rPr>
+          <w:lang w:val="en-GB"/>
+        </w:rPr>
+        <w:t>layout(binding = 0) uniform UniformBufferObject {</w:t>
       </w:r>
     </w:p>
     <w:p>
@@ -5909,96 +4260,40 @@
         <w:rPr>
           <w:lang w:val="en-GB"/>
         </w:rPr>
-        <w:t xml:space="preserve">    mat4 </w:t>
-      </w:r>
-      <w:proofErr w:type="spellStart"/>
-      <w:r>
-        <w:rPr>
-          <w:lang w:val="en-GB"/>
-        </w:rPr>
-        <w:t>proj</w:t>
-      </w:r>
-      <w:proofErr w:type="spellEnd"/>
-      <w:r>
-        <w:rPr>
-          <w:lang w:val="en-GB"/>
-        </w:rPr>
-        <w:t>;</w:t>
-      </w:r>
-    </w:p>
-    <w:p>
-      <w:pPr>
-        <w:rPr>
-          <w:lang w:val="en-GB"/>
-        </w:rPr>
-      </w:pPr>
-      <w:r>
-        <w:rPr>
-          <w:lang w:val="en-GB"/>
-        </w:rPr>
-        <w:t xml:space="preserve">} </w:t>
-      </w:r>
-      <w:proofErr w:type="spellStart"/>
-      <w:r>
-        <w:rPr>
-          <w:lang w:val="en-GB"/>
-        </w:rPr>
-        <w:t>ubo</w:t>
-      </w:r>
-      <w:proofErr w:type="spellEnd"/>
-      <w:r>
-        <w:rPr>
-          <w:lang w:val="en-GB"/>
-        </w:rPr>
-        <w:t>;</w:t>
-      </w:r>
-    </w:p>
-    <w:p>
-      <w:pPr>
-        <w:rPr>
-          <w:lang w:val="en-GB"/>
-        </w:rPr>
-      </w:pPr>
-    </w:p>
-    <w:p>
-      <w:pPr>
-        <w:rPr>
-          <w:lang w:val="en-GB"/>
-        </w:rPr>
-      </w:pPr>
-      <w:r>
-        <w:rPr>
-          <w:lang w:val="en-GB"/>
-        </w:rPr>
-        <w:t>layout(</w:t>
-      </w:r>
-      <w:proofErr w:type="spellStart"/>
-      <w:r>
-        <w:rPr>
-          <w:lang w:val="en-GB"/>
-        </w:rPr>
-        <w:t>push_constant</w:t>
-      </w:r>
-      <w:proofErr w:type="spellEnd"/>
-      <w:r>
-        <w:rPr>
-          <w:lang w:val="en-GB"/>
-        </w:rPr>
-        <w:t xml:space="preserve">) uniform </w:t>
-      </w:r>
-      <w:proofErr w:type="spellStart"/>
-      <w:r>
-        <w:rPr>
-          <w:lang w:val="en-GB"/>
-        </w:rPr>
-        <w:t>PushConstants</w:t>
-      </w:r>
-      <w:proofErr w:type="spellEnd"/>
-      <w:r>
-        <w:rPr>
-          <w:lang w:val="en-GB"/>
-        </w:rPr>
-        <w:t xml:space="preserve"> {</w:t>
+        <w:t xml:space="preserve">    mat4 proj;</w:t>
+      </w:r>
+    </w:p>
+    <w:p>
+      <w:pPr>
+        <w:rPr>
+          <w:lang w:val="en-GB"/>
+        </w:rPr>
+      </w:pPr>
+      <w:r>
+        <w:rPr>
+          <w:lang w:val="en-GB"/>
+        </w:rPr>
+        <w:t>} ubo;</w:t>
+      </w:r>
+    </w:p>
+    <w:p>
+      <w:pPr>
+        <w:rPr>
+          <w:lang w:val="en-GB"/>
+        </w:rPr>
+      </w:pPr>
+    </w:p>
+    <w:p>
+      <w:pPr>
+        <w:rPr>
+          <w:lang w:val="en-GB"/>
+        </w:rPr>
+      </w:pPr>
+      <w:r>
+        <w:rPr>
+          <w:lang w:val="en-GB"/>
+        </w:rPr>
+        <w:t>layout(push_constant) uniform PushConstants {</w:t>
       </w:r>
     </w:p>
     <w:p>
@@ -6024,181 +4319,87 @@
         <w:rPr>
           <w:lang w:val="en-GB"/>
         </w:rPr>
-        <w:t xml:space="preserve">    } </w:t>
-      </w:r>
-      <w:proofErr w:type="spellStart"/>
-      <w:r>
-        <w:rPr>
-          <w:lang w:val="en-GB"/>
-        </w:rPr>
-        <w:t>pushConstants</w:t>
-      </w:r>
-      <w:proofErr w:type="spellEnd"/>
-      <w:r>
-        <w:rPr>
-          <w:lang w:val="en-GB"/>
-        </w:rPr>
-        <w:t>;</w:t>
-      </w:r>
-    </w:p>
-    <w:p>
-      <w:pPr>
-        <w:rPr>
-          <w:lang w:val="en-GB"/>
-        </w:rPr>
-      </w:pPr>
-    </w:p>
-    <w:p>
-      <w:pPr>
-        <w:rPr>
-          <w:lang w:val="en-GB"/>
-        </w:rPr>
-      </w:pPr>
-      <w:proofErr w:type="gramStart"/>
-      <w:r>
-        <w:rPr>
-          <w:lang w:val="en-GB"/>
-        </w:rPr>
-        <w:t>layout(</w:t>
-      </w:r>
-      <w:proofErr w:type="gramEnd"/>
-      <w:r>
-        <w:rPr>
-          <w:lang w:val="en-GB"/>
-        </w:rPr>
-        <w:t xml:space="preserve">location = 0) in vec3 </w:t>
-      </w:r>
-      <w:proofErr w:type="spellStart"/>
-      <w:r>
-        <w:rPr>
-          <w:lang w:val="en-GB"/>
-        </w:rPr>
-        <w:t>inPosition</w:t>
-      </w:r>
-      <w:proofErr w:type="spellEnd"/>
-      <w:r>
-        <w:rPr>
-          <w:lang w:val="en-GB"/>
-        </w:rPr>
-        <w:t>;</w:t>
-      </w:r>
-    </w:p>
-    <w:p>
-      <w:pPr>
-        <w:rPr>
-          <w:lang w:val="en-GB"/>
-        </w:rPr>
-      </w:pPr>
-      <w:proofErr w:type="gramStart"/>
-      <w:r>
-        <w:rPr>
-          <w:lang w:val="en-GB"/>
-        </w:rPr>
-        <w:t>layout(</w:t>
-      </w:r>
-      <w:proofErr w:type="gramEnd"/>
-      <w:r>
-        <w:rPr>
-          <w:lang w:val="en-GB"/>
-        </w:rPr>
-        <w:t xml:space="preserve">location = 1) in vec3 </w:t>
-      </w:r>
-      <w:proofErr w:type="spellStart"/>
-      <w:r>
-        <w:rPr>
-          <w:lang w:val="en-GB"/>
-        </w:rPr>
-        <w:t>inColor</w:t>
-      </w:r>
-      <w:proofErr w:type="spellEnd"/>
-      <w:r>
-        <w:rPr>
-          <w:lang w:val="en-GB"/>
-        </w:rPr>
-        <w:t>;</w:t>
-      </w:r>
-    </w:p>
-    <w:p>
-      <w:pPr>
-        <w:rPr>
-          <w:lang w:val="en-GB"/>
-        </w:rPr>
-      </w:pPr>
-    </w:p>
-    <w:p>
-      <w:pPr>
-        <w:rPr>
-          <w:lang w:val="en-GB"/>
-        </w:rPr>
-      </w:pPr>
-      <w:proofErr w:type="gramStart"/>
-      <w:r>
-        <w:rPr>
-          <w:lang w:val="en-GB"/>
-        </w:rPr>
-        <w:t>layout(</w:t>
-      </w:r>
-      <w:proofErr w:type="gramEnd"/>
-      <w:r>
-        <w:rPr>
-          <w:lang w:val="en-GB"/>
-        </w:rPr>
-        <w:t xml:space="preserve">location = 0) out vec3 </w:t>
-      </w:r>
-      <w:proofErr w:type="spellStart"/>
-      <w:r>
-        <w:rPr>
-          <w:lang w:val="en-GB"/>
-        </w:rPr>
-        <w:t>fragColor</w:t>
-      </w:r>
-      <w:proofErr w:type="spellEnd"/>
-      <w:r>
-        <w:rPr>
-          <w:lang w:val="en-GB"/>
-        </w:rPr>
-        <w:t>;</w:t>
-      </w:r>
-    </w:p>
-    <w:p>
-      <w:pPr>
-        <w:rPr>
-          <w:lang w:val="en-GB"/>
-        </w:rPr>
-      </w:pPr>
-    </w:p>
-    <w:p>
-      <w:pPr>
-        <w:rPr>
-          <w:lang w:val="en-GB"/>
-        </w:rPr>
-      </w:pPr>
-    </w:p>
-    <w:p>
-      <w:pPr>
-        <w:rPr>
-          <w:lang w:val="en-GB"/>
-        </w:rPr>
-      </w:pPr>
-      <w:r>
-        <w:rPr>
-          <w:lang w:val="en-GB"/>
-        </w:rPr>
-        <w:t xml:space="preserve">void </w:t>
-      </w:r>
-      <w:proofErr w:type="gramStart"/>
-      <w:r>
-        <w:rPr>
-          <w:lang w:val="en-GB"/>
-        </w:rPr>
-        <w:t>main(</w:t>
-      </w:r>
-      <w:proofErr w:type="gramEnd"/>
-      <w:r>
-        <w:rPr>
-          <w:lang w:val="en-GB"/>
-        </w:rPr>
-        <w:t>) {</w:t>
+        <w:t xml:space="preserve">    } pushConstants;</w:t>
+      </w:r>
+    </w:p>
+    <w:p>
+      <w:pPr>
+        <w:rPr>
+          <w:lang w:val="en-GB"/>
+        </w:rPr>
+      </w:pPr>
+    </w:p>
+    <w:p>
+      <w:pPr>
+        <w:rPr>
+          <w:lang w:val="en-GB"/>
+        </w:rPr>
+      </w:pPr>
+      <w:r>
+        <w:rPr>
+          <w:lang w:val="en-GB"/>
+        </w:rPr>
+        <w:t>layout(location = 0) in vec3 inPosition;</w:t>
+      </w:r>
+    </w:p>
+    <w:p>
+      <w:pPr>
+        <w:rPr>
+          <w:lang w:val="en-GB"/>
+        </w:rPr>
+      </w:pPr>
+      <w:r>
+        <w:rPr>
+          <w:lang w:val="en-GB"/>
+        </w:rPr>
+        <w:t>layout(location = 1) in vec3 inColor;</w:t>
+      </w:r>
+    </w:p>
+    <w:p>
+      <w:pPr>
+        <w:rPr>
+          <w:lang w:val="en-GB"/>
+        </w:rPr>
+      </w:pPr>
+    </w:p>
+    <w:p>
+      <w:pPr>
+        <w:rPr>
+          <w:lang w:val="en-GB"/>
+        </w:rPr>
+      </w:pPr>
+      <w:r>
+        <w:rPr>
+          <w:lang w:val="en-GB"/>
+        </w:rPr>
+        <w:t>layout(location = 0) out vec3 fragColor;</w:t>
+      </w:r>
+    </w:p>
+    <w:p>
+      <w:pPr>
+        <w:rPr>
+          <w:lang w:val="en-GB"/>
+        </w:rPr>
+      </w:pPr>
+    </w:p>
+    <w:p>
+      <w:pPr>
+        <w:rPr>
+          <w:lang w:val="en-GB"/>
+        </w:rPr>
+      </w:pPr>
+    </w:p>
+    <w:p>
+      <w:pPr>
+        <w:rPr>
+          <w:lang w:val="en-GB"/>
+        </w:rPr>
+      </w:pPr>
+      <w:r>
+        <w:rPr>
+          <w:lang w:val="en-GB"/>
+        </w:rPr>
+        <w:t>void main() {</w:t>
       </w:r>
     </w:p>
     <w:p>
@@ -6238,122 +4439,20 @@
         <w:rPr>
           <w:lang w:val="en-GB"/>
         </w:rPr>
-        <w:t xml:space="preserve">    </w:t>
-      </w:r>
-      <w:proofErr w:type="spellStart"/>
-      <w:r>
-        <w:rPr>
-          <w:lang w:val="en-GB"/>
-        </w:rPr>
-        <w:t>gl_Position</w:t>
-      </w:r>
-      <w:proofErr w:type="spellEnd"/>
-      <w:r>
-        <w:rPr>
-          <w:lang w:val="en-GB"/>
-        </w:rPr>
-        <w:t xml:space="preserve"> = </w:t>
-      </w:r>
-      <w:proofErr w:type="spellStart"/>
-      <w:proofErr w:type="gramStart"/>
-      <w:r>
-        <w:rPr>
-          <w:lang w:val="en-GB"/>
-        </w:rPr>
-        <w:t>ubo.proj</w:t>
-      </w:r>
-      <w:proofErr w:type="spellEnd"/>
-      <w:proofErr w:type="gramEnd"/>
-      <w:r>
-        <w:rPr>
-          <w:lang w:val="en-GB"/>
-        </w:rPr>
-        <w:t xml:space="preserve"> * </w:t>
-      </w:r>
-      <w:proofErr w:type="spellStart"/>
-      <w:proofErr w:type="gramStart"/>
-      <w:r>
-        <w:rPr>
-          <w:lang w:val="en-GB"/>
-        </w:rPr>
-        <w:t>ubo.view</w:t>
-      </w:r>
-      <w:proofErr w:type="spellEnd"/>
-      <w:proofErr w:type="gramEnd"/>
-      <w:r>
-        <w:rPr>
-          <w:lang w:val="en-GB"/>
-        </w:rPr>
-        <w:t xml:space="preserve"> * </w:t>
-      </w:r>
-      <w:proofErr w:type="spellStart"/>
-      <w:r>
-        <w:rPr>
-          <w:lang w:val="en-GB"/>
-        </w:rPr>
-        <w:t>pushConstants.model</w:t>
-      </w:r>
-      <w:proofErr w:type="spellEnd"/>
-      <w:r>
-        <w:rPr>
-          <w:lang w:val="en-GB"/>
-        </w:rPr>
-        <w:t xml:space="preserve"> * vec4(</w:t>
-      </w:r>
-      <w:proofErr w:type="spellStart"/>
-      <w:r>
-        <w:rPr>
-          <w:lang w:val="en-GB"/>
-        </w:rPr>
-        <w:t>inPosition</w:t>
-      </w:r>
-      <w:proofErr w:type="spellEnd"/>
-      <w:r>
-        <w:rPr>
-          <w:lang w:val="en-GB"/>
-        </w:rPr>
-        <w:t>, 1.0);</w:t>
-      </w:r>
-    </w:p>
-    <w:p>
-      <w:pPr>
-        <w:rPr>
-          <w:lang w:val="en-GB"/>
-        </w:rPr>
-      </w:pPr>
-      <w:r>
-        <w:rPr>
-          <w:lang w:val="en-GB"/>
-        </w:rPr>
-        <w:t xml:space="preserve">    </w:t>
-      </w:r>
-      <w:proofErr w:type="spellStart"/>
-      <w:r>
-        <w:rPr>
-          <w:lang w:val="en-GB"/>
-        </w:rPr>
-        <w:t>fragColor</w:t>
-      </w:r>
-      <w:proofErr w:type="spellEnd"/>
-      <w:r>
-        <w:rPr>
-          <w:lang w:val="en-GB"/>
-        </w:rPr>
-        <w:t xml:space="preserve"> = </w:t>
-      </w:r>
-      <w:proofErr w:type="spellStart"/>
-      <w:r>
-        <w:rPr>
-          <w:lang w:val="en-GB"/>
-        </w:rPr>
-        <w:t>inColor</w:t>
-      </w:r>
-      <w:proofErr w:type="spellEnd"/>
-      <w:r>
-        <w:rPr>
-          <w:lang w:val="en-GB"/>
-        </w:rPr>
-        <w:t>;</w:t>
+        <w:t xml:space="preserve">    gl_Position = ubo.proj * ubo.view * pushConstants.model * vec4(inPosition, 1.0);</w:t>
+      </w:r>
+    </w:p>
+    <w:p>
+      <w:pPr>
+        <w:rPr>
+          <w:lang w:val="en-GB"/>
+        </w:rPr>
+      </w:pPr>
+      <w:r>
+        <w:rPr>
+          <w:lang w:val="en-GB"/>
+        </w:rPr>
+        <w:t xml:space="preserve">    fragColor = inColor;</w:t>
       </w:r>
     </w:p>
     <w:p>
@@ -6447,21 +4546,7 @@
         <w:rPr>
           <w:rFonts w:ascii="Segoe UI"/>
         </w:rPr>
-        <w:t xml:space="preserve"> there was quite a lot that needed to be done most notably redoing the </w:t>
-      </w:r>
-      <w:proofErr w:type="spellStart"/>
-      <w:r>
-        <w:rPr>
-          <w:rFonts w:ascii="Segoe UI"/>
-        </w:rPr>
-        <w:t>c++</w:t>
-      </w:r>
-      <w:proofErr w:type="spellEnd"/>
-      <w:r>
-        <w:rPr>
-          <w:rFonts w:ascii="Segoe UI"/>
-        </w:rPr>
-        <w:t xml:space="preserve"> UBO structs to remove the model </w:t>
+        <w:t xml:space="preserve"> there was quite a lot that needed to be done most notably redoing the c++ UBO structs to remove the model </w:t>
       </w:r>
       <w:r>
         <w:rPr>
@@ -6479,21 +4564,7 @@
         <w:rPr>
           <w:rFonts w:ascii="Segoe UI"/>
         </w:rPr>
-        <w:t xml:space="preserve">with </w:t>
-      </w:r>
-      <w:proofErr w:type="spellStart"/>
-      <w:r>
-        <w:rPr>
-          <w:rFonts w:ascii="Segoe UI"/>
-        </w:rPr>
-        <w:t>pushUBO</w:t>
-      </w:r>
-      <w:proofErr w:type="spellEnd"/>
-      <w:r>
-        <w:rPr>
-          <w:rFonts w:ascii="Segoe UI"/>
-        </w:rPr>
-        <w:t xml:space="preserve">. </w:t>
+        <w:t xml:space="preserve">with pushUBO. </w:t>
       </w:r>
     </w:p>
     <w:p>
@@ -6509,35 +4580,7 @@
         <w:rPr>
           <w:rFonts w:ascii="Segoe UI"/>
         </w:rPr>
-        <w:t xml:space="preserve">From what I can understand </w:t>
-      </w:r>
-      <w:proofErr w:type="gramStart"/>
-      <w:r>
-        <w:rPr>
-          <w:rFonts w:ascii="Segoe UI"/>
-        </w:rPr>
-        <w:t>doing it</w:t>
-      </w:r>
-      <w:proofErr w:type="gramEnd"/>
-      <w:r>
-        <w:rPr>
-          <w:rFonts w:ascii="Segoe UI"/>
-        </w:rPr>
-        <w:t xml:space="preserve"> </w:t>
-      </w:r>
-      <w:proofErr w:type="gramStart"/>
-      <w:r>
-        <w:rPr>
-          <w:rFonts w:ascii="Segoe UI"/>
-        </w:rPr>
-        <w:t>this way</w:t>
-      </w:r>
-      <w:proofErr w:type="gramEnd"/>
-      <w:r>
-        <w:rPr>
-          <w:rFonts w:ascii="Segoe UI"/>
-        </w:rPr>
-        <w:t xml:space="preserve"> is more efficient and it makes so </w:t>
+        <w:t xml:space="preserve">From what I can understand doing it this way is more efficient and it makes so </w:t>
       </w:r>
       <w:r>
         <w:rPr>
@@ -6682,7 +4725,7 @@
 </file>
 
 <file path=word/endnotes.xml><?xml version="1.0" encoding="utf-8"?>
-<w:endnotes xmlns:wpc="http://schemas.microsoft.com/office/word/2010/wordprocessingCanvas" xmlns:cx="http://schemas.microsoft.com/office/drawing/2014/chartex" xmlns:cx1="http://schemas.microsoft.com/office/drawing/2015/9/8/chartex" xmlns:cx2="http://schemas.microsoft.com/office/drawing/2015/10/21/chartex" xmlns:cx3="http://schemas.microsoft.com/office/drawing/2016/5/9/chartex" xmlns:cx4="http://schemas.microsoft.com/office/drawing/2016/5/10/chartex" xmlns:cx5="http://schemas.microsoft.com/office/drawing/2016/5/11/chartex" xmlns:cx6="http://schemas.microsoft.com/office/drawing/2016/5/12/chartex" xmlns:cx7="http://schemas.microsoft.com/office/drawing/2016/5/13/chartex" xmlns:cx8="http://schemas.microsoft.com/office/drawing/2016/5/14/chartex" xmlns:mc="http://schemas.openxmlformats.org/markup-compatibility/2006" xmlns:aink="http://schemas.microsoft.com/office/drawing/2016/ink" xmlns:am3d="http://schemas.microsoft.com/office/drawing/2017/model3d" xmlns:o="urn:schemas-microsoft-com:office:office" xmlns:oel="http://schemas.microsoft.com/office/2019/extlst" xmlns:r="http://schemas.openxmlformats.org/officeDocument/2006/relationships" xmlns:m="http://schemas.openxmlformats.org/officeDocument/2006/math" xmlns:v="urn:schemas-microsoft-com:vml" xmlns:wp14="http://schemas.microsoft.com/office/word/2010/wordprocessingDrawing" xmlns:wp="http://schemas.openxmlformats.org/drawingml/2006/wordprocessingDrawing" xmlns:w10="urn:schemas-microsoft-com:office:word" xmlns:w="http://schemas.openxmlformats.org/wordprocessingml/2006/main" xmlns:w14="http://schemas.microsoft.com/office/word/2010/wordml" xmlns:w15="http://schemas.microsoft.com/office/word/2012/wordml" xmlns:w16cei="http://schemas.microsoft.com/office/word/2026/wordml/cei" xmlns:w16cex="http://schemas.microsoft.com/office/word/2018/wordml/cex" xmlns:w16cid="http://schemas.microsoft.com/office/word/2016/wordml/cid" xmlns:w16="http://schemas.microsoft.com/office/word/2018/wordml" xmlns:w16du="http://schemas.microsoft.com/office/word/2023/wordml/word16du" xmlns:w16sdtdh="http://schemas.microsoft.com/office/word/2020/wordml/sdtdatahash" xmlns:w16sdtfl="http://schemas.microsoft.com/office/word/2024/wordml/sdtformatlock" xmlns:w16se="http://schemas.microsoft.com/office/word/2015/wordml/symex" xmlns:wpg="http://schemas.microsoft.com/office/word/2010/wordprocessingGroup" xmlns:wpi="http://schemas.microsoft.com/office/word/2010/wordprocessingInk" xmlns:wne="http://schemas.microsoft.com/office/word/2006/wordml" xmlns:wps="http://schemas.microsoft.com/office/word/2010/wordprocessingShape" mc:Ignorable="w14 w15 w16se w16cid w16 w16cex w16sdtdh w16sdtfl w16du wp14">
+<w:endnotes xmlns:wpc="http://schemas.microsoft.com/office/word/2010/wordprocessingCanvas" xmlns:cx="http://schemas.microsoft.com/office/drawing/2014/chartex" xmlns:cx1="http://schemas.microsoft.com/office/drawing/2015/9/8/chartex" xmlns:cx2="http://schemas.microsoft.com/office/drawing/2015/10/21/chartex" xmlns:cx3="http://schemas.microsoft.com/office/drawing/2016/5/9/chartex" xmlns:cx4="http://schemas.microsoft.com/office/drawing/2016/5/10/chartex" xmlns:cx5="http://schemas.microsoft.com/office/drawing/2016/5/11/chartex" xmlns:cx6="http://schemas.microsoft.com/office/drawing/2016/5/12/chartex" xmlns:cx7="http://schemas.microsoft.com/office/drawing/2016/5/13/chartex" xmlns:cx8="http://schemas.microsoft.com/office/drawing/2016/5/14/chartex" xmlns:mc="http://schemas.openxmlformats.org/markup-compatibility/2006" xmlns:aink="http://schemas.microsoft.com/office/drawing/2016/ink" xmlns:am3d="http://schemas.microsoft.com/office/drawing/2017/model3d" xmlns:o="urn:schemas-microsoft-com:office:office" xmlns:oel="http://schemas.microsoft.com/office/2019/extlst" xmlns:r="http://schemas.openxmlformats.org/officeDocument/2006/relationships" xmlns:m="http://schemas.openxmlformats.org/officeDocument/2006/math" xmlns:v="urn:schemas-microsoft-com:vml" xmlns:wp14="http://schemas.microsoft.com/office/word/2010/wordprocessingDrawing" xmlns:wp="http://schemas.openxmlformats.org/drawingml/2006/wordprocessingDrawing" xmlns:w10="urn:schemas-microsoft-com:office:word" xmlns:w="http://schemas.openxmlformats.org/wordprocessingml/2006/main" xmlns:w14="http://schemas.microsoft.com/office/word/2010/wordml" xmlns:w15="http://schemas.microsoft.com/office/word/2012/wordml" xmlns:w16cex="http://schemas.microsoft.com/office/word/2018/wordml/cex" xmlns:w16cid="http://schemas.microsoft.com/office/word/2016/wordml/cid" xmlns:w16="http://schemas.microsoft.com/office/word/2018/wordml" xmlns:w16du="http://schemas.microsoft.com/office/word/2023/wordml/word16du" xmlns:w16sdtdh="http://schemas.microsoft.com/office/word/2020/wordml/sdtdatahash" xmlns:w16sdtfl="http://schemas.microsoft.com/office/word/2024/wordml/sdtformatlock" xmlns:w16se="http://schemas.microsoft.com/office/word/2015/wordml/symex" xmlns:wpg="http://schemas.microsoft.com/office/word/2010/wordprocessingGroup" xmlns:wpi="http://schemas.microsoft.com/office/word/2010/wordprocessingInk" xmlns:wne="http://schemas.microsoft.com/office/word/2006/wordml" xmlns:wps="http://schemas.microsoft.com/office/word/2010/wordprocessingShape" mc:Ignorable="w14 w15 w16se w16cid w16 w16cex w16sdtdh w16sdtfl w16du wp14">
   <w:endnote w:type="separator" w:id="-1">
     <w:p>
       <w:r>
@@ -6701,7 +4744,7 @@
 </file>
 
 <file path=word/footer1.xml><?xml version="1.0" encoding="utf-8"?>
-<w:ftr xmlns:wpc="http://schemas.microsoft.com/office/word/2010/wordprocessingCanvas" xmlns:cx="http://schemas.microsoft.com/office/drawing/2014/chartex" xmlns:cx1="http://schemas.microsoft.com/office/drawing/2015/9/8/chartex" xmlns:cx2="http://schemas.microsoft.com/office/drawing/2015/10/21/chartex" xmlns:cx3="http://schemas.microsoft.com/office/drawing/2016/5/9/chartex" xmlns:cx4="http://schemas.microsoft.com/office/drawing/2016/5/10/chartex" xmlns:cx5="http://schemas.microsoft.com/office/drawing/2016/5/11/chartex" xmlns:cx6="http://schemas.microsoft.com/office/drawing/2016/5/12/chartex" xmlns:cx7="http://schemas.microsoft.com/office/drawing/2016/5/13/chartex" xmlns:cx8="http://schemas.microsoft.com/office/drawing/2016/5/14/chartex" xmlns:mc="http://schemas.openxmlformats.org/markup-compatibility/2006" xmlns:aink="http://schemas.microsoft.com/office/drawing/2016/ink" xmlns:am3d="http://schemas.microsoft.com/office/drawing/2017/model3d" xmlns:o="urn:schemas-microsoft-com:office:office" xmlns:oel="http://schemas.microsoft.com/office/2019/extlst" xmlns:r="http://schemas.openxmlformats.org/officeDocument/2006/relationships" xmlns:m="http://schemas.openxmlformats.org/officeDocument/2006/math" xmlns:v="urn:schemas-microsoft-com:vml" xmlns:wp14="http://schemas.microsoft.com/office/word/2010/wordprocessingDrawing" xmlns:wp="http://schemas.openxmlformats.org/drawingml/2006/wordprocessingDrawing" xmlns:w10="urn:schemas-microsoft-com:office:word" xmlns:w="http://schemas.openxmlformats.org/wordprocessingml/2006/main" xmlns:w14="http://schemas.microsoft.com/office/word/2010/wordml" xmlns:w15="http://schemas.microsoft.com/office/word/2012/wordml" xmlns:w16cei="http://schemas.microsoft.com/office/word/2026/wordml/cei" xmlns:w16cex="http://schemas.microsoft.com/office/word/2018/wordml/cex" xmlns:w16cid="http://schemas.microsoft.com/office/word/2016/wordml/cid" xmlns:w16="http://schemas.microsoft.com/office/word/2018/wordml" xmlns:w16du="http://schemas.microsoft.com/office/word/2023/wordml/word16du" xmlns:w16sdtdh="http://schemas.microsoft.com/office/word/2020/wordml/sdtdatahash" xmlns:w16sdtfl="http://schemas.microsoft.com/office/word/2024/wordml/sdtformatlock" xmlns:w16se="http://schemas.microsoft.com/office/word/2015/wordml/symex" xmlns:wpg="http://schemas.microsoft.com/office/word/2010/wordprocessingGroup" xmlns:wpi="http://schemas.microsoft.com/office/word/2010/wordprocessingInk" xmlns:wne="http://schemas.microsoft.com/office/word/2006/wordml" xmlns:wps="http://schemas.microsoft.com/office/word/2010/wordprocessingShape" mc:Ignorable="w14 w15 w16se w16cid w16 w16cex w16sdtdh w16sdtfl w16du wp14">
+<w:ftr xmlns:wpc="http://schemas.microsoft.com/office/word/2010/wordprocessingCanvas" xmlns:cx="http://schemas.microsoft.com/office/drawing/2014/chartex" xmlns:cx1="http://schemas.microsoft.com/office/drawing/2015/9/8/chartex" xmlns:cx2="http://schemas.microsoft.com/office/drawing/2015/10/21/chartex" xmlns:cx3="http://schemas.microsoft.com/office/drawing/2016/5/9/chartex" xmlns:cx4="http://schemas.microsoft.com/office/drawing/2016/5/10/chartex" xmlns:cx5="http://schemas.microsoft.com/office/drawing/2016/5/11/chartex" xmlns:cx6="http://schemas.microsoft.com/office/drawing/2016/5/12/chartex" xmlns:cx7="http://schemas.microsoft.com/office/drawing/2016/5/13/chartex" xmlns:cx8="http://schemas.microsoft.com/office/drawing/2016/5/14/chartex" xmlns:mc="http://schemas.openxmlformats.org/markup-compatibility/2006" xmlns:aink="http://schemas.microsoft.com/office/drawing/2016/ink" xmlns:am3d="http://schemas.microsoft.com/office/drawing/2017/model3d" xmlns:o="urn:schemas-microsoft-com:office:office" xmlns:oel="http://schemas.microsoft.com/office/2019/extlst" xmlns:r="http://schemas.openxmlformats.org/officeDocument/2006/relationships" xmlns:m="http://schemas.openxmlformats.org/officeDocument/2006/math" xmlns:v="urn:schemas-microsoft-com:vml" xmlns:wp14="http://schemas.microsoft.com/office/word/2010/wordprocessingDrawing" xmlns:wp="http://schemas.openxmlformats.org/drawingml/2006/wordprocessingDrawing" xmlns:w10="urn:schemas-microsoft-com:office:word" xmlns:w="http://schemas.openxmlformats.org/wordprocessingml/2006/main" xmlns:w14="http://schemas.microsoft.com/office/word/2010/wordml" xmlns:w15="http://schemas.microsoft.com/office/word/2012/wordml" xmlns:w16cex="http://schemas.microsoft.com/office/word/2018/wordml/cex" xmlns:w16cid="http://schemas.microsoft.com/office/word/2016/wordml/cid" xmlns:w16="http://schemas.microsoft.com/office/word/2018/wordml" xmlns:w16du="http://schemas.microsoft.com/office/word/2023/wordml/word16du" xmlns:w16sdtdh="http://schemas.microsoft.com/office/word/2020/wordml/sdtdatahash" xmlns:w16sdtfl="http://schemas.microsoft.com/office/word/2024/wordml/sdtformatlock" xmlns:w16se="http://schemas.microsoft.com/office/word/2015/wordml/symex" xmlns:wpg="http://schemas.microsoft.com/office/word/2010/wordprocessingGroup" xmlns:wpi="http://schemas.microsoft.com/office/word/2010/wordprocessingInk" xmlns:wne="http://schemas.microsoft.com/office/word/2006/wordml" xmlns:wps="http://schemas.microsoft.com/office/word/2010/wordprocessingShape" mc:Ignorable="w14 w15 w16se w16cid w16 w16cex w16sdtdh w16sdtfl w16du wp14">
   <w:p>
     <w:pPr>
       <w:pStyle w:val="BodyText"/>
@@ -7000,7 +5043,7 @@
 </file>
 
 <file path=word/footnotes.xml><?xml version="1.0" encoding="utf-8"?>
-<w:footnotes xmlns:wpc="http://schemas.microsoft.com/office/word/2010/wordprocessingCanvas" xmlns:cx="http://schemas.microsoft.com/office/drawing/2014/chartex" xmlns:cx1="http://schemas.microsoft.com/office/drawing/2015/9/8/chartex" xmlns:cx2="http://schemas.microsoft.com/office/drawing/2015/10/21/chartex" xmlns:cx3="http://schemas.microsoft.com/office/drawing/2016/5/9/chartex" xmlns:cx4="http://schemas.microsoft.com/office/drawing/2016/5/10/chartex" xmlns:cx5="http://schemas.microsoft.com/office/drawing/2016/5/11/chartex" xmlns:cx6="http://schemas.microsoft.com/office/drawing/2016/5/12/chartex" xmlns:cx7="http://schemas.microsoft.com/office/drawing/2016/5/13/chartex" xmlns:cx8="http://schemas.microsoft.com/office/drawing/2016/5/14/chartex" xmlns:mc="http://schemas.openxmlformats.org/markup-compatibility/2006" xmlns:aink="http://schemas.microsoft.com/office/drawing/2016/ink" xmlns:am3d="http://schemas.microsoft.com/office/drawing/2017/model3d" xmlns:o="urn:schemas-microsoft-com:office:office" xmlns:oel="http://schemas.microsoft.com/office/2019/extlst" xmlns:r="http://schemas.openxmlformats.org/officeDocument/2006/relationships" xmlns:m="http://schemas.openxmlformats.org/officeDocument/2006/math" xmlns:v="urn:schemas-microsoft-com:vml" xmlns:wp14="http://schemas.microsoft.com/office/word/2010/wordprocessingDrawing" xmlns:wp="http://schemas.openxmlformats.org/drawingml/2006/wordprocessingDrawing" xmlns:w10="urn:schemas-microsoft-com:office:word" xmlns:w="http://schemas.openxmlformats.org/wordprocessingml/2006/main" xmlns:w14="http://schemas.microsoft.com/office/word/2010/wordml" xmlns:w15="http://schemas.microsoft.com/office/word/2012/wordml" xmlns:w16cei="http://schemas.microsoft.com/office/word/2026/wordml/cei" xmlns:w16cex="http://schemas.microsoft.com/office/word/2018/wordml/cex" xmlns:w16cid="http://schemas.microsoft.com/office/word/2016/wordml/cid" xmlns:w16="http://schemas.microsoft.com/office/word/2018/wordml" xmlns:w16du="http://schemas.microsoft.com/office/word/2023/wordml/word16du" xmlns:w16sdtdh="http://schemas.microsoft.com/office/word/2020/wordml/sdtdatahash" xmlns:w16sdtfl="http://schemas.microsoft.com/office/word/2024/wordml/sdtformatlock" xmlns:w16se="http://schemas.microsoft.com/office/word/2015/wordml/symex" xmlns:wpg="http://schemas.microsoft.com/office/word/2010/wordprocessingGroup" xmlns:wpi="http://schemas.microsoft.com/office/word/2010/wordprocessingInk" xmlns:wne="http://schemas.microsoft.com/office/word/2006/wordml" xmlns:wps="http://schemas.microsoft.com/office/word/2010/wordprocessingShape" mc:Ignorable="w14 w15 w16se w16cid w16 w16cex w16sdtdh w16sdtfl w16du wp14">
+<w:footnotes xmlns:wpc="http://schemas.microsoft.com/office/word/2010/wordprocessingCanvas" xmlns:cx="http://schemas.microsoft.com/office/drawing/2014/chartex" xmlns:cx1="http://schemas.microsoft.com/office/drawing/2015/9/8/chartex" xmlns:cx2="http://schemas.microsoft.com/office/drawing/2015/10/21/chartex" xmlns:cx3="http://schemas.microsoft.com/office/drawing/2016/5/9/chartex" xmlns:cx4="http://schemas.microsoft.com/office/drawing/2016/5/10/chartex" xmlns:cx5="http://schemas.microsoft.com/office/drawing/2016/5/11/chartex" xmlns:cx6="http://schemas.microsoft.com/office/drawing/2016/5/12/chartex" xmlns:cx7="http://schemas.microsoft.com/office/drawing/2016/5/13/chartex" xmlns:cx8="http://schemas.microsoft.com/office/drawing/2016/5/14/chartex" xmlns:mc="http://schemas.openxmlformats.org/markup-compatibility/2006" xmlns:aink="http://schemas.microsoft.com/office/drawing/2016/ink" xmlns:am3d="http://schemas.microsoft.com/office/drawing/2017/model3d" xmlns:o="urn:schemas-microsoft-com:office:office" xmlns:oel="http://schemas.microsoft.com/office/2019/extlst" xmlns:r="http://schemas.openxmlformats.org/officeDocument/2006/relationships" xmlns:m="http://schemas.openxmlformats.org/officeDocument/2006/math" xmlns:v="urn:schemas-microsoft-com:vml" xmlns:wp14="http://schemas.microsoft.com/office/word/2010/wordprocessingDrawing" xmlns:wp="http://schemas.openxmlformats.org/drawingml/2006/wordprocessingDrawing" xmlns:w10="urn:schemas-microsoft-com:office:word" xmlns:w="http://schemas.openxmlformats.org/wordprocessingml/2006/main" xmlns:w14="http://schemas.microsoft.com/office/word/2010/wordml" xmlns:w15="http://schemas.microsoft.com/office/word/2012/wordml" xmlns:w16cex="http://schemas.microsoft.com/office/word/2018/wordml/cex" xmlns:w16cid="http://schemas.microsoft.com/office/word/2016/wordml/cid" xmlns:w16="http://schemas.microsoft.com/office/word/2018/wordml" xmlns:w16du="http://schemas.microsoft.com/office/word/2023/wordml/word16du" xmlns:w16sdtdh="http://schemas.microsoft.com/office/word/2020/wordml/sdtdatahash" xmlns:w16sdtfl="http://schemas.microsoft.com/office/word/2024/wordml/sdtformatlock" xmlns:w16se="http://schemas.microsoft.com/office/word/2015/wordml/symex" xmlns:wpg="http://schemas.microsoft.com/office/word/2010/wordprocessingGroup" xmlns:wpi="http://schemas.microsoft.com/office/word/2010/wordprocessingInk" xmlns:wne="http://schemas.microsoft.com/office/word/2006/wordml" xmlns:wps="http://schemas.microsoft.com/office/word/2010/wordprocessingShape" mc:Ignorable="w14 w15 w16se w16cid w16 w16cex w16sdtdh w16sdtfl w16du wp14">
   <w:footnote w:type="separator" w:id="-1">
     <w:p>
       <w:r>
@@ -7019,7 +5062,7 @@
 </file>
 
 <file path=word/header1.xml><?xml version="1.0" encoding="utf-8"?>
-<w:hdr xmlns:wpc="http://schemas.microsoft.com/office/word/2010/wordprocessingCanvas" xmlns:cx="http://schemas.microsoft.com/office/drawing/2014/chartex" xmlns:cx1="http://schemas.microsoft.com/office/drawing/2015/9/8/chartex" xmlns:cx2="http://schemas.microsoft.com/office/drawing/2015/10/21/chartex" xmlns:cx3="http://schemas.microsoft.com/office/drawing/2016/5/9/chartex" xmlns:cx4="http://schemas.microsoft.com/office/drawing/2016/5/10/chartex" xmlns:cx5="http://schemas.microsoft.com/office/drawing/2016/5/11/chartex" xmlns:cx6="http://schemas.microsoft.com/office/drawing/2016/5/12/chartex" xmlns:cx7="http://schemas.microsoft.com/office/drawing/2016/5/13/chartex" xmlns:cx8="http://schemas.microsoft.com/office/drawing/2016/5/14/chartex" xmlns:mc="http://schemas.openxmlformats.org/markup-compatibility/2006" xmlns:aink="http://schemas.microsoft.com/office/drawing/2016/ink" xmlns:am3d="http://schemas.microsoft.com/office/drawing/2017/model3d" xmlns:o="urn:schemas-microsoft-com:office:office" xmlns:oel="http://schemas.microsoft.com/office/2019/extlst" xmlns:r="http://schemas.openxmlformats.org/officeDocument/2006/relationships" xmlns:m="http://schemas.openxmlformats.org/officeDocument/2006/math" xmlns:v="urn:schemas-microsoft-com:vml" xmlns:wp14="http://schemas.microsoft.com/office/word/2010/wordprocessingDrawing" xmlns:wp="http://schemas.openxmlformats.org/drawingml/2006/wordprocessingDrawing" xmlns:w10="urn:schemas-microsoft-com:office:word" xmlns:w="http://schemas.openxmlformats.org/wordprocessingml/2006/main" xmlns:w14="http://schemas.microsoft.com/office/word/2010/wordml" xmlns:w15="http://schemas.microsoft.com/office/word/2012/wordml" xmlns:w16cei="http://schemas.microsoft.com/office/word/2026/wordml/cei" xmlns:w16cex="http://schemas.microsoft.com/office/word/2018/wordml/cex" xmlns:w16cid="http://schemas.microsoft.com/office/word/2016/wordml/cid" xmlns:w16="http://schemas.microsoft.com/office/word/2018/wordml" xmlns:w16du="http://schemas.microsoft.com/office/word/2023/wordml/word16du" xmlns:w16sdtdh="http://schemas.microsoft.com/office/word/2020/wordml/sdtdatahash" xmlns:w16sdtfl="http://schemas.microsoft.com/office/word/2024/wordml/sdtformatlock" xmlns:w16se="http://schemas.microsoft.com/office/word/2015/wordml/symex" xmlns:wpg="http://schemas.microsoft.com/office/word/2010/wordprocessingGroup" xmlns:wpi="http://schemas.microsoft.com/office/word/2010/wordprocessingInk" xmlns:wne="http://schemas.microsoft.com/office/word/2006/wordml" xmlns:wps="http://schemas.microsoft.com/office/word/2010/wordprocessingShape" mc:Ignorable="w14 w15 w16se w16cid w16 w16cex w16sdtdh w16sdtfl w16du wp14">
+<w:hdr xmlns:wpc="http://schemas.microsoft.com/office/word/2010/wordprocessingCanvas" xmlns:cx="http://schemas.microsoft.com/office/drawing/2014/chartex" xmlns:cx1="http://schemas.microsoft.com/office/drawing/2015/9/8/chartex" xmlns:cx2="http://schemas.microsoft.com/office/drawing/2015/10/21/chartex" xmlns:cx3="http://schemas.microsoft.com/office/drawing/2016/5/9/chartex" xmlns:cx4="http://schemas.microsoft.com/office/drawing/2016/5/10/chartex" xmlns:cx5="http://schemas.microsoft.com/office/drawing/2016/5/11/chartex" xmlns:cx6="http://schemas.microsoft.com/office/drawing/2016/5/12/chartex" xmlns:cx7="http://schemas.microsoft.com/office/drawing/2016/5/13/chartex" xmlns:cx8="http://schemas.microsoft.com/office/drawing/2016/5/14/chartex" xmlns:mc="http://schemas.openxmlformats.org/markup-compatibility/2006" xmlns:aink="http://schemas.microsoft.com/office/drawing/2016/ink" xmlns:am3d="http://schemas.microsoft.com/office/drawing/2017/model3d" xmlns:o="urn:schemas-microsoft-com:office:office" xmlns:oel="http://schemas.microsoft.com/office/2019/extlst" xmlns:r="http://schemas.openxmlformats.org/officeDocument/2006/relationships" xmlns:m="http://schemas.openxmlformats.org/officeDocument/2006/math" xmlns:v="urn:schemas-microsoft-com:vml" xmlns:wp14="http://schemas.microsoft.com/office/word/2010/wordprocessingDrawing" xmlns:wp="http://schemas.openxmlformats.org/drawingml/2006/wordprocessingDrawing" xmlns:w10="urn:schemas-microsoft-com:office:word" xmlns:w="http://schemas.openxmlformats.org/wordprocessingml/2006/main" xmlns:w14="http://schemas.microsoft.com/office/word/2010/wordml" xmlns:w15="http://schemas.microsoft.com/office/word/2012/wordml" xmlns:w16cex="http://schemas.microsoft.com/office/word/2018/wordml/cex" xmlns:w16cid="http://schemas.microsoft.com/office/word/2016/wordml/cid" xmlns:w16="http://schemas.microsoft.com/office/word/2018/wordml" xmlns:w16du="http://schemas.microsoft.com/office/word/2023/wordml/word16du" xmlns:w16sdtdh="http://schemas.microsoft.com/office/word/2020/wordml/sdtdatahash" xmlns:w16sdtfl="http://schemas.microsoft.com/office/word/2024/wordml/sdtformatlock" xmlns:w16se="http://schemas.microsoft.com/office/word/2015/wordml/symex" xmlns:wpg="http://schemas.microsoft.com/office/word/2010/wordprocessingGroup" xmlns:wpi="http://schemas.microsoft.com/office/word/2010/wordprocessingInk" xmlns:wne="http://schemas.microsoft.com/office/word/2006/wordml" xmlns:wps="http://schemas.microsoft.com/office/word/2010/wordprocessingShape" mc:Ignorable="w14 w15 w16se w16cid w16 w16cex w16sdtdh w16sdtfl w16du wp14">
   <w:p>
     <w:pPr>
       <w:pStyle w:val="BodyText"/>
@@ -7300,7 +5343,7 @@
 </file>
 
 <file path=word/numbering.xml><?xml version="1.0" encoding="utf-8"?>
-<w:numbering xmlns:wpc="http://schemas.microsoft.com/office/word/2010/wordprocessingCanvas" xmlns:cx="http://schemas.microsoft.com/office/drawing/2014/chartex" xmlns:cx1="http://schemas.microsoft.com/office/drawing/2015/9/8/chartex" xmlns:cx2="http://schemas.microsoft.com/office/drawing/2015/10/21/chartex" xmlns:cx3="http://schemas.microsoft.com/office/drawing/2016/5/9/chartex" xmlns:cx4="http://schemas.microsoft.com/office/drawing/2016/5/10/chartex" xmlns:cx5="http://schemas.microsoft.com/office/drawing/2016/5/11/chartex" xmlns:cx6="http://schemas.microsoft.com/office/drawing/2016/5/12/chartex" xmlns:cx7="http://schemas.microsoft.com/office/drawing/2016/5/13/chartex" xmlns:cx8="http://schemas.microsoft.com/office/drawing/2016/5/14/chartex" xmlns:mc="http://schemas.openxmlformats.org/markup-compatibility/2006" xmlns:aink="http://schemas.microsoft.com/office/drawing/2016/ink" xmlns:am3d="http://schemas.microsoft.com/office/drawing/2017/model3d" xmlns:o="urn:schemas-microsoft-com:office:office" xmlns:oel="http://schemas.microsoft.com/office/2019/extlst" xmlns:r="http://schemas.openxmlformats.org/officeDocument/2006/relationships" xmlns:m="http://schemas.openxmlformats.org/officeDocument/2006/math" xmlns:v="urn:schemas-microsoft-com:vml" xmlns:wp14="http://schemas.microsoft.com/office/word/2010/wordprocessingDrawing" xmlns:wp="http://schemas.openxmlformats.org/drawingml/2006/wordprocessingDrawing" xmlns:w10="urn:schemas-microsoft-com:office:word" xmlns:w="http://schemas.openxmlformats.org/wordprocessingml/2006/main" xmlns:w14="http://schemas.microsoft.com/office/word/2010/wordml" xmlns:w15="http://schemas.microsoft.com/office/word/2012/wordml" xmlns:w16cei="http://schemas.microsoft.com/office/word/2026/wordml/cei" xmlns:w16cex="http://schemas.microsoft.com/office/word/2018/wordml/cex" xmlns:w16cid="http://schemas.microsoft.com/office/word/2016/wordml/cid" xmlns:w16="http://schemas.microsoft.com/office/word/2018/wordml" xmlns:w16du="http://schemas.microsoft.com/office/word/2023/wordml/word16du" xmlns:w16sdtdh="http://schemas.microsoft.com/office/word/2020/wordml/sdtdatahash" xmlns:w16sdtfl="http://schemas.microsoft.com/office/word/2024/wordml/sdtformatlock" xmlns:w16se="http://schemas.microsoft.com/office/word/2015/wordml/symex" xmlns:wpg="http://schemas.microsoft.com/office/word/2010/wordprocessingGroup" xmlns:wpi="http://schemas.microsoft.com/office/word/2010/wordprocessingInk" xmlns:wne="http://schemas.microsoft.com/office/word/2006/wordml" xmlns:wps="http://schemas.microsoft.com/office/word/2010/wordprocessingShape" mc:Ignorable="w14 w15 w16se w16cid w16 w16cex w16sdtdh w16sdtfl w16du wp14">
+<w:numbering xmlns:wpc="http://schemas.microsoft.com/office/word/2010/wordprocessingCanvas" xmlns:cx="http://schemas.microsoft.com/office/drawing/2014/chartex" xmlns:cx1="http://schemas.microsoft.com/office/drawing/2015/9/8/chartex" xmlns:cx2="http://schemas.microsoft.com/office/drawing/2015/10/21/chartex" xmlns:cx3="http://schemas.microsoft.com/office/drawing/2016/5/9/chartex" xmlns:cx4="http://schemas.microsoft.com/office/drawing/2016/5/10/chartex" xmlns:cx5="http://schemas.microsoft.com/office/drawing/2016/5/11/chartex" xmlns:cx6="http://schemas.microsoft.com/office/drawing/2016/5/12/chartex" xmlns:cx7="http://schemas.microsoft.com/office/drawing/2016/5/13/chartex" xmlns:cx8="http://schemas.microsoft.com/office/drawing/2016/5/14/chartex" xmlns:mc="http://schemas.openxmlformats.org/markup-compatibility/2006" xmlns:aink="http://schemas.microsoft.com/office/drawing/2016/ink" xmlns:am3d="http://schemas.microsoft.com/office/drawing/2017/model3d" xmlns:o="urn:schemas-microsoft-com:office:office" xmlns:oel="http://schemas.microsoft.com/office/2019/extlst" xmlns:r="http://schemas.openxmlformats.org/officeDocument/2006/relationships" xmlns:m="http://schemas.openxmlformats.org/officeDocument/2006/math" xmlns:v="urn:schemas-microsoft-com:vml" xmlns:wp14="http://schemas.microsoft.com/office/word/2010/wordprocessingDrawing" xmlns:wp="http://schemas.openxmlformats.org/drawingml/2006/wordprocessingDrawing" xmlns:w10="urn:schemas-microsoft-com:office:word" xmlns:w="http://schemas.openxmlformats.org/wordprocessingml/2006/main" xmlns:w14="http://schemas.microsoft.com/office/word/2010/wordml" xmlns:w15="http://schemas.microsoft.com/office/word/2012/wordml" xmlns:w16cex="http://schemas.microsoft.com/office/word/2018/wordml/cex" xmlns:w16cid="http://schemas.microsoft.com/office/word/2016/wordml/cid" xmlns:w16="http://schemas.microsoft.com/office/word/2018/wordml" xmlns:w16du="http://schemas.microsoft.com/office/word/2023/wordml/word16du" xmlns:w16sdtdh="http://schemas.microsoft.com/office/word/2020/wordml/sdtdatahash" xmlns:w16sdtfl="http://schemas.microsoft.com/office/word/2024/wordml/sdtformatlock" xmlns:w16se="http://schemas.microsoft.com/office/word/2015/wordml/symex" xmlns:wpg="http://schemas.microsoft.com/office/word/2010/wordprocessingGroup" xmlns:wpi="http://schemas.microsoft.com/office/word/2010/wordprocessingInk" xmlns:wne="http://schemas.microsoft.com/office/word/2006/wordml" xmlns:wps="http://schemas.microsoft.com/office/word/2010/wordprocessingShape" mc:Ignorable="w14 w15 w16se w16cid w16 w16cex w16sdtdh w16sdtfl w16du wp14">
   <w:numPicBullet w:numPicBulletId="0">
     <w:pict>
       <v:shapetype id="_x0000_t75" coordsize="21600,21600" o:spt="75" o:preferrelative="t" path="m@4@5l@4@11@9@11@9@5xe" filled="f" stroked="f">
@@ -8272,6 +6315,7 @@
   <w:style w:type="character" w:default="1" w:styleId="DefaultParagraphFont">
     <w:name w:val="Default Paragraph Font"/>
     <w:uiPriority w:val="1"/>
+    <w:semiHidden/>
     <w:unhideWhenUsed/>
   </w:style>
   <w:style w:type="table" w:default="1" w:styleId="TableNormal">

</xml_diff>